<commit_message>
One dashboard: OVP guide, refreshed ZIP and source document; tools/ in git
- deploy/ZDPR_RAP_Single_Dashboard_OVP.docx: Overview Page design, card
  layout, generator steps, manifest data sources/cards, SelectionVariant
  parameter annotations, troubleshooting
- deploy/ZPR_DPR_RAP_abapgit.zip rebuilt (ZDPR_Q_PROD_PERF now OData V2)
- deploy/ZDPR_RAP_Complete_Source_Code.docx regenerated
- tools/: ZIP builder and docx generators kept in the repo so they survive
  container resets; HANDOVER.md updated for the single-dashboard direction

Co-Authored-By: Claude Fable 5.1 <noreply@anthropic.com>
Claude-Session: https://claude.ai/code/session_01Xu9y1woHSkPxJdZRFiKhnN
</commit_message>
<xml_diff>
--- a/deploy/ZDPR_RAP_Complete_Source_Code.docx
+++ b/deploy/ZDPR_RAP_Complete_Source_Code.docx
@@ -1354,7 +1354,7 @@
                 <w:sz w:val="18"/>
                 <w:szCs w:val="18"/>
               </w:rPr>
-              <w:t xml:space="preserve">CDS view entity</w:t>
+              <w:t xml:space="preserve">Classic CDS view, @OData.publish (also in the V4 service definition)</w:t>
             </w:r>
           </w:p>
         </w:tc>
@@ -1380,7 +1380,7 @@
                 <w:sz w:val="18"/>
                 <w:szCs w:val="18"/>
               </w:rPr>
-              <w:t xml:space="preserve">Excel tab-3 Production Performance: per-day actual and target, % achievement, criticality. Exposed through ZDPR_SD_ANALYTICS.</w:t>
+              <w:t xml:space="preserve">Excel tab-3 Production Performance: per-day actual and target, % achievement, criticality. OData V2 service ZDPR_Q_PROD_PERF_CDS for the Overview Page card.</w:t>
             </w:r>
           </w:p>
         </w:tc>
@@ -22912,7 +22912,7 @@
         <w:spacing w:after="160" w:before="320"/>
       </w:pPr>
       <w:r>
-        <w:t xml:space="preserve">6. Production Performance Query (OData V4)</w:t>
+        <w:t xml:space="preserve">6. Production Performance Query (OData V2 and V4)</w:t>
       </w:r>
     </w:p>
     <w:p>
@@ -22937,7 +22937,7 @@
           <w:sz w:val="21"/>
           <w:szCs w:val="21"/>
         </w:rPr>
-        <w:t xml:space="preserve">Type: CDS view entity</w:t>
+        <w:t xml:space="preserve">Type: Classic CDS view, @OData.publish (also in the V4 service definition)</w:t>
       </w:r>
     </w:p>
     <w:p>
@@ -22953,7 +22953,7 @@
           <w:sz w:val="21"/>
           <w:szCs w:val="21"/>
         </w:rPr>
-        <w:t xml:space="preserve">Excel tab-3 Production Performance: per-day actual and target, % achievement, criticality. Exposed through ZDPR_SD_ANALYTICS.</w:t>
+        <w:t xml:space="preserve">Excel tab-3 Production Performance: per-day actual and target, % achievement, criticality. OData V2 service ZDPR_Q_PROD_PERF_CDS for the Overview Page card.</w:t>
       </w:r>
     </w:p>
     <w:p>
@@ -22992,6 +22992,42 @@
           <w:sz w:val="15"/>
           <w:szCs w:val="15"/>
         </w:rPr>
+        <w:t xml:space="preserve">@AbapCatalog.sqlViewName: 'ZDPRQPRODPERF'</w:t>
+      </w:r>
+    </w:p>
+    <w:p>
+      <w:pPr>
+        <w:pBdr>
+          <w:left w:val="single" w:color="8EA9DB" w:sz="12" w:space="6"/>
+        </w:pBdr>
+        <w:shd w:fill="F7F7F7" w:val="clear"/>
+        <w:spacing w:after="0" w:line="240"/>
+        <w:ind w:left="120" w:right="120"/>
+      </w:pPr>
+      <w:r>
+        <w:rPr>
+          <w:rFonts w:ascii="Consolas" w:cs="Consolas" w:eastAsia="Consolas" w:hAnsi="Consolas"/>
+          <w:sz w:val="15"/>
+          <w:szCs w:val="15"/>
+        </w:rPr>
+        <w:t xml:space="preserve">@AbapCatalog.compiler.compareFilter: true</w:t>
+      </w:r>
+    </w:p>
+    <w:p>
+      <w:pPr>
+        <w:pBdr>
+          <w:left w:val="single" w:color="8EA9DB" w:sz="12" w:space="6"/>
+        </w:pBdr>
+        <w:shd w:fill="F7F7F7" w:val="clear"/>
+        <w:spacing w:after="0" w:line="240"/>
+        <w:ind w:left="120" w:right="120"/>
+      </w:pPr>
+      <w:r>
+        <w:rPr>
+          <w:rFonts w:ascii="Consolas" w:cs="Consolas" w:eastAsia="Consolas" w:hAnsi="Consolas"/>
+          <w:sz w:val="15"/>
+          <w:szCs w:val="15"/>
+        </w:rPr>
         <w:t xml:space="preserve">@AbapCatalog.viewEnhancementCategory: [#NONE]</w:t>
       </w:r>
     </w:p>
@@ -23280,7 +23316,7 @@
           <w:sz w:val="15"/>
           <w:szCs w:val="15"/>
         </w:rPr>
-        <w:t xml:space="preserve">@OData.entityType.name: 'DPRProdPerfQueryType'</w:t>
+        <w:t xml:space="preserve">@OData.publish: true</w:t>
       </w:r>
     </w:p>
     <w:p>
@@ -23316,7 +23352,7 @@
           <w:sz w:val="15"/>
           <w:szCs w:val="15"/>
         </w:rPr>
-        <w:t xml:space="preserve">define view entity ZDPR_Q_PROD_PERF</w:t>
+        <w:t xml:space="preserve">define view ZDPR_Q_PROD_PERF</w:t>
       </w:r>
     </w:p>
     <w:p>
@@ -23874,7 +23910,7 @@
           <w:sz w:val="15"/>
           <w:szCs w:val="15"/>
         </w:rPr>
-        <w:t xml:space="preserve">                 then SumActualQty / Divisor</w:t>
+        <w:t xml:space="preserve">                 then cast( division( SumActualQty, Divisor, 7 ) as abap.dec( 23, 7 ) )</w:t>
       </w:r>
     </w:p>
     <w:p>
@@ -23982,7 +24018,7 @@
           <w:sz w:val="15"/>
           <w:szCs w:val="15"/>
         </w:rPr>
-        <w:t xml:space="preserve">                 then SumActualBoepd / Divisor</w:t>
+        <w:t xml:space="preserve">                 then cast( division( SumActualBoepd, Divisor, 3 ) as abap.dec( 23, 3 ) )</w:t>
       </w:r>
     </w:p>
     <w:p>
@@ -24108,7 +24144,7 @@
           <w:sz w:val="15"/>
           <w:szCs w:val="15"/>
         </w:rPr>
-        <w:t xml:space="preserve">                 then SumTargetQty / Divisor</w:t>
+        <w:t xml:space="preserve">                 then cast( division( SumTargetQty, Divisor, 7 ) as abap.dec( 23, 7 ) )</w:t>
       </w:r>
     </w:p>
     <w:p>
@@ -24216,7 +24252,7 @@
           <w:sz w:val="15"/>
           <w:szCs w:val="15"/>
         </w:rPr>
-        <w:t xml:space="preserve">                 then SumTargetBoepd / Divisor</w:t>
+        <w:t xml:space="preserve">                 then cast( division( SumTargetBoepd, Divisor, 3 ) as abap.dec( 23, 3 ) )</w:t>
       </w:r>
     </w:p>
     <w:p>
@@ -24342,25 +24378,25 @@
           <w:sz w:val="15"/>
           <w:szCs w:val="15"/>
         </w:rPr>
-        <w:t xml:space="preserve">                 then SumActualBoepd * cast( 100 as abap.dec( 4, 0 ) )</w:t>
-      </w:r>
-    </w:p>
-    <w:p>
-      <w:pPr>
-        <w:pBdr>
-          <w:left w:val="single" w:color="8EA9DB" w:sz="12" w:space="6"/>
-        </w:pBdr>
-        <w:shd w:fill="F7F7F7" w:val="clear"/>
-        <w:spacing w:after="0" w:line="240"/>
-        <w:ind w:left="120" w:right="120"/>
-      </w:pPr>
-      <w:r>
-        <w:rPr>
-          <w:rFonts w:ascii="Consolas" w:cs="Consolas" w:eastAsia="Consolas" w:hAnsi="Consolas"/>
-          <w:sz w:val="15"/>
-          <w:szCs w:val="15"/>
-        </w:rPr>
-        <w:t xml:space="preserve">                      / SumTargetBoepd</w:t>
+        <w:t xml:space="preserve">                 then cast( division( SumActualBoepd * 100, SumTargetBoepd, 2 )</w:t>
+      </w:r>
+    </w:p>
+    <w:p>
+      <w:pPr>
+        <w:pBdr>
+          <w:left w:val="single" w:color="8EA9DB" w:sz="12" w:space="6"/>
+        </w:pBdr>
+        <w:shd w:fill="F7F7F7" w:val="clear"/>
+        <w:spacing w:after="0" w:line="240"/>
+        <w:ind w:left="120" w:right="120"/>
+      </w:pPr>
+      <w:r>
+        <w:rPr>
+          <w:rFonts w:ascii="Consolas" w:cs="Consolas" w:eastAsia="Consolas" w:hAnsi="Consolas"/>
+          <w:sz w:val="15"/>
+          <w:szCs w:val="15"/>
+        </w:rPr>
+        <w:t xml:space="preserve">                            as abap.dec( 10, 2 ) )</w:t>
       </w:r>
     </w:p>
     <w:p>

</xml_diff>

<commit_message>
Fiori OVP limits guide, realistic mockup, readable date axis and 3-column table card
- New document deploy/ZDPR_RAP_Fiori_OVP_Limits_and_Layout.docx: verified
  Overview Page rules (3x3 table cards, chart types/colours, KPI header,
  resizable layout), mockup-vs-reality table, manifest and annotation
  snippets (two performance cards YTD/Annual), alternatives
- Realistic mockup deploy/DPR_Dashboard_Fiori_Realistic.{html,png}
- ProductionDateText (YYYY-MM-DD) dimension in ZDPR_C_BOEPD_DAY,
  ZDPR_C_PROD_CUBE, ZDPR_Q_BOEPD_TREND, ZDPR_Q_DAILY_TREND
- RowLabel in ZDPR_Q_PROD_PERF; DDLX: chart category = date text, sort by
  date, performance line items ordered for the 3-column table card with
  criticality on the achievement data point
- ZIP, developer guide, source document, handover refreshed

Co-Authored-By: Claude Fable 5.1 <noreply@anthropic.com>
Claude-Session: https://claude.ai/code/session_01Xu9y1woHSkPxJdZRFiKhnN
</commit_message>
<xml_diff>
--- a/deploy/ZDPR_RAP_Complete_Source_Code.docx
+++ b/deploy/ZDPR_RAP_Complete_Source_Code.docx
@@ -16508,6 +16508,168 @@
           <w:sz w:val="15"/>
           <w:szCs w:val="15"/>
         </w:rPr>
+        <w:t xml:space="preserve">  /* Readable YYYY-MM-DD date for chart category axes */</w:t>
+      </w:r>
+    </w:p>
+    <w:p>
+      <w:pPr>
+        <w:pBdr>
+          <w:left w:val="single" w:color="8EA9DB" w:sz="12" w:space="6"/>
+        </w:pBdr>
+        <w:shd w:fill="F7F7F7" w:val="clear"/>
+        <w:spacing w:after="0" w:line="240"/>
+        <w:ind w:left="120" w:right="120"/>
+      </w:pPr>
+      <w:r>
+        <w:rPr>
+          <w:rFonts w:ascii="Consolas" w:cs="Consolas" w:eastAsia="Consolas" w:hAnsi="Consolas"/>
+          <w:sz w:val="15"/>
+          <w:szCs w:val="15"/>
+        </w:rPr>
+        <w:t xml:space="preserve">  @EndUserText.label: 'Date'</w:t>
+      </w:r>
+    </w:p>
+    <w:p>
+      <w:pPr>
+        <w:pBdr>
+          <w:left w:val="single" w:color="8EA9DB" w:sz="12" w:space="6"/>
+        </w:pBdr>
+        <w:shd w:fill="F7F7F7" w:val="clear"/>
+        <w:spacing w:after="0" w:line="240"/>
+        <w:ind w:left="120" w:right="120"/>
+      </w:pPr>
+      <w:r>
+        <w:rPr>
+          <w:rFonts w:ascii="Consolas" w:cs="Consolas" w:eastAsia="Consolas" w:hAnsi="Consolas"/>
+          <w:sz w:val="15"/>
+          <w:szCs w:val="15"/>
+        </w:rPr>
+        <w:t xml:space="preserve">  concat( substring( cast( Daily.ProductionDate as abap.char( 8 ) ), 1, 4 ),</w:t>
+      </w:r>
+    </w:p>
+    <w:p>
+      <w:pPr>
+        <w:pBdr>
+          <w:left w:val="single" w:color="8EA9DB" w:sz="12" w:space="6"/>
+        </w:pBdr>
+        <w:shd w:fill="F7F7F7" w:val="clear"/>
+        <w:spacing w:after="0" w:line="240"/>
+        <w:ind w:left="120" w:right="120"/>
+      </w:pPr>
+      <w:r>
+        <w:rPr>
+          <w:rFonts w:ascii="Consolas" w:cs="Consolas" w:eastAsia="Consolas" w:hAnsi="Consolas"/>
+          <w:sz w:val="15"/>
+          <w:szCs w:val="15"/>
+        </w:rPr>
+        <w:t xml:space="preserve">    concat( '-',</w:t>
+      </w:r>
+    </w:p>
+    <w:p>
+      <w:pPr>
+        <w:pBdr>
+          <w:left w:val="single" w:color="8EA9DB" w:sz="12" w:space="6"/>
+        </w:pBdr>
+        <w:shd w:fill="F7F7F7" w:val="clear"/>
+        <w:spacing w:after="0" w:line="240"/>
+        <w:ind w:left="120" w:right="120"/>
+      </w:pPr>
+      <w:r>
+        <w:rPr>
+          <w:rFonts w:ascii="Consolas" w:cs="Consolas" w:eastAsia="Consolas" w:hAnsi="Consolas"/>
+          <w:sz w:val="15"/>
+          <w:szCs w:val="15"/>
+        </w:rPr>
+        <w:t xml:space="preserve">      concat( substring( cast( Daily.ProductionDate as abap.char( 8 ) ), 5, 2 ),</w:t>
+      </w:r>
+    </w:p>
+    <w:p>
+      <w:pPr>
+        <w:pBdr>
+          <w:left w:val="single" w:color="8EA9DB" w:sz="12" w:space="6"/>
+        </w:pBdr>
+        <w:shd w:fill="F7F7F7" w:val="clear"/>
+        <w:spacing w:after="0" w:line="240"/>
+        <w:ind w:left="120" w:right="120"/>
+      </w:pPr>
+      <w:r>
+        <w:rPr>
+          <w:rFonts w:ascii="Consolas" w:cs="Consolas" w:eastAsia="Consolas" w:hAnsi="Consolas"/>
+          <w:sz w:val="15"/>
+          <w:szCs w:val="15"/>
+        </w:rPr>
+        <w:t xml:space="preserve">        concat( '-',</w:t>
+      </w:r>
+    </w:p>
+    <w:p>
+      <w:pPr>
+        <w:pBdr>
+          <w:left w:val="single" w:color="8EA9DB" w:sz="12" w:space="6"/>
+        </w:pBdr>
+        <w:shd w:fill="F7F7F7" w:val="clear"/>
+        <w:spacing w:after="0" w:line="240"/>
+        <w:ind w:left="120" w:right="120"/>
+      </w:pPr>
+      <w:r>
+        <w:rPr>
+          <w:rFonts w:ascii="Consolas" w:cs="Consolas" w:eastAsia="Consolas" w:hAnsi="Consolas"/>
+          <w:sz w:val="15"/>
+          <w:szCs w:val="15"/>
+        </w:rPr>
+        <w:t xml:space="preserve">          substring( cast( Daily.ProductionDate as abap.char( 8 ) ), 7, 2 ) ) ) ) )</w:t>
+      </w:r>
+    </w:p>
+    <w:p>
+      <w:pPr>
+        <w:pBdr>
+          <w:left w:val="single" w:color="8EA9DB" w:sz="12" w:space="6"/>
+        </w:pBdr>
+        <w:shd w:fill="F7F7F7" w:val="clear"/>
+        <w:spacing w:after="0" w:line="240"/>
+        <w:ind w:left="120" w:right="120"/>
+      </w:pPr>
+      <w:r>
+        <w:rPr>
+          <w:rFonts w:ascii="Consolas" w:cs="Consolas" w:eastAsia="Consolas" w:hAnsi="Consolas"/>
+          <w:sz w:val="15"/>
+          <w:szCs w:val="15"/>
+        </w:rPr>
+        <w:t xml:space="preserve">                                                  as ProductionDateText,</w:t>
+      </w:r>
+    </w:p>
+    <w:p>
+      <w:pPr>
+        <w:pBdr>
+          <w:left w:val="single" w:color="8EA9DB" w:sz="12" w:space="6"/>
+        </w:pBdr>
+        <w:shd w:fill="F7F7F7" w:val="clear"/>
+        <w:spacing w:after="0" w:line="240"/>
+        <w:ind w:left="120" w:right="120"/>
+      </w:pPr>
+      <w:r>
+        <w:rPr>
+          <w:rFonts w:ascii="Consolas" w:cs="Consolas" w:eastAsia="Consolas" w:hAnsi="Consolas"/>
+          <w:sz w:val="15"/>
+          <w:szCs w:val="15"/>
+        </w:rPr>
+        <w:t xml:space="preserve"> </w:t>
+      </w:r>
+    </w:p>
+    <w:p>
+      <w:pPr>
+        <w:pBdr>
+          <w:left w:val="single" w:color="8EA9DB" w:sz="12" w:space="6"/>
+        </w:pBdr>
+        <w:shd w:fill="F7F7F7" w:val="clear"/>
+        <w:spacing w:after="0" w:line="240"/>
+        <w:ind w:left="120" w:right="120"/>
+      </w:pPr>
+      <w:r>
+        <w:rPr>
+          <w:rFonts w:ascii="Consolas" w:cs="Consolas" w:eastAsia="Consolas" w:hAnsi="Consolas"/>
+          <w:sz w:val="15"/>
+          <w:szCs w:val="15"/>
+        </w:rPr>
         <w:t xml:space="preserve">  @EndUserText.label: 'Product'</w:t>
       </w:r>
     </w:p>
@@ -19766,6 +19928,204 @@
           <w:sz w:val="15"/>
           <w:szCs w:val="15"/>
         </w:rPr>
+        <w:t xml:space="preserve">  /* Readable date for chart category axes (Fiori renders a DATS as the raw</w:t>
+      </w:r>
+    </w:p>
+    <w:p>
+      <w:pPr>
+        <w:pBdr>
+          <w:left w:val="single" w:color="8EA9DB" w:sz="12" w:space="6"/>
+        </w:pBdr>
+        <w:shd w:fill="F7F7F7" w:val="clear"/>
+        <w:spacing w:after="0" w:line="240"/>
+        <w:ind w:left="120" w:right="120"/>
+      </w:pPr>
+      <w:r>
+        <w:rPr>
+          <w:rFonts w:ascii="Consolas" w:cs="Consolas" w:eastAsia="Consolas" w:hAnsi="Consolas"/>
+          <w:sz w:val="15"/>
+          <w:szCs w:val="15"/>
+        </w:rPr>
+        <w:t xml:space="preserve">     YYYYMMDD string). ISO layout keeps the alphabetical order = date order. */</w:t>
+      </w:r>
+    </w:p>
+    <w:p>
+      <w:pPr>
+        <w:pBdr>
+          <w:left w:val="single" w:color="8EA9DB" w:sz="12" w:space="6"/>
+        </w:pBdr>
+        <w:shd w:fill="F7F7F7" w:val="clear"/>
+        <w:spacing w:after="0" w:line="240"/>
+        <w:ind w:left="120" w:right="120"/>
+      </w:pPr>
+      <w:r>
+        <w:rPr>
+          <w:rFonts w:ascii="Consolas" w:cs="Consolas" w:eastAsia="Consolas" w:hAnsi="Consolas"/>
+          <w:sz w:val="15"/>
+          <w:szCs w:val="15"/>
+        </w:rPr>
+        <w:t xml:space="preserve">  @AnalyticsDetails.query.axis: #FREE</w:t>
+      </w:r>
+    </w:p>
+    <w:p>
+      <w:pPr>
+        <w:pBdr>
+          <w:left w:val="single" w:color="8EA9DB" w:sz="12" w:space="6"/>
+        </w:pBdr>
+        <w:shd w:fill="F7F7F7" w:val="clear"/>
+        <w:spacing w:after="0" w:line="240"/>
+        <w:ind w:left="120" w:right="120"/>
+      </w:pPr>
+      <w:r>
+        <w:rPr>
+          <w:rFonts w:ascii="Consolas" w:cs="Consolas" w:eastAsia="Consolas" w:hAnsi="Consolas"/>
+          <w:sz w:val="15"/>
+          <w:szCs w:val="15"/>
+        </w:rPr>
+        <w:t xml:space="preserve">  @EndUserText.label: 'Date'</w:t>
+      </w:r>
+    </w:p>
+    <w:p>
+      <w:pPr>
+        <w:pBdr>
+          <w:left w:val="single" w:color="8EA9DB" w:sz="12" w:space="6"/>
+        </w:pBdr>
+        <w:shd w:fill="F7F7F7" w:val="clear"/>
+        <w:spacing w:after="0" w:line="240"/>
+        <w:ind w:left="120" w:right="120"/>
+      </w:pPr>
+      <w:r>
+        <w:rPr>
+          <w:rFonts w:ascii="Consolas" w:cs="Consolas" w:eastAsia="Consolas" w:hAnsi="Consolas"/>
+          <w:sz w:val="15"/>
+          <w:szCs w:val="15"/>
+        </w:rPr>
+        <w:t xml:space="preserve">  concat( substring( cast( Row.ProductionDate as abap.char( 8 ) ), 1, 4 ),</w:t>
+      </w:r>
+    </w:p>
+    <w:p>
+      <w:pPr>
+        <w:pBdr>
+          <w:left w:val="single" w:color="8EA9DB" w:sz="12" w:space="6"/>
+        </w:pBdr>
+        <w:shd w:fill="F7F7F7" w:val="clear"/>
+        <w:spacing w:after="0" w:line="240"/>
+        <w:ind w:left="120" w:right="120"/>
+      </w:pPr>
+      <w:r>
+        <w:rPr>
+          <w:rFonts w:ascii="Consolas" w:cs="Consolas" w:eastAsia="Consolas" w:hAnsi="Consolas"/>
+          <w:sz w:val="15"/>
+          <w:szCs w:val="15"/>
+        </w:rPr>
+        <w:t xml:space="preserve">    concat( '-',</w:t>
+      </w:r>
+    </w:p>
+    <w:p>
+      <w:pPr>
+        <w:pBdr>
+          <w:left w:val="single" w:color="8EA9DB" w:sz="12" w:space="6"/>
+        </w:pBdr>
+        <w:shd w:fill="F7F7F7" w:val="clear"/>
+        <w:spacing w:after="0" w:line="240"/>
+        <w:ind w:left="120" w:right="120"/>
+      </w:pPr>
+      <w:r>
+        <w:rPr>
+          <w:rFonts w:ascii="Consolas" w:cs="Consolas" w:eastAsia="Consolas" w:hAnsi="Consolas"/>
+          <w:sz w:val="15"/>
+          <w:szCs w:val="15"/>
+        </w:rPr>
+        <w:t xml:space="preserve">      concat( substring( cast( Row.ProductionDate as abap.char( 8 ) ), 5, 2 ),</w:t>
+      </w:r>
+    </w:p>
+    <w:p>
+      <w:pPr>
+        <w:pBdr>
+          <w:left w:val="single" w:color="8EA9DB" w:sz="12" w:space="6"/>
+        </w:pBdr>
+        <w:shd w:fill="F7F7F7" w:val="clear"/>
+        <w:spacing w:after="0" w:line="240"/>
+        <w:ind w:left="120" w:right="120"/>
+      </w:pPr>
+      <w:r>
+        <w:rPr>
+          <w:rFonts w:ascii="Consolas" w:cs="Consolas" w:eastAsia="Consolas" w:hAnsi="Consolas"/>
+          <w:sz w:val="15"/>
+          <w:szCs w:val="15"/>
+        </w:rPr>
+        <w:t xml:space="preserve">        concat( '-',</w:t>
+      </w:r>
+    </w:p>
+    <w:p>
+      <w:pPr>
+        <w:pBdr>
+          <w:left w:val="single" w:color="8EA9DB" w:sz="12" w:space="6"/>
+        </w:pBdr>
+        <w:shd w:fill="F7F7F7" w:val="clear"/>
+        <w:spacing w:after="0" w:line="240"/>
+        <w:ind w:left="120" w:right="120"/>
+      </w:pPr>
+      <w:r>
+        <w:rPr>
+          <w:rFonts w:ascii="Consolas" w:cs="Consolas" w:eastAsia="Consolas" w:hAnsi="Consolas"/>
+          <w:sz w:val="15"/>
+          <w:szCs w:val="15"/>
+        </w:rPr>
+        <w:t xml:space="preserve">          substring( cast( Row.ProductionDate as abap.char( 8 ) ), 7, 2 ) ) ) ) )</w:t>
+      </w:r>
+    </w:p>
+    <w:p>
+      <w:pPr>
+        <w:pBdr>
+          <w:left w:val="single" w:color="8EA9DB" w:sz="12" w:space="6"/>
+        </w:pBdr>
+        <w:shd w:fill="F7F7F7" w:val="clear"/>
+        <w:spacing w:after="0" w:line="240"/>
+        <w:ind w:left="120" w:right="120"/>
+      </w:pPr>
+      <w:r>
+        <w:rPr>
+          <w:rFonts w:ascii="Consolas" w:cs="Consolas" w:eastAsia="Consolas" w:hAnsi="Consolas"/>
+          <w:sz w:val="15"/>
+          <w:szCs w:val="15"/>
+        </w:rPr>
+        <w:t xml:space="preserve">                                                      as ProductionDateText,</w:t>
+      </w:r>
+    </w:p>
+    <w:p>
+      <w:pPr>
+        <w:pBdr>
+          <w:left w:val="single" w:color="8EA9DB" w:sz="12" w:space="6"/>
+        </w:pBdr>
+        <w:shd w:fill="F7F7F7" w:val="clear"/>
+        <w:spacing w:after="0" w:line="240"/>
+        <w:ind w:left="120" w:right="120"/>
+      </w:pPr>
+      <w:r>
+        <w:rPr>
+          <w:rFonts w:ascii="Consolas" w:cs="Consolas" w:eastAsia="Consolas" w:hAnsi="Consolas"/>
+          <w:sz w:val="15"/>
+          <w:szCs w:val="15"/>
+        </w:rPr>
+        <w:t xml:space="preserve"> </w:t>
+      </w:r>
+    </w:p>
+    <w:p>
+      <w:pPr>
+        <w:pBdr>
+          <w:left w:val="single" w:color="8EA9DB" w:sz="12" w:space="6"/>
+        </w:pBdr>
+        <w:shd w:fill="F7F7F7" w:val="clear"/>
+        <w:spacing w:after="0" w:line="240"/>
+        <w:ind w:left="120" w:right="120"/>
+      </w:pPr>
+      <w:r>
+        <w:rPr>
+          <w:rFonts w:ascii="Consolas" w:cs="Consolas" w:eastAsia="Consolas" w:hAnsi="Consolas"/>
+          <w:sz w:val="15"/>
+          <w:szCs w:val="15"/>
+        </w:rPr>
         <w:t xml:space="preserve">  @AnalyticsDetails.query.axis: #FREE</w:t>
       </w:r>
     </w:p>
@@ -23015,6 +23375,114 @@
           <w:sz w:val="15"/>
           <w:szCs w:val="15"/>
         </w:rPr>
+        <w:t xml:space="preserve">  /* chart category axis: readable YYYY-MM-DD text of the date */</w:t>
+      </w:r>
+    </w:p>
+    <w:p>
+      <w:pPr>
+        <w:pBdr>
+          <w:left w:val="single" w:color="8EA9DB" w:sz="12" w:space="6"/>
+        </w:pBdr>
+        <w:shd w:fill="F7F7F7" w:val="clear"/>
+        <w:spacing w:after="0" w:line="240"/>
+        <w:ind w:left="120" w:right="120"/>
+      </w:pPr>
+      <w:r>
+        <w:rPr>
+          <w:rFonts w:ascii="Consolas" w:cs="Consolas" w:eastAsia="Consolas" w:hAnsi="Consolas"/>
+          <w:sz w:val="15"/>
+          <w:szCs w:val="15"/>
+        </w:rPr>
+        <w:t xml:space="preserve">  @AnalyticsDetails.query.axis: #ROWS</w:t>
+      </w:r>
+    </w:p>
+    <w:p>
+      <w:pPr>
+        <w:pBdr>
+          <w:left w:val="single" w:color="8EA9DB" w:sz="12" w:space="6"/>
+        </w:pBdr>
+        <w:shd w:fill="F7F7F7" w:val="clear"/>
+        <w:spacing w:after="0" w:line="240"/>
+        <w:ind w:left="120" w:right="120"/>
+      </w:pPr>
+      <w:r>
+        <w:rPr>
+          <w:rFonts w:ascii="Consolas" w:cs="Consolas" w:eastAsia="Consolas" w:hAnsi="Consolas"/>
+          <w:sz w:val="15"/>
+          <w:szCs w:val="15"/>
+        </w:rPr>
+        <w:t xml:space="preserve">  @AnalyticsDetails.query.totals: #HIDE</w:t>
+      </w:r>
+    </w:p>
+    <w:p>
+      <w:pPr>
+        <w:pBdr>
+          <w:left w:val="single" w:color="8EA9DB" w:sz="12" w:space="6"/>
+        </w:pBdr>
+        <w:shd w:fill="F7F7F7" w:val="clear"/>
+        <w:spacing w:after="0" w:line="240"/>
+        <w:ind w:left="120" w:right="120"/>
+      </w:pPr>
+      <w:r>
+        <w:rPr>
+          <w:rFonts w:ascii="Consolas" w:cs="Consolas" w:eastAsia="Consolas" w:hAnsi="Consolas"/>
+          <w:sz w:val="15"/>
+          <w:szCs w:val="15"/>
+        </w:rPr>
+        <w:t xml:space="preserve">  @EndUserText.label: 'Date'</w:t>
+      </w:r>
+    </w:p>
+    <w:p>
+      <w:pPr>
+        <w:pBdr>
+          <w:left w:val="single" w:color="8EA9DB" w:sz="12" w:space="6"/>
+        </w:pBdr>
+        <w:shd w:fill="F7F7F7" w:val="clear"/>
+        <w:spacing w:after="0" w:line="240"/>
+        <w:ind w:left="120" w:right="120"/>
+      </w:pPr>
+      <w:r>
+        <w:rPr>
+          <w:rFonts w:ascii="Consolas" w:cs="Consolas" w:eastAsia="Consolas" w:hAnsi="Consolas"/>
+          <w:sz w:val="15"/>
+          <w:szCs w:val="15"/>
+        </w:rPr>
+        <w:t xml:space="preserve">  ProductionDateText,</w:t>
+      </w:r>
+    </w:p>
+    <w:p>
+      <w:pPr>
+        <w:pBdr>
+          <w:left w:val="single" w:color="8EA9DB" w:sz="12" w:space="6"/>
+        </w:pBdr>
+        <w:shd w:fill="F7F7F7" w:val="clear"/>
+        <w:spacing w:after="0" w:line="240"/>
+        <w:ind w:left="120" w:right="120"/>
+      </w:pPr>
+      <w:r>
+        <w:rPr>
+          <w:rFonts w:ascii="Consolas" w:cs="Consolas" w:eastAsia="Consolas" w:hAnsi="Consolas"/>
+          <w:sz w:val="15"/>
+          <w:szCs w:val="15"/>
+        </w:rPr>
+        <w:t xml:space="preserve"> </w:t>
+      </w:r>
+    </w:p>
+    <w:p>
+      <w:pPr>
+        <w:pBdr>
+          <w:left w:val="single" w:color="8EA9DB" w:sz="12" w:space="6"/>
+        </w:pBdr>
+        <w:shd w:fill="F7F7F7" w:val="clear"/>
+        <w:spacing w:after="0" w:line="240"/>
+        <w:ind w:left="120" w:right="120"/>
+      </w:pPr>
+      <w:r>
+        <w:rPr>
+          <w:rFonts w:ascii="Consolas" w:cs="Consolas" w:eastAsia="Consolas" w:hAnsi="Consolas"/>
+          <w:sz w:val="15"/>
+          <w:szCs w:val="15"/>
+        </w:rPr>
         <w:t xml:space="preserve">  /* ── Free drill-down dimensions ─────────────────────────────────────── */</w:t>
       </w:r>
     </w:p>
@@ -24239,6 +24707,114 @@
           <w:sz w:val="15"/>
           <w:szCs w:val="15"/>
         </w:rPr>
+        <w:t xml:space="preserve">  /* chart category axis: readable YYYY-MM-DD text of the date */</w:t>
+      </w:r>
+    </w:p>
+    <w:p>
+      <w:pPr>
+        <w:pBdr>
+          <w:left w:val="single" w:color="8EA9DB" w:sz="12" w:space="6"/>
+        </w:pBdr>
+        <w:shd w:fill="F7F7F7" w:val="clear"/>
+        <w:spacing w:after="0" w:line="240"/>
+        <w:ind w:left="120" w:right="120"/>
+      </w:pPr>
+      <w:r>
+        <w:rPr>
+          <w:rFonts w:ascii="Consolas" w:cs="Consolas" w:eastAsia="Consolas" w:hAnsi="Consolas"/>
+          <w:sz w:val="15"/>
+          <w:szCs w:val="15"/>
+        </w:rPr>
+        <w:t xml:space="preserve">  @AnalyticsDetails.query.axis: #ROWS</w:t>
+      </w:r>
+    </w:p>
+    <w:p>
+      <w:pPr>
+        <w:pBdr>
+          <w:left w:val="single" w:color="8EA9DB" w:sz="12" w:space="6"/>
+        </w:pBdr>
+        <w:shd w:fill="F7F7F7" w:val="clear"/>
+        <w:spacing w:after="0" w:line="240"/>
+        <w:ind w:left="120" w:right="120"/>
+      </w:pPr>
+      <w:r>
+        <w:rPr>
+          <w:rFonts w:ascii="Consolas" w:cs="Consolas" w:eastAsia="Consolas" w:hAnsi="Consolas"/>
+          <w:sz w:val="15"/>
+          <w:szCs w:val="15"/>
+        </w:rPr>
+        <w:t xml:space="preserve">  @AnalyticsDetails.query.totals: #HIDE</w:t>
+      </w:r>
+    </w:p>
+    <w:p>
+      <w:pPr>
+        <w:pBdr>
+          <w:left w:val="single" w:color="8EA9DB" w:sz="12" w:space="6"/>
+        </w:pBdr>
+        <w:shd w:fill="F7F7F7" w:val="clear"/>
+        <w:spacing w:after="0" w:line="240"/>
+        <w:ind w:left="120" w:right="120"/>
+      </w:pPr>
+      <w:r>
+        <w:rPr>
+          <w:rFonts w:ascii="Consolas" w:cs="Consolas" w:eastAsia="Consolas" w:hAnsi="Consolas"/>
+          <w:sz w:val="15"/>
+          <w:szCs w:val="15"/>
+        </w:rPr>
+        <w:t xml:space="preserve">  @EndUserText.label: 'Date'</w:t>
+      </w:r>
+    </w:p>
+    <w:p>
+      <w:pPr>
+        <w:pBdr>
+          <w:left w:val="single" w:color="8EA9DB" w:sz="12" w:space="6"/>
+        </w:pBdr>
+        <w:shd w:fill="F7F7F7" w:val="clear"/>
+        <w:spacing w:after="0" w:line="240"/>
+        <w:ind w:left="120" w:right="120"/>
+      </w:pPr>
+      <w:r>
+        <w:rPr>
+          <w:rFonts w:ascii="Consolas" w:cs="Consolas" w:eastAsia="Consolas" w:hAnsi="Consolas"/>
+          <w:sz w:val="15"/>
+          <w:szCs w:val="15"/>
+        </w:rPr>
+        <w:t xml:space="preserve">  ProductionDateText,</w:t>
+      </w:r>
+    </w:p>
+    <w:p>
+      <w:pPr>
+        <w:pBdr>
+          <w:left w:val="single" w:color="8EA9DB" w:sz="12" w:space="6"/>
+        </w:pBdr>
+        <w:shd w:fill="F7F7F7" w:val="clear"/>
+        <w:spacing w:after="0" w:line="240"/>
+        <w:ind w:left="120" w:right="120"/>
+      </w:pPr>
+      <w:r>
+        <w:rPr>
+          <w:rFonts w:ascii="Consolas" w:cs="Consolas" w:eastAsia="Consolas" w:hAnsi="Consolas"/>
+          <w:sz w:val="15"/>
+          <w:szCs w:val="15"/>
+        </w:rPr>
+        <w:t xml:space="preserve"> </w:t>
+      </w:r>
+    </w:p>
+    <w:p>
+      <w:pPr>
+        <w:pBdr>
+          <w:left w:val="single" w:color="8EA9DB" w:sz="12" w:space="6"/>
+        </w:pBdr>
+        <w:shd w:fill="F7F7F7" w:val="clear"/>
+        <w:spacing w:after="0" w:line="240"/>
+        <w:ind w:left="120" w:right="120"/>
+      </w:pPr>
+      <w:r>
+        <w:rPr>
+          <w:rFonts w:ascii="Consolas" w:cs="Consolas" w:eastAsia="Consolas" w:hAnsi="Consolas"/>
+          <w:sz w:val="15"/>
+          <w:szCs w:val="15"/>
+        </w:rPr>
         <w:t xml:space="preserve">  @AnalyticsDetails.query.axis: #FREE</w:t>
       </w:r>
     </w:p>
@@ -29234,6 +29810,294 @@
           <w:sz w:val="15"/>
           <w:szCs w:val="15"/>
         </w:rPr>
+        <w:t xml:space="preserve">      /* One label per row: the Overview Page table card shows only three</w:t>
+      </w:r>
+    </w:p>
+    <w:p>
+      <w:pPr>
+        <w:pBdr>
+          <w:left w:val="single" w:color="8EA9DB" w:sz="12" w:space="6"/>
+        </w:pBdr>
+        <w:shd w:fill="F7F7F7" w:val="clear"/>
+        <w:spacing w:after="0" w:line="240"/>
+        <w:ind w:left="120" w:right="120"/>
+      </w:pPr>
+      <w:r>
+        <w:rPr>
+          <w:rFonts w:ascii="Consolas" w:cs="Consolas" w:eastAsia="Consolas" w:hAnsi="Consolas"/>
+          <w:sz w:val="15"/>
+          <w:szCs w:val="15"/>
+        </w:rPr>
+        <w:t xml:space="preserve">         columns, so scope and product group share the first one */</w:t>
+      </w:r>
+    </w:p>
+    <w:p>
+      <w:pPr>
+        <w:pBdr>
+          <w:left w:val="single" w:color="8EA9DB" w:sz="12" w:space="6"/>
+        </w:pBdr>
+        <w:shd w:fill="F7F7F7" w:val="clear"/>
+        <w:spacing w:after="0" w:line="240"/>
+        <w:ind w:left="120" w:right="120"/>
+      </w:pPr>
+      <w:r>
+        <w:rPr>
+          <w:rFonts w:ascii="Consolas" w:cs="Consolas" w:eastAsia="Consolas" w:hAnsi="Consolas"/>
+          <w:sz w:val="15"/>
+          <w:szCs w:val="15"/>
+        </w:rPr>
+        <w:t xml:space="preserve">      @EndUserText.label: 'Row'</w:t>
+      </w:r>
+    </w:p>
+    <w:p>
+      <w:pPr>
+        <w:pBdr>
+          <w:left w:val="single" w:color="8EA9DB" w:sz="12" w:space="6"/>
+        </w:pBdr>
+        <w:shd w:fill="F7F7F7" w:val="clear"/>
+        <w:spacing w:after="0" w:line="240"/>
+        <w:ind w:left="120" w:right="120"/>
+      </w:pPr>
+      <w:r>
+        <w:rPr>
+          <w:rFonts w:ascii="Consolas" w:cs="Consolas" w:eastAsia="Consolas" w:hAnsi="Consolas"/>
+          <w:sz w:val="15"/>
+          <w:szCs w:val="15"/>
+        </w:rPr>
+        <w:t xml:space="preserve">      case ScopeType</w:t>
+      </w:r>
+    </w:p>
+    <w:p>
+      <w:pPr>
+        <w:pBdr>
+          <w:left w:val="single" w:color="8EA9DB" w:sz="12" w:space="6"/>
+        </w:pBdr>
+        <w:shd w:fill="F7F7F7" w:val="clear"/>
+        <w:spacing w:after="0" w:line="240"/>
+        <w:ind w:left="120" w:right="120"/>
+      </w:pPr>
+      <w:r>
+        <w:rPr>
+          <w:rFonts w:ascii="Consolas" w:cs="Consolas" w:eastAsia="Consolas" w:hAnsi="Consolas"/>
+          <w:sz w:val="15"/>
+          <w:szCs w:val="15"/>
+        </w:rPr>
+        <w:t xml:space="preserve">        when 'YTD' then</w:t>
+      </w:r>
+    </w:p>
+    <w:p>
+      <w:pPr>
+        <w:pBdr>
+          <w:left w:val="single" w:color="8EA9DB" w:sz="12" w:space="6"/>
+        </w:pBdr>
+        <w:shd w:fill="F7F7F7" w:val="clear"/>
+        <w:spacing w:after="0" w:line="240"/>
+        <w:ind w:left="120" w:right="120"/>
+      </w:pPr>
+      <w:r>
+        <w:rPr>
+          <w:rFonts w:ascii="Consolas" w:cs="Consolas" w:eastAsia="Consolas" w:hAnsi="Consolas"/>
+          <w:sz w:val="15"/>
+          <w:szCs w:val="15"/>
+        </w:rPr>
+        <w:t xml:space="preserve">          case ProductGroup</w:t>
+      </w:r>
+    </w:p>
+    <w:p>
+      <w:pPr>
+        <w:pBdr>
+          <w:left w:val="single" w:color="8EA9DB" w:sz="12" w:space="6"/>
+        </w:pBdr>
+        <w:shd w:fill="F7F7F7" w:val="clear"/>
+        <w:spacing w:after="0" w:line="240"/>
+        <w:ind w:left="120" w:right="120"/>
+      </w:pPr>
+      <w:r>
+        <w:rPr>
+          <w:rFonts w:ascii="Consolas" w:cs="Consolas" w:eastAsia="Consolas" w:hAnsi="Consolas"/>
+          <w:sz w:val="15"/>
+          <w:szCs w:val="15"/>
+        </w:rPr>
+        <w:t xml:space="preserve">            when 'GAS' then 'YTD - Gas (MMSCMD)'</w:t>
+      </w:r>
+    </w:p>
+    <w:p>
+      <w:pPr>
+        <w:pBdr>
+          <w:left w:val="single" w:color="8EA9DB" w:sz="12" w:space="6"/>
+        </w:pBdr>
+        <w:shd w:fill="F7F7F7" w:val="clear"/>
+        <w:spacing w:after="0" w:line="240"/>
+        <w:ind w:left="120" w:right="120"/>
+      </w:pPr>
+      <w:r>
+        <w:rPr>
+          <w:rFonts w:ascii="Consolas" w:cs="Consolas" w:eastAsia="Consolas" w:hAnsi="Consolas"/>
+          <w:sz w:val="15"/>
+          <w:szCs w:val="15"/>
+        </w:rPr>
+        <w:t xml:space="preserve">            else            'YTD - Oil, LNG &amp; Cond. (BOPD)'</w:t>
+      </w:r>
+    </w:p>
+    <w:p>
+      <w:pPr>
+        <w:pBdr>
+          <w:left w:val="single" w:color="8EA9DB" w:sz="12" w:space="6"/>
+        </w:pBdr>
+        <w:shd w:fill="F7F7F7" w:val="clear"/>
+        <w:spacing w:after="0" w:line="240"/>
+        <w:ind w:left="120" w:right="120"/>
+      </w:pPr>
+      <w:r>
+        <w:rPr>
+          <w:rFonts w:ascii="Consolas" w:cs="Consolas" w:eastAsia="Consolas" w:hAnsi="Consolas"/>
+          <w:sz w:val="15"/>
+          <w:szCs w:val="15"/>
+        </w:rPr>
+        <w:t xml:space="preserve">          end</w:t>
+      </w:r>
+    </w:p>
+    <w:p>
+      <w:pPr>
+        <w:pBdr>
+          <w:left w:val="single" w:color="8EA9DB" w:sz="12" w:space="6"/>
+        </w:pBdr>
+        <w:shd w:fill="F7F7F7" w:val="clear"/>
+        <w:spacing w:after="0" w:line="240"/>
+        <w:ind w:left="120" w:right="120"/>
+      </w:pPr>
+      <w:r>
+        <w:rPr>
+          <w:rFonts w:ascii="Consolas" w:cs="Consolas" w:eastAsia="Consolas" w:hAnsi="Consolas"/>
+          <w:sz w:val="15"/>
+          <w:szCs w:val="15"/>
+        </w:rPr>
+        <w:t xml:space="preserve">        else</w:t>
+      </w:r>
+    </w:p>
+    <w:p>
+      <w:pPr>
+        <w:pBdr>
+          <w:left w:val="single" w:color="8EA9DB" w:sz="12" w:space="6"/>
+        </w:pBdr>
+        <w:shd w:fill="F7F7F7" w:val="clear"/>
+        <w:spacing w:after="0" w:line="240"/>
+        <w:ind w:left="120" w:right="120"/>
+      </w:pPr>
+      <w:r>
+        <w:rPr>
+          <w:rFonts w:ascii="Consolas" w:cs="Consolas" w:eastAsia="Consolas" w:hAnsi="Consolas"/>
+          <w:sz w:val="15"/>
+          <w:szCs w:val="15"/>
+        </w:rPr>
+        <w:t xml:space="preserve">          case ProductGroup</w:t>
+      </w:r>
+    </w:p>
+    <w:p>
+      <w:pPr>
+        <w:pBdr>
+          <w:left w:val="single" w:color="8EA9DB" w:sz="12" w:space="6"/>
+        </w:pBdr>
+        <w:shd w:fill="F7F7F7" w:val="clear"/>
+        <w:spacing w:after="0" w:line="240"/>
+        <w:ind w:left="120" w:right="120"/>
+      </w:pPr>
+      <w:r>
+        <w:rPr>
+          <w:rFonts w:ascii="Consolas" w:cs="Consolas" w:eastAsia="Consolas" w:hAnsi="Consolas"/>
+          <w:sz w:val="15"/>
+          <w:szCs w:val="15"/>
+        </w:rPr>
+        <w:t xml:space="preserve">            when 'GAS' then 'Annual - Gas (MMSCMD)'</w:t>
+      </w:r>
+    </w:p>
+    <w:p>
+      <w:pPr>
+        <w:pBdr>
+          <w:left w:val="single" w:color="8EA9DB" w:sz="12" w:space="6"/>
+        </w:pBdr>
+        <w:shd w:fill="F7F7F7" w:val="clear"/>
+        <w:spacing w:after="0" w:line="240"/>
+        <w:ind w:left="120" w:right="120"/>
+      </w:pPr>
+      <w:r>
+        <w:rPr>
+          <w:rFonts w:ascii="Consolas" w:cs="Consolas" w:eastAsia="Consolas" w:hAnsi="Consolas"/>
+          <w:sz w:val="15"/>
+          <w:szCs w:val="15"/>
+        </w:rPr>
+        <w:t xml:space="preserve">            else            'Annual - Oil, LNG &amp; Cond. (BOPD)'</w:t>
+      </w:r>
+    </w:p>
+    <w:p>
+      <w:pPr>
+        <w:pBdr>
+          <w:left w:val="single" w:color="8EA9DB" w:sz="12" w:space="6"/>
+        </w:pBdr>
+        <w:shd w:fill="F7F7F7" w:val="clear"/>
+        <w:spacing w:after="0" w:line="240"/>
+        <w:ind w:left="120" w:right="120"/>
+      </w:pPr>
+      <w:r>
+        <w:rPr>
+          <w:rFonts w:ascii="Consolas" w:cs="Consolas" w:eastAsia="Consolas" w:hAnsi="Consolas"/>
+          <w:sz w:val="15"/>
+          <w:szCs w:val="15"/>
+        </w:rPr>
+        <w:t xml:space="preserve">          end</w:t>
+      </w:r>
+    </w:p>
+    <w:p>
+      <w:pPr>
+        <w:pBdr>
+          <w:left w:val="single" w:color="8EA9DB" w:sz="12" w:space="6"/>
+        </w:pBdr>
+        <w:shd w:fill="F7F7F7" w:val="clear"/>
+        <w:spacing w:after="0" w:line="240"/>
+        <w:ind w:left="120" w:right="120"/>
+      </w:pPr>
+      <w:r>
+        <w:rPr>
+          <w:rFonts w:ascii="Consolas" w:cs="Consolas" w:eastAsia="Consolas" w:hAnsi="Consolas"/>
+          <w:sz w:val="15"/>
+          <w:szCs w:val="15"/>
+        </w:rPr>
+        <w:t xml:space="preserve">      end                                             as RowLabel,</w:t>
+      </w:r>
+    </w:p>
+    <w:p>
+      <w:pPr>
+        <w:pBdr>
+          <w:left w:val="single" w:color="8EA9DB" w:sz="12" w:space="6"/>
+        </w:pBdr>
+        <w:shd w:fill="F7F7F7" w:val="clear"/>
+        <w:spacing w:after="0" w:line="240"/>
+        <w:ind w:left="120" w:right="120"/>
+      </w:pPr>
+      <w:r>
+        <w:rPr>
+          <w:rFonts w:ascii="Consolas" w:cs="Consolas" w:eastAsia="Consolas" w:hAnsi="Consolas"/>
+          <w:sz w:val="15"/>
+          <w:szCs w:val="15"/>
+        </w:rPr>
+        <w:t xml:space="preserve"> </w:t>
+      </w:r>
+    </w:p>
+    <w:p>
+      <w:pPr>
+        <w:pBdr>
+          <w:left w:val="single" w:color="8EA9DB" w:sz="12" w:space="6"/>
+        </w:pBdr>
+        <w:shd w:fill="F7F7F7" w:val="clear"/>
+        <w:spacing w:after="0" w:line="240"/>
+        <w:ind w:left="120" w:right="120"/>
+      </w:pPr>
+      <w:r>
+        <w:rPr>
+          <w:rFonts w:ascii="Consolas" w:cs="Consolas" w:eastAsia="Consolas" w:hAnsi="Consolas"/>
+          <w:sz w:val="15"/>
+          <w:szCs w:val="15"/>
+        </w:rPr>
         <w:t xml:space="preserve">      /* ── Actual (per-day average over the window; 0 on ANNUAL rows) ──── */</w:t>
       </w:r>
     </w:p>
@@ -51140,7 +52004,7 @@
           <w:sz w:val="15"/>
           <w:szCs w:val="15"/>
         </w:rPr>
-        <w:t xml:space="preserve">  dimensions: ['ProductionDate'],</w:t>
+        <w:t xml:space="preserve">  dimensions: ['ProductionDateText'],</w:t>
       </w:r>
     </w:p>
     <w:p>
@@ -51230,6 +52094,24 @@
           <w:sz w:val="15"/>
           <w:szCs w:val="15"/>
         </w:rPr>
+        <w:t xml:space="preserve">  sortOrder: [{ by: 'ProductionDate', direction: #ASC }],</w:t>
+      </w:r>
+    </w:p>
+    <w:p>
+      <w:pPr>
+        <w:pBdr>
+          <w:left w:val="single" w:color="8EA9DB" w:sz="12" w:space="6"/>
+        </w:pBdr>
+        <w:shd w:fill="F7F7F7" w:val="clear"/>
+        <w:spacing w:after="0" w:line="240"/>
+        <w:ind w:left="120" w:right="120"/>
+      </w:pPr>
+      <w:r>
+        <w:rPr>
+          <w:rFonts w:ascii="Consolas" w:cs="Consolas" w:eastAsia="Consolas" w:hAnsi="Consolas"/>
+          <w:sz w:val="15"/>
+          <w:szCs w:val="15"/>
+        </w:rPr>
         <w:t xml:space="preserve">  visualizations: [</w:t>
       </w:r>
     </w:p>
@@ -51411,6 +52293,60 @@
           <w:szCs w:val="15"/>
         </w:rPr>
         <w:t xml:space="preserve">  ProductionDate;</w:t>
+      </w:r>
+    </w:p>
+    <w:p>
+      <w:pPr>
+        <w:pBdr>
+          <w:left w:val="single" w:color="8EA9DB" w:sz="12" w:space="6"/>
+        </w:pBdr>
+        <w:shd w:fill="F7F7F7" w:val="clear"/>
+        <w:spacing w:after="0" w:line="240"/>
+        <w:ind w:left="120" w:right="120"/>
+      </w:pPr>
+      <w:r>
+        <w:rPr>
+          <w:rFonts w:ascii="Consolas" w:cs="Consolas" w:eastAsia="Consolas" w:hAnsi="Consolas"/>
+          <w:sz w:val="15"/>
+          <w:szCs w:val="15"/>
+        </w:rPr>
+        <w:t xml:space="preserve"> </w:t>
+      </w:r>
+    </w:p>
+    <w:p>
+      <w:pPr>
+        <w:pBdr>
+          <w:left w:val="single" w:color="8EA9DB" w:sz="12" w:space="6"/>
+        </w:pBdr>
+        <w:shd w:fill="F7F7F7" w:val="clear"/>
+        <w:spacing w:after="0" w:line="240"/>
+        <w:ind w:left="120" w:right="120"/>
+      </w:pPr>
+      <w:r>
+        <w:rPr>
+          <w:rFonts w:ascii="Consolas" w:cs="Consolas" w:eastAsia="Consolas" w:hAnsi="Consolas"/>
+          <w:sz w:val="15"/>
+          <w:szCs w:val="15"/>
+        </w:rPr>
+        <w:t xml:space="preserve">  @UI.lineItem: [{ position: 15, importance: #HIGH, label: 'Date' }]</w:t>
+      </w:r>
+    </w:p>
+    <w:p>
+      <w:pPr>
+        <w:pBdr>
+          <w:left w:val="single" w:color="8EA9DB" w:sz="12" w:space="6"/>
+        </w:pBdr>
+        <w:shd w:fill="F7F7F7" w:val="clear"/>
+        <w:spacing w:after="0" w:line="240"/>
+        <w:ind w:left="120" w:right="120"/>
+      </w:pPr>
+      <w:r>
+        <w:rPr>
+          <w:rFonts w:ascii="Consolas" w:cs="Consolas" w:eastAsia="Consolas" w:hAnsi="Consolas"/>
+          <w:sz w:val="15"/>
+          <w:szCs w:val="15"/>
+        </w:rPr>
+        <w:t xml:space="preserve">  ProductionDateText;</w:t>
       </w:r>
     </w:p>
     <w:p>
@@ -52058,7 +52994,7 @@
           <w:sz w:val="15"/>
           <w:szCs w:val="15"/>
         </w:rPr>
-        <w:t xml:space="preserve">  dimensions: ['ProductionDate', 'ProductDescription'],</w:t>
+        <w:t xml:space="preserve">  dimensions: ['ProductionDateText', 'ProductDescription'],</w:t>
       </w:r>
     </w:p>
     <w:p>
@@ -52148,6 +53084,24 @@
           <w:sz w:val="15"/>
           <w:szCs w:val="15"/>
         </w:rPr>
+        <w:t xml:space="preserve">  sortOrder: [{ by: 'ProductionDate', direction: #ASC }],</w:t>
+      </w:r>
+    </w:p>
+    <w:p>
+      <w:pPr>
+        <w:pBdr>
+          <w:left w:val="single" w:color="8EA9DB" w:sz="12" w:space="6"/>
+        </w:pBdr>
+        <w:shd w:fill="F7F7F7" w:val="clear"/>
+        <w:spacing w:after="0" w:line="240"/>
+        <w:ind w:left="120" w:right="120"/>
+      </w:pPr>
+      <w:r>
+        <w:rPr>
+          <w:rFonts w:ascii="Consolas" w:cs="Consolas" w:eastAsia="Consolas" w:hAnsi="Consolas"/>
+          <w:sz w:val="15"/>
+          <w:szCs w:val="15"/>
+        </w:rPr>
         <w:t xml:space="preserve">  visualizations: [</w:t>
       </w:r>
     </w:p>
@@ -52329,6 +53283,60 @@
           <w:szCs w:val="15"/>
         </w:rPr>
         <w:t xml:space="preserve">  ProductionDate;</w:t>
+      </w:r>
+    </w:p>
+    <w:p>
+      <w:pPr>
+        <w:pBdr>
+          <w:left w:val="single" w:color="8EA9DB" w:sz="12" w:space="6"/>
+        </w:pBdr>
+        <w:shd w:fill="F7F7F7" w:val="clear"/>
+        <w:spacing w:after="0" w:line="240"/>
+        <w:ind w:left="120" w:right="120"/>
+      </w:pPr>
+      <w:r>
+        <w:rPr>
+          <w:rFonts w:ascii="Consolas" w:cs="Consolas" w:eastAsia="Consolas" w:hAnsi="Consolas"/>
+          <w:sz w:val="15"/>
+          <w:szCs w:val="15"/>
+        </w:rPr>
+        <w:t xml:space="preserve"> </w:t>
+      </w:r>
+    </w:p>
+    <w:p>
+      <w:pPr>
+        <w:pBdr>
+          <w:left w:val="single" w:color="8EA9DB" w:sz="12" w:space="6"/>
+        </w:pBdr>
+        <w:shd w:fill="F7F7F7" w:val="clear"/>
+        <w:spacing w:after="0" w:line="240"/>
+        <w:ind w:left="120" w:right="120"/>
+      </w:pPr>
+      <w:r>
+        <w:rPr>
+          <w:rFonts w:ascii="Consolas" w:cs="Consolas" w:eastAsia="Consolas" w:hAnsi="Consolas"/>
+          <w:sz w:val="15"/>
+          <w:szCs w:val="15"/>
+        </w:rPr>
+        <w:t xml:space="preserve">  @UI.lineItem: [{ position: 15, importance: #HIGH, label: 'Date' }]</w:t>
+      </w:r>
+    </w:p>
+    <w:p>
+      <w:pPr>
+        <w:pBdr>
+          <w:left w:val="single" w:color="8EA9DB" w:sz="12" w:space="6"/>
+        </w:pBdr>
+        <w:shd w:fill="F7F7F7" w:val="clear"/>
+        <w:spacing w:after="0" w:line="240"/>
+        <w:ind w:left="120" w:right="120"/>
+      </w:pPr>
+      <w:r>
+        <w:rPr>
+          <w:rFonts w:ascii="Consolas" w:cs="Consolas" w:eastAsia="Consolas" w:hAnsi="Consolas"/>
+          <w:sz w:val="15"/>
+          <w:szCs w:val="15"/>
+        </w:rPr>
+        <w:t xml:space="preserve">  ProductionDateText;</w:t>
       </w:r>
     </w:p>
     <w:p>
@@ -56288,7 +57296,421 @@
           <w:sz w:val="15"/>
           <w:szCs w:val="15"/>
         </w:rPr>
-        <w:t xml:space="preserve">  @UI.lineItem: [{ position: 10, importance: #HIGH, label: 'Scope' }]</w:t>
+        <w:t xml:space="preserve">  /* The Overview Page table card renders only the first THREE line items:</w:t>
+      </w:r>
+    </w:p>
+    <w:p>
+      <w:pPr>
+        <w:pBdr>
+          <w:left w:val="single" w:color="8EA9DB" w:sz="12" w:space="6"/>
+        </w:pBdr>
+        <w:shd w:fill="F7F7F7" w:val="clear"/>
+        <w:spacing w:after="0" w:line="240"/>
+        <w:ind w:left="120" w:right="120"/>
+      </w:pPr>
+      <w:r>
+        <w:rPr>
+          <w:rFonts w:ascii="Consolas" w:cs="Consolas" w:eastAsia="Consolas" w:hAnsi="Consolas"/>
+          <w:sz w:val="15"/>
+          <w:szCs w:val="15"/>
+        </w:rPr>
+        <w:t xml:space="preserve">     row label | actual | % achievement (coloured by criticality).</w:t>
+      </w:r>
+    </w:p>
+    <w:p>
+      <w:pPr>
+        <w:pBdr>
+          <w:left w:val="single" w:color="8EA9DB" w:sz="12" w:space="6"/>
+        </w:pBdr>
+        <w:shd w:fill="F7F7F7" w:val="clear"/>
+        <w:spacing w:after="0" w:line="240"/>
+        <w:ind w:left="120" w:right="120"/>
+      </w:pPr>
+      <w:r>
+        <w:rPr>
+          <w:rFonts w:ascii="Consolas" w:cs="Consolas" w:eastAsia="Consolas" w:hAnsi="Consolas"/>
+          <w:sz w:val="15"/>
+          <w:szCs w:val="15"/>
+        </w:rPr>
+        <w:t xml:space="preserve">     The remaining columns appear when the card is widened (resizable</w:t>
+      </w:r>
+    </w:p>
+    <w:p>
+      <w:pPr>
+        <w:pBdr>
+          <w:left w:val="single" w:color="8EA9DB" w:sz="12" w:space="6"/>
+        </w:pBdr>
+        <w:shd w:fill="F7F7F7" w:val="clear"/>
+        <w:spacing w:after="0" w:line="240"/>
+        <w:ind w:left="120" w:right="120"/>
+      </w:pPr>
+      <w:r>
+        <w:rPr>
+          <w:rFonts w:ascii="Consolas" w:cs="Consolas" w:eastAsia="Consolas" w:hAnsi="Consolas"/>
+          <w:sz w:val="15"/>
+          <w:szCs w:val="15"/>
+        </w:rPr>
+        <w:t xml:space="preserve">     layout) and in the Analytical List Page. */</w:t>
+      </w:r>
+    </w:p>
+    <w:p>
+      <w:pPr>
+        <w:pBdr>
+          <w:left w:val="single" w:color="8EA9DB" w:sz="12" w:space="6"/>
+        </w:pBdr>
+        <w:shd w:fill="F7F7F7" w:val="clear"/>
+        <w:spacing w:after="0" w:line="240"/>
+        <w:ind w:left="120" w:right="120"/>
+      </w:pPr>
+      <w:r>
+        <w:rPr>
+          <w:rFonts w:ascii="Consolas" w:cs="Consolas" w:eastAsia="Consolas" w:hAnsi="Consolas"/>
+          <w:sz w:val="15"/>
+          <w:szCs w:val="15"/>
+        </w:rPr>
+        <w:t xml:space="preserve">  @UI.lineItem: [{ position: 10, importance: #HIGH, label: 'Row' }]</w:t>
+      </w:r>
+    </w:p>
+    <w:p>
+      <w:pPr>
+        <w:pBdr>
+          <w:left w:val="single" w:color="8EA9DB" w:sz="12" w:space="6"/>
+        </w:pBdr>
+        <w:shd w:fill="F7F7F7" w:val="clear"/>
+        <w:spacing w:after="0" w:line="240"/>
+        <w:ind w:left="120" w:right="120"/>
+      </w:pPr>
+      <w:r>
+        <w:rPr>
+          <w:rFonts w:ascii="Consolas" w:cs="Consolas" w:eastAsia="Consolas" w:hAnsi="Consolas"/>
+          <w:sz w:val="15"/>
+          <w:szCs w:val="15"/>
+        </w:rPr>
+        <w:t xml:space="preserve">  RowLabel;</w:t>
+      </w:r>
+    </w:p>
+    <w:p>
+      <w:pPr>
+        <w:pBdr>
+          <w:left w:val="single" w:color="8EA9DB" w:sz="12" w:space="6"/>
+        </w:pBdr>
+        <w:shd w:fill="F7F7F7" w:val="clear"/>
+        <w:spacing w:after="0" w:line="240"/>
+        <w:ind w:left="120" w:right="120"/>
+      </w:pPr>
+      <w:r>
+        <w:rPr>
+          <w:rFonts w:ascii="Consolas" w:cs="Consolas" w:eastAsia="Consolas" w:hAnsi="Consolas"/>
+          <w:sz w:val="15"/>
+          <w:szCs w:val="15"/>
+        </w:rPr>
+        <w:t xml:space="preserve"> </w:t>
+      </w:r>
+    </w:p>
+    <w:p>
+      <w:pPr>
+        <w:pBdr>
+          <w:left w:val="single" w:color="8EA9DB" w:sz="12" w:space="6"/>
+        </w:pBdr>
+        <w:shd w:fill="F7F7F7" w:val="clear"/>
+        <w:spacing w:after="0" w:line="240"/>
+        <w:ind w:left="120" w:right="120"/>
+      </w:pPr>
+      <w:r>
+        <w:rPr>
+          <w:rFonts w:ascii="Consolas" w:cs="Consolas" w:eastAsia="Consolas" w:hAnsi="Consolas"/>
+          <w:sz w:val="15"/>
+          <w:szCs w:val="15"/>
+        </w:rPr>
+        <w:t xml:space="preserve">  @UI.lineItem: [{ position: 20, importance: #HIGH, label: 'Actual (BOPD / MMSCMD)' }]</w:t>
+      </w:r>
+    </w:p>
+    <w:p>
+      <w:pPr>
+        <w:pBdr>
+          <w:left w:val="single" w:color="8EA9DB" w:sz="12" w:space="6"/>
+        </w:pBdr>
+        <w:shd w:fill="F7F7F7" w:val="clear"/>
+        <w:spacing w:after="0" w:line="240"/>
+        <w:ind w:left="120" w:right="120"/>
+      </w:pPr>
+      <w:r>
+        <w:rPr>
+          <w:rFonts w:ascii="Consolas" w:cs="Consolas" w:eastAsia="Consolas" w:hAnsi="Consolas"/>
+          <w:sz w:val="15"/>
+          <w:szCs w:val="15"/>
+        </w:rPr>
+        <w:t xml:space="preserve">  ActualPerDay;</w:t>
+      </w:r>
+    </w:p>
+    <w:p>
+      <w:pPr>
+        <w:pBdr>
+          <w:left w:val="single" w:color="8EA9DB" w:sz="12" w:space="6"/>
+        </w:pBdr>
+        <w:shd w:fill="F7F7F7" w:val="clear"/>
+        <w:spacing w:after="0" w:line="240"/>
+        <w:ind w:left="120" w:right="120"/>
+      </w:pPr>
+      <w:r>
+        <w:rPr>
+          <w:rFonts w:ascii="Consolas" w:cs="Consolas" w:eastAsia="Consolas" w:hAnsi="Consolas"/>
+          <w:sz w:val="15"/>
+          <w:szCs w:val="15"/>
+        </w:rPr>
+        <w:t xml:space="preserve"> </w:t>
+      </w:r>
+    </w:p>
+    <w:p>
+      <w:pPr>
+        <w:pBdr>
+          <w:left w:val="single" w:color="8EA9DB" w:sz="12" w:space="6"/>
+        </w:pBdr>
+        <w:shd w:fill="F7F7F7" w:val="clear"/>
+        <w:spacing w:after="0" w:line="240"/>
+        <w:ind w:left="120" w:right="120"/>
+      </w:pPr>
+      <w:r>
+        <w:rPr>
+          <w:rFonts w:ascii="Consolas" w:cs="Consolas" w:eastAsia="Consolas" w:hAnsi="Consolas"/>
+          <w:sz w:val="15"/>
+          <w:szCs w:val="15"/>
+        </w:rPr>
+        <w:t xml:space="preserve">  @UI.lineItem: [{ position: 30, importance: #HIGH, label: '% Achv w.r.t. BE Target' }]</w:t>
+      </w:r>
+    </w:p>
+    <w:p>
+      <w:pPr>
+        <w:pBdr>
+          <w:left w:val="single" w:color="8EA9DB" w:sz="12" w:space="6"/>
+        </w:pBdr>
+        <w:shd w:fill="F7F7F7" w:val="clear"/>
+        <w:spacing w:after="0" w:line="240"/>
+        <w:ind w:left="120" w:right="120"/>
+      </w:pPr>
+      <w:r>
+        <w:rPr>
+          <w:rFonts w:ascii="Consolas" w:cs="Consolas" w:eastAsia="Consolas" w:hAnsi="Consolas"/>
+          <w:sz w:val="15"/>
+          <w:szCs w:val="15"/>
+        </w:rPr>
+        <w:t xml:space="preserve">  @UI.dataPoint: { title: '% Achv w.r.t. BE Target', criticality: 'AchievementCriticality' }</w:t>
+      </w:r>
+    </w:p>
+    <w:p>
+      <w:pPr>
+        <w:pBdr>
+          <w:left w:val="single" w:color="8EA9DB" w:sz="12" w:space="6"/>
+        </w:pBdr>
+        <w:shd w:fill="F7F7F7" w:val="clear"/>
+        <w:spacing w:after="0" w:line="240"/>
+        <w:ind w:left="120" w:right="120"/>
+      </w:pPr>
+      <w:r>
+        <w:rPr>
+          <w:rFonts w:ascii="Consolas" w:cs="Consolas" w:eastAsia="Consolas" w:hAnsi="Consolas"/>
+          <w:sz w:val="15"/>
+          <w:szCs w:val="15"/>
+        </w:rPr>
+        <w:t xml:space="preserve">  AchievementPct;</w:t>
+      </w:r>
+    </w:p>
+    <w:p>
+      <w:pPr>
+        <w:pBdr>
+          <w:left w:val="single" w:color="8EA9DB" w:sz="12" w:space="6"/>
+        </w:pBdr>
+        <w:shd w:fill="F7F7F7" w:val="clear"/>
+        <w:spacing w:after="0" w:line="240"/>
+        <w:ind w:left="120" w:right="120"/>
+      </w:pPr>
+      <w:r>
+        <w:rPr>
+          <w:rFonts w:ascii="Consolas" w:cs="Consolas" w:eastAsia="Consolas" w:hAnsi="Consolas"/>
+          <w:sz w:val="15"/>
+          <w:szCs w:val="15"/>
+        </w:rPr>
+        <w:t xml:space="preserve"> </w:t>
+      </w:r>
+    </w:p>
+    <w:p>
+      <w:pPr>
+        <w:pBdr>
+          <w:left w:val="single" w:color="8EA9DB" w:sz="12" w:space="6"/>
+        </w:pBdr>
+        <w:shd w:fill="F7F7F7" w:val="clear"/>
+        <w:spacing w:after="0" w:line="240"/>
+        <w:ind w:left="120" w:right="120"/>
+      </w:pPr>
+      <w:r>
+        <w:rPr>
+          <w:rFonts w:ascii="Consolas" w:cs="Consolas" w:eastAsia="Consolas" w:hAnsi="Consolas"/>
+          <w:sz w:val="15"/>
+          <w:szCs w:val="15"/>
+        </w:rPr>
+        <w:t xml:space="preserve">  @UI.lineItem: [{ position: 40, importance: #HIGH, label: 'BE Target (BOPD / MMSCMD)' }]</w:t>
+      </w:r>
+    </w:p>
+    <w:p>
+      <w:pPr>
+        <w:pBdr>
+          <w:left w:val="single" w:color="8EA9DB" w:sz="12" w:space="6"/>
+        </w:pBdr>
+        <w:shd w:fill="F7F7F7" w:val="clear"/>
+        <w:spacing w:after="0" w:line="240"/>
+        <w:ind w:left="120" w:right="120"/>
+      </w:pPr>
+      <w:r>
+        <w:rPr>
+          <w:rFonts w:ascii="Consolas" w:cs="Consolas" w:eastAsia="Consolas" w:hAnsi="Consolas"/>
+          <w:sz w:val="15"/>
+          <w:szCs w:val="15"/>
+        </w:rPr>
+        <w:t xml:space="preserve">  TargetPerDay;</w:t>
+      </w:r>
+    </w:p>
+    <w:p>
+      <w:pPr>
+        <w:pBdr>
+          <w:left w:val="single" w:color="8EA9DB" w:sz="12" w:space="6"/>
+        </w:pBdr>
+        <w:shd w:fill="F7F7F7" w:val="clear"/>
+        <w:spacing w:after="0" w:line="240"/>
+        <w:ind w:left="120" w:right="120"/>
+      </w:pPr>
+      <w:r>
+        <w:rPr>
+          <w:rFonts w:ascii="Consolas" w:cs="Consolas" w:eastAsia="Consolas" w:hAnsi="Consolas"/>
+          <w:sz w:val="15"/>
+          <w:szCs w:val="15"/>
+        </w:rPr>
+        <w:t xml:space="preserve"> </w:t>
+      </w:r>
+    </w:p>
+    <w:p>
+      <w:pPr>
+        <w:pBdr>
+          <w:left w:val="single" w:color="8EA9DB" w:sz="12" w:space="6"/>
+        </w:pBdr>
+        <w:shd w:fill="F7F7F7" w:val="clear"/>
+        <w:spacing w:after="0" w:line="240"/>
+        <w:ind w:left="120" w:right="120"/>
+      </w:pPr>
+      <w:r>
+        <w:rPr>
+          <w:rFonts w:ascii="Consolas" w:cs="Consolas" w:eastAsia="Consolas" w:hAnsi="Consolas"/>
+          <w:sz w:val="15"/>
+          <w:szCs w:val="15"/>
+        </w:rPr>
+        <w:t xml:space="preserve">  @UI.lineItem: [{ position: 50, importance: #MEDIUM, label: 'Actual Total (BOEPD)' }]</w:t>
+      </w:r>
+    </w:p>
+    <w:p>
+      <w:pPr>
+        <w:pBdr>
+          <w:left w:val="single" w:color="8EA9DB" w:sz="12" w:space="6"/>
+        </w:pBdr>
+        <w:shd w:fill="F7F7F7" w:val="clear"/>
+        <w:spacing w:after="0" w:line="240"/>
+        <w:ind w:left="120" w:right="120"/>
+      </w:pPr>
+      <w:r>
+        <w:rPr>
+          <w:rFonts w:ascii="Consolas" w:cs="Consolas" w:eastAsia="Consolas" w:hAnsi="Consolas"/>
+          <w:sz w:val="15"/>
+          <w:szCs w:val="15"/>
+        </w:rPr>
+        <w:t xml:space="preserve">  ActualBoepdPerDay;</w:t>
+      </w:r>
+    </w:p>
+    <w:p>
+      <w:pPr>
+        <w:pBdr>
+          <w:left w:val="single" w:color="8EA9DB" w:sz="12" w:space="6"/>
+        </w:pBdr>
+        <w:shd w:fill="F7F7F7" w:val="clear"/>
+        <w:spacing w:after="0" w:line="240"/>
+        <w:ind w:left="120" w:right="120"/>
+      </w:pPr>
+      <w:r>
+        <w:rPr>
+          <w:rFonts w:ascii="Consolas" w:cs="Consolas" w:eastAsia="Consolas" w:hAnsi="Consolas"/>
+          <w:sz w:val="15"/>
+          <w:szCs w:val="15"/>
+        </w:rPr>
+        <w:t xml:space="preserve"> </w:t>
+      </w:r>
+    </w:p>
+    <w:p>
+      <w:pPr>
+        <w:pBdr>
+          <w:left w:val="single" w:color="8EA9DB" w:sz="12" w:space="6"/>
+        </w:pBdr>
+        <w:shd w:fill="F7F7F7" w:val="clear"/>
+        <w:spacing w:after="0" w:line="240"/>
+        <w:ind w:left="120" w:right="120"/>
+      </w:pPr>
+      <w:r>
+        <w:rPr>
+          <w:rFonts w:ascii="Consolas" w:cs="Consolas" w:eastAsia="Consolas" w:hAnsi="Consolas"/>
+          <w:sz w:val="15"/>
+          <w:szCs w:val="15"/>
+        </w:rPr>
+        <w:t xml:space="preserve">  @UI.lineItem: [{ position: 60, importance: #MEDIUM, label: 'BE Target Total (BOEPD)' }]</w:t>
+      </w:r>
+    </w:p>
+    <w:p>
+      <w:pPr>
+        <w:pBdr>
+          <w:left w:val="single" w:color="8EA9DB" w:sz="12" w:space="6"/>
+        </w:pBdr>
+        <w:shd w:fill="F7F7F7" w:val="clear"/>
+        <w:spacing w:after="0" w:line="240"/>
+        <w:ind w:left="120" w:right="120"/>
+      </w:pPr>
+      <w:r>
+        <w:rPr>
+          <w:rFonts w:ascii="Consolas" w:cs="Consolas" w:eastAsia="Consolas" w:hAnsi="Consolas"/>
+          <w:sz w:val="15"/>
+          <w:szCs w:val="15"/>
+        </w:rPr>
+        <w:t xml:space="preserve">  TargetBoepdPerDay;</w:t>
+      </w:r>
+    </w:p>
+    <w:p>
+      <w:pPr>
+        <w:pBdr>
+          <w:left w:val="single" w:color="8EA9DB" w:sz="12" w:space="6"/>
+        </w:pBdr>
+        <w:shd w:fill="F7F7F7" w:val="clear"/>
+        <w:spacing w:after="0" w:line="240"/>
+        <w:ind w:left="120" w:right="120"/>
+      </w:pPr>
+      <w:r>
+        <w:rPr>
+          <w:rFonts w:ascii="Consolas" w:cs="Consolas" w:eastAsia="Consolas" w:hAnsi="Consolas"/>
+          <w:sz w:val="15"/>
+          <w:szCs w:val="15"/>
+        </w:rPr>
+        <w:t xml:space="preserve"> </w:t>
+      </w:r>
+    </w:p>
+    <w:p>
+      <w:pPr>
+        <w:pBdr>
+          <w:left w:val="single" w:color="8EA9DB" w:sz="12" w:space="6"/>
+        </w:pBdr>
+        <w:shd w:fill="F7F7F7" w:val="clear"/>
+        <w:spacing w:after="0" w:line="240"/>
+        <w:ind w:left="120" w:right="120"/>
+      </w:pPr>
+      <w:r>
+        <w:rPr>
+          <w:rFonts w:ascii="Consolas" w:cs="Consolas" w:eastAsia="Consolas" w:hAnsi="Consolas"/>
+          <w:sz w:val="15"/>
+          <w:szCs w:val="15"/>
+        </w:rPr>
+        <w:t xml:space="preserve">  @UI.lineItem: [{ position: 70, importance: #LOW, label: 'Scope' }]</w:t>
       </w:r>
     </w:p>
     <w:p>
@@ -56342,7 +57764,7 @@
           <w:sz w:val="15"/>
           <w:szCs w:val="15"/>
         </w:rPr>
-        <w:t xml:space="preserve">  @UI.lineItem: [{ position: 20, importance: #HIGH, label: 'Product' }]</w:t>
+        <w:t xml:space="preserve">  @UI.lineItem: [{ position: 80, importance: #LOW, label: 'Product' }]</w:t>
       </w:r>
     </w:p>
     <w:p>
@@ -56361,294 +57783,6 @@
           <w:szCs w:val="15"/>
         </w:rPr>
         <w:t xml:space="preserve">  ProductGroupText;</w:t>
-      </w:r>
-    </w:p>
-    <w:p>
-      <w:pPr>
-        <w:pBdr>
-          <w:left w:val="single" w:color="8EA9DB" w:sz="12" w:space="6"/>
-        </w:pBdr>
-        <w:shd w:fill="F7F7F7" w:val="clear"/>
-        <w:spacing w:after="0" w:line="240"/>
-        <w:ind w:left="120" w:right="120"/>
-      </w:pPr>
-      <w:r>
-        <w:rPr>
-          <w:rFonts w:ascii="Consolas" w:cs="Consolas" w:eastAsia="Consolas" w:hAnsi="Consolas"/>
-          <w:sz w:val="15"/>
-          <w:szCs w:val="15"/>
-        </w:rPr>
-        <w:t xml:space="preserve"> </w:t>
-      </w:r>
-    </w:p>
-    <w:p>
-      <w:pPr>
-        <w:pBdr>
-          <w:left w:val="single" w:color="8EA9DB" w:sz="12" w:space="6"/>
-        </w:pBdr>
-        <w:shd w:fill="F7F7F7" w:val="clear"/>
-        <w:spacing w:after="0" w:line="240"/>
-        <w:ind w:left="120" w:right="120"/>
-      </w:pPr>
-      <w:r>
-        <w:rPr>
-          <w:rFonts w:ascii="Consolas" w:cs="Consolas" w:eastAsia="Consolas" w:hAnsi="Consolas"/>
-          <w:sz w:val="15"/>
-          <w:szCs w:val="15"/>
-        </w:rPr>
-        <w:t xml:space="preserve">  @UI.lineItem: [{ position: 30, importance: #HIGH, label: 'Actual (BOPD / MMSCMD)' }]</w:t>
-      </w:r>
-    </w:p>
-    <w:p>
-      <w:pPr>
-        <w:pBdr>
-          <w:left w:val="single" w:color="8EA9DB" w:sz="12" w:space="6"/>
-        </w:pBdr>
-        <w:shd w:fill="F7F7F7" w:val="clear"/>
-        <w:spacing w:after="0" w:line="240"/>
-        <w:ind w:left="120" w:right="120"/>
-      </w:pPr>
-      <w:r>
-        <w:rPr>
-          <w:rFonts w:ascii="Consolas" w:cs="Consolas" w:eastAsia="Consolas" w:hAnsi="Consolas"/>
-          <w:sz w:val="15"/>
-          <w:szCs w:val="15"/>
-        </w:rPr>
-        <w:t xml:space="preserve">  ActualPerDay;</w:t>
-      </w:r>
-    </w:p>
-    <w:p>
-      <w:pPr>
-        <w:pBdr>
-          <w:left w:val="single" w:color="8EA9DB" w:sz="12" w:space="6"/>
-        </w:pBdr>
-        <w:shd w:fill="F7F7F7" w:val="clear"/>
-        <w:spacing w:after="0" w:line="240"/>
-        <w:ind w:left="120" w:right="120"/>
-      </w:pPr>
-      <w:r>
-        <w:rPr>
-          <w:rFonts w:ascii="Consolas" w:cs="Consolas" w:eastAsia="Consolas" w:hAnsi="Consolas"/>
-          <w:sz w:val="15"/>
-          <w:szCs w:val="15"/>
-        </w:rPr>
-        <w:t xml:space="preserve"> </w:t>
-      </w:r>
-    </w:p>
-    <w:p>
-      <w:pPr>
-        <w:pBdr>
-          <w:left w:val="single" w:color="8EA9DB" w:sz="12" w:space="6"/>
-        </w:pBdr>
-        <w:shd w:fill="F7F7F7" w:val="clear"/>
-        <w:spacing w:after="0" w:line="240"/>
-        <w:ind w:left="120" w:right="120"/>
-      </w:pPr>
-      <w:r>
-        <w:rPr>
-          <w:rFonts w:ascii="Consolas" w:cs="Consolas" w:eastAsia="Consolas" w:hAnsi="Consolas"/>
-          <w:sz w:val="15"/>
-          <w:szCs w:val="15"/>
-        </w:rPr>
-        <w:t xml:space="preserve">  @UI.lineItem: [{ position: 40, importance: #HIGH, label: 'BE Target (BOPD / MMSCMD)' }]</w:t>
-      </w:r>
-    </w:p>
-    <w:p>
-      <w:pPr>
-        <w:pBdr>
-          <w:left w:val="single" w:color="8EA9DB" w:sz="12" w:space="6"/>
-        </w:pBdr>
-        <w:shd w:fill="F7F7F7" w:val="clear"/>
-        <w:spacing w:after="0" w:line="240"/>
-        <w:ind w:left="120" w:right="120"/>
-      </w:pPr>
-      <w:r>
-        <w:rPr>
-          <w:rFonts w:ascii="Consolas" w:cs="Consolas" w:eastAsia="Consolas" w:hAnsi="Consolas"/>
-          <w:sz w:val="15"/>
-          <w:szCs w:val="15"/>
-        </w:rPr>
-        <w:t xml:space="preserve">  TargetPerDay;</w:t>
-      </w:r>
-    </w:p>
-    <w:p>
-      <w:pPr>
-        <w:pBdr>
-          <w:left w:val="single" w:color="8EA9DB" w:sz="12" w:space="6"/>
-        </w:pBdr>
-        <w:shd w:fill="F7F7F7" w:val="clear"/>
-        <w:spacing w:after="0" w:line="240"/>
-        <w:ind w:left="120" w:right="120"/>
-      </w:pPr>
-      <w:r>
-        <w:rPr>
-          <w:rFonts w:ascii="Consolas" w:cs="Consolas" w:eastAsia="Consolas" w:hAnsi="Consolas"/>
-          <w:sz w:val="15"/>
-          <w:szCs w:val="15"/>
-        </w:rPr>
-        <w:t xml:space="preserve"> </w:t>
-      </w:r>
-    </w:p>
-    <w:p>
-      <w:pPr>
-        <w:pBdr>
-          <w:left w:val="single" w:color="8EA9DB" w:sz="12" w:space="6"/>
-        </w:pBdr>
-        <w:shd w:fill="F7F7F7" w:val="clear"/>
-        <w:spacing w:after="0" w:line="240"/>
-        <w:ind w:left="120" w:right="120"/>
-      </w:pPr>
-      <w:r>
-        <w:rPr>
-          <w:rFonts w:ascii="Consolas" w:cs="Consolas" w:eastAsia="Consolas" w:hAnsi="Consolas"/>
-          <w:sz w:val="15"/>
-          <w:szCs w:val="15"/>
-        </w:rPr>
-        <w:t xml:space="preserve">  @UI.lineItem: [{ position: 50, importance: #HIGH, label: 'Actual Total (BOEPD)' }]</w:t>
-      </w:r>
-    </w:p>
-    <w:p>
-      <w:pPr>
-        <w:pBdr>
-          <w:left w:val="single" w:color="8EA9DB" w:sz="12" w:space="6"/>
-        </w:pBdr>
-        <w:shd w:fill="F7F7F7" w:val="clear"/>
-        <w:spacing w:after="0" w:line="240"/>
-        <w:ind w:left="120" w:right="120"/>
-      </w:pPr>
-      <w:r>
-        <w:rPr>
-          <w:rFonts w:ascii="Consolas" w:cs="Consolas" w:eastAsia="Consolas" w:hAnsi="Consolas"/>
-          <w:sz w:val="15"/>
-          <w:szCs w:val="15"/>
-        </w:rPr>
-        <w:t xml:space="preserve">  ActualBoepdPerDay;</w:t>
-      </w:r>
-    </w:p>
-    <w:p>
-      <w:pPr>
-        <w:pBdr>
-          <w:left w:val="single" w:color="8EA9DB" w:sz="12" w:space="6"/>
-        </w:pBdr>
-        <w:shd w:fill="F7F7F7" w:val="clear"/>
-        <w:spacing w:after="0" w:line="240"/>
-        <w:ind w:left="120" w:right="120"/>
-      </w:pPr>
-      <w:r>
-        <w:rPr>
-          <w:rFonts w:ascii="Consolas" w:cs="Consolas" w:eastAsia="Consolas" w:hAnsi="Consolas"/>
-          <w:sz w:val="15"/>
-          <w:szCs w:val="15"/>
-        </w:rPr>
-        <w:t xml:space="preserve"> </w:t>
-      </w:r>
-    </w:p>
-    <w:p>
-      <w:pPr>
-        <w:pBdr>
-          <w:left w:val="single" w:color="8EA9DB" w:sz="12" w:space="6"/>
-        </w:pBdr>
-        <w:shd w:fill="F7F7F7" w:val="clear"/>
-        <w:spacing w:after="0" w:line="240"/>
-        <w:ind w:left="120" w:right="120"/>
-      </w:pPr>
-      <w:r>
-        <w:rPr>
-          <w:rFonts w:ascii="Consolas" w:cs="Consolas" w:eastAsia="Consolas" w:hAnsi="Consolas"/>
-          <w:sz w:val="15"/>
-          <w:szCs w:val="15"/>
-        </w:rPr>
-        <w:t xml:space="preserve">  @UI.lineItem: [{ position: 60, importance: #HIGH, label: 'BE Target Total (BOEPD)' }]</w:t>
-      </w:r>
-    </w:p>
-    <w:p>
-      <w:pPr>
-        <w:pBdr>
-          <w:left w:val="single" w:color="8EA9DB" w:sz="12" w:space="6"/>
-        </w:pBdr>
-        <w:shd w:fill="F7F7F7" w:val="clear"/>
-        <w:spacing w:after="0" w:line="240"/>
-        <w:ind w:left="120" w:right="120"/>
-      </w:pPr>
-      <w:r>
-        <w:rPr>
-          <w:rFonts w:ascii="Consolas" w:cs="Consolas" w:eastAsia="Consolas" w:hAnsi="Consolas"/>
-          <w:sz w:val="15"/>
-          <w:szCs w:val="15"/>
-        </w:rPr>
-        <w:t xml:space="preserve">  TargetBoepdPerDay;</w:t>
-      </w:r>
-    </w:p>
-    <w:p>
-      <w:pPr>
-        <w:pBdr>
-          <w:left w:val="single" w:color="8EA9DB" w:sz="12" w:space="6"/>
-        </w:pBdr>
-        <w:shd w:fill="F7F7F7" w:val="clear"/>
-        <w:spacing w:after="0" w:line="240"/>
-        <w:ind w:left="120" w:right="120"/>
-      </w:pPr>
-      <w:r>
-        <w:rPr>
-          <w:rFonts w:ascii="Consolas" w:cs="Consolas" w:eastAsia="Consolas" w:hAnsi="Consolas"/>
-          <w:sz w:val="15"/>
-          <w:szCs w:val="15"/>
-        </w:rPr>
-        <w:t xml:space="preserve"> </w:t>
-      </w:r>
-    </w:p>
-    <w:p>
-      <w:pPr>
-        <w:pBdr>
-          <w:left w:val="single" w:color="8EA9DB" w:sz="12" w:space="6"/>
-        </w:pBdr>
-        <w:shd w:fill="F7F7F7" w:val="clear"/>
-        <w:spacing w:after="0" w:line="240"/>
-        <w:ind w:left="120" w:right="120"/>
-      </w:pPr>
-      <w:r>
-        <w:rPr>
-          <w:rFonts w:ascii="Consolas" w:cs="Consolas" w:eastAsia="Consolas" w:hAnsi="Consolas"/>
-          <w:sz w:val="15"/>
-          <w:szCs w:val="15"/>
-        </w:rPr>
-        <w:t xml:space="preserve">  @UI.lineItem: [{ position: 70, importance: #HIGH, label: '% Achv w.r.t. BE Target' }]</w:t>
-      </w:r>
-    </w:p>
-    <w:p>
-      <w:pPr>
-        <w:pBdr>
-          <w:left w:val="single" w:color="8EA9DB" w:sz="12" w:space="6"/>
-        </w:pBdr>
-        <w:shd w:fill="F7F7F7" w:val="clear"/>
-        <w:spacing w:after="0" w:line="240"/>
-        <w:ind w:left="120" w:right="120"/>
-      </w:pPr>
-      <w:r>
-        <w:rPr>
-          <w:rFonts w:ascii="Consolas" w:cs="Consolas" w:eastAsia="Consolas" w:hAnsi="Consolas"/>
-          <w:sz w:val="15"/>
-          <w:szCs w:val="15"/>
-        </w:rPr>
-        <w:t xml:space="preserve">  @UI.dataPoint: { title: '% Achv w.r.t. BE Target' }</w:t>
-      </w:r>
-    </w:p>
-    <w:p>
-      <w:pPr>
-        <w:pBdr>
-          <w:left w:val="single" w:color="8EA9DB" w:sz="12" w:space="6"/>
-        </w:pBdr>
-        <w:shd w:fill="F7F7F7" w:val="clear"/>
-        <w:spacing w:after="0" w:line="240"/>
-        <w:ind w:left="120" w:right="120"/>
-      </w:pPr>
-      <w:r>
-        <w:rPr>
-          <w:rFonts w:ascii="Consolas" w:cs="Consolas" w:eastAsia="Consolas" w:hAnsi="Consolas"/>
-          <w:sz w:val="15"/>
-          <w:szCs w:val="15"/>
-        </w:rPr>
-        <w:t xml:space="preserve">  AchievementPct;</w:t>
       </w:r>
     </w:p>
     <w:p>

</xml_diff>

<commit_message>
Decouple target scaling from ZDPR_I_TARGET (abapGit activation order)
abapGit checked the new dependent views against the still-active old
ZDPR_I_TARGET ("column TARGETVOLUME is unknown") on two pulls. The scaled
columns now live in the new view ZDPR_P_TARGET_ROW (tables only);
ZDPR_I_TARGET is back to its previously active source and
ZDPR_I_TARGET_FY reads from ZDPR_P_TARGET_ROW.

Co-Authored-By: Claude Fable 5.1 <noreply@anthropic.com>
Claude-Session: https://claude.ai/code/session_01Xu9y1woHSkPxJdZRFiKhnN
</commit_message>
<xml_diff>
--- a/deploy/ZDPR_RAP_Complete_Source_Code.docx
+++ b/deploy/ZDPR_RAP_Complete_Source_Code.docx
@@ -580,7 +580,7 @@
                 <w:sz w:val="18"/>
                 <w:szCs w:val="18"/>
               </w:rPr>
-              <w:t xml:space="preserve">Production targets (ZPRA_T_PRD_TAR) scaled like the classic report: TargetVolume (barrels / MMSCM), TargetBoe, conversion factor from ZPRA_T_TAR_CF, days in fiscal year.</w:t>
+              <w:t xml:space="preserve">Production targets (ZPRA_T_PRD_TAR) with ProductGroup as plain column.</w:t>
             </w:r>
           </w:p>
         </w:tc>
@@ -608,7 +608,7 @@
                 <w:sz w:val="18"/>
                 <w:szCs w:val="18"/>
               </w:rPr>
-              <w:t xml:space="preserve">ZDPR_I_TARGET_FY</w:t>
+              <w:t xml:space="preserve">ZDPR_P_TARGET_ROW</w:t>
             </w:r>
           </w:p>
         </w:tc>
@@ -660,7 +660,7 @@
                 <w:sz w:val="18"/>
                 <w:szCs w:val="18"/>
               </w:rPr>
-              <w:t xml:space="preserve">Annual target per fiscal year / asset / block / product (all months, volume types NET_PROD, GROSS_PROD, GAS_INJ).</w:t>
+              <w:t xml:space="preserve">Target rows scaled like the classic report: TargetVolume (barrels / MMSCM), TargetBoe, conversion factor from ZPRA_T_TAR_CF, days in fiscal year.</w:t>
             </w:r>
           </w:p>
         </w:tc>
@@ -688,7 +688,7 @@
                 <w:sz w:val="18"/>
                 <w:szCs w:val="18"/>
               </w:rPr>
-              <w:t xml:space="preserve">ZDPR_P_DAY_BASE</w:t>
+              <w:t xml:space="preserve">ZDPR_I_TARGET_FY</w:t>
             </w:r>
           </w:p>
         </w:tc>
@@ -740,7 +740,7 @@
                 <w:sz w:val="18"/>
                 <w:szCs w:val="18"/>
               </w:rPr>
-              <w:t xml:space="preserve">Unit-normalised, signed daily figure (gas = GROSS_PROD − GAS_INJ), BOE factor, PI %, fiscal year/period, Business Unit.</w:t>
+              <w:t xml:space="preserve">Annual target per fiscal year / asset / block / product (all months, volume types NET_PROD, GROSS_PROD, GAS_INJ).</w:t>
             </w:r>
           </w:p>
         </w:tc>
@@ -768,7 +768,7 @@
                 <w:sz w:val="18"/>
                 <w:szCs w:val="18"/>
               </w:rPr>
-              <w:t xml:space="preserve">ZDPR_P_DATE_SPINE</w:t>
+              <w:t xml:space="preserve">ZDPR_P_DAY_BASE</w:t>
             </w:r>
           </w:p>
         </w:tc>
@@ -820,7 +820,7 @@
                 <w:sz w:val="18"/>
                 <w:szCs w:val="18"/>
               </w:rPr>
-              <w:t xml:space="preserve">One row per production date with its fiscal year / period.</w:t>
+              <w:t xml:space="preserve">Unit-normalised, signed daily figure (gas = GROSS_PROD − GAS_INJ), BOE factor, PI %, fiscal year/period, Business Unit.</w:t>
             </w:r>
           </w:p>
         </w:tc>
@@ -848,7 +848,7 @@
                 <w:sz w:val="18"/>
                 <w:szCs w:val="18"/>
               </w:rPr>
-              <w:t xml:space="preserve">ZDPR_P_TARGET_DAY</w:t>
+              <w:t xml:space="preserve">ZDPR_P_DATE_SPINE</w:t>
             </w:r>
           </w:p>
         </w:tc>
@@ -900,7 +900,7 @@
                 <w:sz w:val="18"/>
                 <w:szCs w:val="18"/>
               </w:rPr>
-              <w:t xml:space="preserve">BE target daily rate (annual volume ÷ days in FY) on every production date per asset / block / product.</w:t>
+              <w:t xml:space="preserve">One row per production date with its fiscal year / period.</w:t>
             </w:r>
           </w:p>
         </w:tc>
@@ -928,7 +928,167 @@
                 <w:sz w:val="18"/>
                 <w:szCs w:val="18"/>
               </w:rPr>
+              <w:t xml:space="preserve">ZDPR_P_TARGET_DAY</w:t>
+            </w:r>
+          </w:p>
+        </w:tc>
+        <w:tc>
+          <w:tcPr>
+            <w:tcW w:type="dxa" w:w="2600"/>
+            <w:shd w:fill="F2F2F2" w:val="clear"/>
+            <w:tcMar>
+              <w:top w:type="dxa" w:w="60"/>
+              <w:left w:type="dxa" w:w="100"/>
+              <w:bottom w:type="dxa" w:w="60"/>
+              <w:right w:type="dxa" w:w="100"/>
+            </w:tcMar>
+          </w:tcPr>
+          <w:p>
+            <w:pPr>
+              <w:spacing w:after="0"/>
+            </w:pPr>
+            <w:r>
+              <w:rPr>
+                <w:b w:val="false"/>
+                <w:bCs w:val="false"/>
+                <w:sz w:val="18"/>
+                <w:szCs w:val="18"/>
+              </w:rPr>
+              <w:t xml:space="preserve">CDS view entity</w:t>
+            </w:r>
+          </w:p>
+        </w:tc>
+        <w:tc>
+          <w:tcPr>
+            <w:tcW w:type="dxa" w:w="4260"/>
+            <w:shd w:fill="F2F2F2" w:val="clear"/>
+            <w:tcMar>
+              <w:top w:type="dxa" w:w="60"/>
+              <w:left w:type="dxa" w:w="100"/>
+              <w:bottom w:type="dxa" w:w="60"/>
+              <w:right w:type="dxa" w:w="100"/>
+            </w:tcMar>
+          </w:tcPr>
+          <w:p>
+            <w:pPr>
+              <w:spacing w:after="0"/>
+            </w:pPr>
+            <w:r>
+              <w:rPr>
+                <w:b w:val="false"/>
+                <w:bCs w:val="false"/>
+                <w:sz w:val="18"/>
+                <w:szCs w:val="18"/>
+              </w:rPr>
+              <w:t xml:space="preserve">BE target daily rate (annual volume ÷ days in FY) on every production date per asset / block / product.</w:t>
+            </w:r>
+          </w:p>
+        </w:tc>
+      </w:tr>
+      <w:tr>
+        <w:tc>
+          <w:tcPr>
+            <w:tcW w:type="dxa" w:w="2500"/>
+            <w:shd w:fill="FFFFFF" w:val="clear"/>
+            <w:tcMar>
+              <w:top w:type="dxa" w:w="60"/>
+              <w:left w:type="dxa" w:w="100"/>
+              <w:bottom w:type="dxa" w:w="60"/>
+              <w:right w:type="dxa" w:w="100"/>
+            </w:tcMar>
+          </w:tcPr>
+          <w:p>
+            <w:pPr>
+              <w:spacing w:after="0"/>
+            </w:pPr>
+            <w:r>
+              <w:rPr>
+                <w:b w:val="false"/>
+                <w:bCs w:val="false"/>
+                <w:sz w:val="18"/>
+                <w:szCs w:val="18"/>
+              </w:rPr>
               <w:t xml:space="preserve">ZDPR_P_BOEPD_ROWS</w:t>
+            </w:r>
+          </w:p>
+        </w:tc>
+        <w:tc>
+          <w:tcPr>
+            <w:tcW w:type="dxa" w:w="2600"/>
+            <w:shd w:fill="FFFFFF" w:val="clear"/>
+            <w:tcMar>
+              <w:top w:type="dxa" w:w="60"/>
+              <w:left w:type="dxa" w:w="100"/>
+              <w:bottom w:type="dxa" w:w="60"/>
+              <w:right w:type="dxa" w:w="100"/>
+            </w:tcMar>
+          </w:tcPr>
+          <w:p>
+            <w:pPr>
+              <w:spacing w:after="0"/>
+            </w:pPr>
+            <w:r>
+              <w:rPr>
+                <w:b w:val="false"/>
+                <w:bCs w:val="false"/>
+                <w:sz w:val="18"/>
+                <w:szCs w:val="18"/>
+              </w:rPr>
+              <w:t xml:space="preserve">CDS view entity (union)</w:t>
+            </w:r>
+          </w:p>
+        </w:tc>
+        <w:tc>
+          <w:tcPr>
+            <w:tcW w:type="dxa" w:w="4260"/>
+            <w:shd w:fill="FFFFFF" w:val="clear"/>
+            <w:tcMar>
+              <w:top w:type="dxa" w:w="60"/>
+              <w:left w:type="dxa" w:w="100"/>
+              <w:bottom w:type="dxa" w:w="60"/>
+              <w:right w:type="dxa" w:w="100"/>
+            </w:tcMar>
+          </w:tcPr>
+          <w:p>
+            <w:pPr>
+              <w:spacing w:after="0"/>
+            </w:pPr>
+            <w:r>
+              <w:rPr>
+                <w:b w:val="false"/>
+                <w:bCs w:val="false"/>
+                <w:sz w:val="18"/>
+                <w:szCs w:val="18"/>
+              </w:rPr>
+              <w:t xml:space="preserve">Actual rows (A) and target rows (T) with identical columns — row source of ZDPR_C_BOEPD_DAY.</w:t>
+            </w:r>
+          </w:p>
+        </w:tc>
+      </w:tr>
+      <w:tr>
+        <w:tc>
+          <w:tcPr>
+            <w:tcW w:type="dxa" w:w="2500"/>
+            <w:shd w:fill="F2F2F2" w:val="clear"/>
+            <w:tcMar>
+              <w:top w:type="dxa" w:w="60"/>
+              <w:left w:type="dxa" w:w="100"/>
+              <w:bottom w:type="dxa" w:w="60"/>
+              <w:right w:type="dxa" w:w="100"/>
+            </w:tcMar>
+          </w:tcPr>
+          <w:p>
+            <w:pPr>
+              <w:spacing w:after="0"/>
+            </w:pPr>
+            <w:r>
+              <w:rPr>
+                <w:b w:val="false"/>
+                <w:bCs w:val="false"/>
+                <w:sz w:val="18"/>
+                <w:szCs w:val="18"/>
+              </w:rPr>
+              <w:t xml:space="preserve">ZDPR_P_PERF_AGG</w:t>
             </w:r>
           </w:p>
         </w:tc>
@@ -980,7 +1140,7 @@
                 <w:sz w:val="18"/>
                 <w:szCs w:val="18"/>
               </w:rPr>
-              <w:t xml:space="preserve">Actual rows (A) and target rows (T) with identical columns — row source of ZDPR_C_BOEPD_DAY.</w:t>
+              <w:t xml:space="preserve">YTD and ANNUAL aggregates for the Production Performance table (Excel tab 3).</w:t>
             </w:r>
           </w:p>
         </w:tc>
@@ -1008,7 +1168,7 @@
                 <w:sz w:val="18"/>
                 <w:szCs w:val="18"/>
               </w:rPr>
-              <w:t xml:space="preserve">ZDPR_P_PERF_AGG</w:t>
+              <w:t xml:space="preserve">ZDPR_C_PROD_CUBE</w:t>
             </w:r>
           </w:p>
         </w:tc>
@@ -1034,7 +1194,7 @@
                 <w:sz w:val="18"/>
                 <w:szCs w:val="18"/>
               </w:rPr>
-              <w:t xml:space="preserve">CDS view entity (union)</w:t>
+              <w:t xml:space="preserve">CDS view entity, @Analytics.dataCategory #CUBE</w:t>
             </w:r>
           </w:p>
         </w:tc>
@@ -1060,7 +1220,7 @@
                 <w:sz w:val="18"/>
                 <w:szCs w:val="18"/>
               </w:rPr>
-              <w:t xml:space="preserve">YTD and ANNUAL aggregates for the Production Performance table (Excel tab 3).</w:t>
+              <w:t xml:space="preserve">Daily production cube: JV and OVL quantities, gas MMSCMD, BOEPD.</w:t>
             </w:r>
           </w:p>
         </w:tc>
@@ -1088,7 +1248,7 @@
                 <w:sz w:val="18"/>
                 <w:szCs w:val="18"/>
               </w:rPr>
-              <w:t xml:space="preserve">ZDPR_C_PROD_CUBE</w:t>
+              <w:t xml:space="preserve">ZDPR_C_BOEPD_DAY</w:t>
             </w:r>
           </w:p>
         </w:tc>
@@ -1114,7 +1274,7 @@
                 <w:sz w:val="18"/>
                 <w:szCs w:val="18"/>
               </w:rPr>
-              <w:t xml:space="preserve">CDS view entity, @Analytics.dataCategory #CUBE</w:t>
+              <w:t xml:space="preserve">CDS view entity, #CUBE</w:t>
             </w:r>
           </w:p>
         </w:tc>
@@ -1140,7 +1300,7 @@
                 <w:sz w:val="18"/>
                 <w:szCs w:val="18"/>
               </w:rPr>
-              <w:t xml:space="preserve">Daily production cube: JV and OVL quantities, gas MMSCMD, BOEPD.</w:t>
+              <w:t xml:space="preserve">Actual vs BE target per day (plain select on ZDPR_P_BOEPD_ROWS) — the data behind the Excel tab-2 graph.</w:t>
             </w:r>
           </w:p>
         </w:tc>
@@ -1168,7 +1328,7 @@
                 <w:sz w:val="18"/>
                 <w:szCs w:val="18"/>
               </w:rPr>
-              <w:t xml:space="preserve">ZDPR_C_BOEPD_DAY</w:t>
+              <w:t xml:space="preserve">ZDPR_C_TARGET_CUBE</w:t>
             </w:r>
           </w:p>
         </w:tc>
@@ -1194,7 +1354,7 @@
                 <w:sz w:val="18"/>
                 <w:szCs w:val="18"/>
               </w:rPr>
-              <w:t xml:space="preserve">CDS view entity, #CUBE</w:t>
+              <w:t xml:space="preserve">CDS view entity, #CUBE, parameter P_TargetCode</w:t>
             </w:r>
           </w:p>
         </w:tc>
@@ -1220,7 +1380,7 @@
                 <w:sz w:val="18"/>
                 <w:szCs w:val="18"/>
               </w:rPr>
-              <w:t xml:space="preserve">Actual vs BE target per day (plain select on ZDPR_P_BOEPD_ROWS) — the data behind the Excel tab-2 graph.</w:t>
+              <w:t xml:space="preserve">Monthly actual vs target; the join lives here because analytical queries may not join.</w:t>
             </w:r>
           </w:p>
         </w:tc>
@@ -1248,7 +1408,7 @@
                 <w:sz w:val="18"/>
                 <w:szCs w:val="18"/>
               </w:rPr>
-              <w:t xml:space="preserve">ZDPR_C_TARGET_CUBE</w:t>
+              <w:t xml:space="preserve">ZDPR_Q_BOEPD_TREND</w:t>
             </w:r>
           </w:p>
         </w:tc>
@@ -1274,7 +1434,7 @@
                 <w:sz w:val="18"/>
                 <w:szCs w:val="18"/>
               </w:rPr>
-              <w:t xml:space="preserve">CDS view entity, #CUBE, parameter P_TargetCode</w:t>
+              <w:t xml:space="preserve">Classic CDS view, @Analytics.query, @OData.publish</w:t>
             </w:r>
           </w:p>
         </w:tc>
@@ -1300,7 +1460,7 @@
                 <w:sz w:val="18"/>
                 <w:szCs w:val="18"/>
               </w:rPr>
-              <w:t xml:space="preserve">Monthly actual vs target; the join lives here because analytical queries may not join.</w:t>
+              <w:t xml:space="preserve">Excel tab-2 graph: Actual Production vs BE Target BOEPD over dates. Service ZDPR_Q_BOEPD_TREND_CDS.</w:t>
             </w:r>
           </w:p>
         </w:tc>
@@ -1328,7 +1488,7 @@
                 <w:sz w:val="18"/>
                 <w:szCs w:val="18"/>
               </w:rPr>
-              <w:t xml:space="preserve">ZDPR_Q_BOEPD_TREND</w:t>
+              <w:t xml:space="preserve">ZDPR_Q_DAILY_TREND</w:t>
             </w:r>
           </w:p>
         </w:tc>
@@ -1380,7 +1540,7 @@
                 <w:sz w:val="18"/>
                 <w:szCs w:val="18"/>
               </w:rPr>
-              <w:t xml:space="preserve">Excel tab-2 graph: Actual Production vs BE Target BOEPD over dates. Service ZDPR_Q_BOEPD_TREND_CDS.</w:t>
+              <w:t xml:space="preserve">Daily production trend. Service ZDPR_Q_DAILY_TREND_CDS.</w:t>
             </w:r>
           </w:p>
         </w:tc>
@@ -1408,7 +1568,7 @@
                 <w:sz w:val="18"/>
                 <w:szCs w:val="18"/>
               </w:rPr>
-              <w:t xml:space="preserve">ZDPR_Q_DAILY_TREND</w:t>
+              <w:t xml:space="preserve">ZDPR_Q_PROD_QUERY</w:t>
             </w:r>
           </w:p>
         </w:tc>
@@ -1460,7 +1620,7 @@
                 <w:sz w:val="18"/>
                 <w:szCs w:val="18"/>
               </w:rPr>
-              <w:t xml:space="preserve">Daily production trend. Service ZDPR_Q_DAILY_TREND_CDS.</w:t>
+              <w:t xml:space="preserve">Production records by product and asset. Service ZDPR_Q_PROD_QUERY_CDS.</w:t>
             </w:r>
           </w:p>
         </w:tc>
@@ -1488,7 +1648,7 @@
                 <w:sz w:val="18"/>
                 <w:szCs w:val="18"/>
               </w:rPr>
-              <w:t xml:space="preserve">ZDPR_Q_PROD_QUERY</w:t>
+              <w:t xml:space="preserve">ZDPR_Q_TARGET_QUERY</w:t>
             </w:r>
           </w:p>
         </w:tc>
@@ -1540,7 +1700,7 @@
                 <w:sz w:val="18"/>
                 <w:szCs w:val="18"/>
               </w:rPr>
-              <w:t xml:space="preserve">Production records by product and asset. Service ZDPR_Q_PROD_QUERY_CDS.</w:t>
+              <w:t xml:space="preserve">Target vs actual with Achievement % as a FORMULA. Service ZDPR_Q_TARGET_QUERY_CDS.</w:t>
             </w:r>
           </w:p>
         </w:tc>
@@ -1568,7 +1728,7 @@
                 <w:sz w:val="18"/>
                 <w:szCs w:val="18"/>
               </w:rPr>
-              <w:t xml:space="preserve">ZDPR_Q_TARGET_QUERY</w:t>
+              <w:t xml:space="preserve">ZDPR_Q_PROD_PERF</w:t>
             </w:r>
           </w:p>
         </w:tc>
@@ -1594,7 +1754,7 @@
                 <w:sz w:val="18"/>
                 <w:szCs w:val="18"/>
               </w:rPr>
-              <w:t xml:space="preserve">Classic CDS view, @Analytics.query, @OData.publish</w:t>
+              <w:t xml:space="preserve">Classic CDS view, @OData.publish (also in the V4 service definition)</w:t>
             </w:r>
           </w:p>
         </w:tc>
@@ -1620,7 +1780,7 @@
                 <w:sz w:val="18"/>
                 <w:szCs w:val="18"/>
               </w:rPr>
-              <w:t xml:space="preserve">Target vs actual with Achievement % as a FORMULA. Service ZDPR_Q_TARGET_QUERY_CDS.</w:t>
+              <w:t xml:space="preserve">Excel tab-3 Production Performance: per-day actual and target, % achievement, criticality. OData V2 service ZDPR_Q_PROD_PERF_CDS for the Overview Page card.</w:t>
             </w:r>
           </w:p>
         </w:tc>
@@ -1648,7 +1808,7 @@
                 <w:sz w:val="18"/>
                 <w:szCs w:val="18"/>
               </w:rPr>
-              <w:t xml:space="preserve">ZDPR_Q_PROD_PERF</w:t>
+              <w:t xml:space="preserve">ZDPR_A_PROD_PARAM</w:t>
             </w:r>
           </w:p>
         </w:tc>
@@ -1674,7 +1834,7 @@
                 <w:sz w:val="18"/>
                 <w:szCs w:val="18"/>
               </w:rPr>
-              <w:t xml:space="preserve">Classic CDS view, @OData.publish (also in the V4 service definition)</w:t>
+              <w:t xml:space="preserve">CDS abstract entity</w:t>
             </w:r>
           </w:p>
         </w:tc>
@@ -1700,7 +1860,7 @@
                 <w:sz w:val="18"/>
                 <w:szCs w:val="18"/>
               </w:rPr>
-              <w:t xml:space="preserve">Excel tab-3 Production Performance: per-day actual and target, % achievement, criticality. OData V2 service ZDPR_Q_PROD_PERF_CDS for the Overview Page card.</w:t>
+              <w:t xml:space="preserve">Action parameter: date range.</w:t>
             </w:r>
           </w:p>
         </w:tc>
@@ -1728,7 +1888,7 @@
                 <w:sz w:val="18"/>
                 <w:szCs w:val="18"/>
               </w:rPr>
-              <w:t xml:space="preserve">ZDPR_A_PROD_PARAM</w:t>
+              <w:t xml:space="preserve">ZDPR_A_TAR_PARAM</w:t>
             </w:r>
           </w:p>
         </w:tc>
@@ -1780,7 +1940,7 @@
                 <w:sz w:val="18"/>
                 <w:szCs w:val="18"/>
               </w:rPr>
-              <w:t xml:space="preserve">Action parameter: date range.</w:t>
+              <w:t xml:space="preserve">Action parameter: fiscal year and target code.</w:t>
             </w:r>
           </w:p>
         </w:tc>
@@ -1808,7 +1968,7 @@
                 <w:sz w:val="18"/>
                 <w:szCs w:val="18"/>
               </w:rPr>
-              <w:t xml:space="preserve">ZDPR_A_TAR_PARAM</w:t>
+              <w:t xml:space="preserve">ZDPR_A_EXCEL_RESULT</w:t>
             </w:r>
           </w:p>
         </w:tc>
@@ -1860,7 +2020,7 @@
                 <w:sz w:val="18"/>
                 <w:szCs w:val="18"/>
               </w:rPr>
-              <w:t xml:space="preserve">Action parameter: fiscal year and target code.</w:t>
+              <w:t xml:space="preserve">Action result: Excel file (base64).</w:t>
             </w:r>
           </w:p>
         </w:tc>
@@ -1888,7 +2048,7 @@
                 <w:sz w:val="18"/>
                 <w:szCs w:val="18"/>
               </w:rPr>
-              <w:t xml:space="preserve">ZDPR_A_EXCEL_RESULT</w:t>
+              <w:t xml:space="preserve">ZDPR_A_PDF_RESULT</w:t>
             </w:r>
           </w:p>
         </w:tc>
@@ -1940,7 +2100,7 @@
                 <w:sz w:val="18"/>
                 <w:szCs w:val="18"/>
               </w:rPr>
-              <w:t xml:space="preserve">Action result: Excel file (base64).</w:t>
+              <w:t xml:space="preserve">Action result: PDF file (base64).</w:t>
             </w:r>
           </w:p>
         </w:tc>
@@ -1968,7 +2128,7 @@
                 <w:sz w:val="18"/>
                 <w:szCs w:val="18"/>
               </w:rPr>
-              <w:t xml:space="preserve">ZDPR_A_PDF_RESULT</w:t>
+              <w:t xml:space="preserve">ZDPR_I_EXCEL_DL</w:t>
             </w:r>
           </w:p>
         </w:tc>
@@ -1994,7 +2154,7 @@
                 <w:sz w:val="18"/>
                 <w:szCs w:val="18"/>
               </w:rPr>
-              <w:t xml:space="preserve">CDS abstract entity</w:t>
+              <w:t xml:space="preserve">CDS root view entity</w:t>
             </w:r>
           </w:p>
         </w:tc>
@@ -2020,7 +2180,7 @@
                 <w:sz w:val="18"/>
                 <w:szCs w:val="18"/>
               </w:rPr>
-              <w:t xml:space="preserve">Action result: PDF file (base64).</w:t>
+              <w:t xml:space="preserve">Host entity for the static download actions (one row per logged-on user).</w:t>
             </w:r>
           </w:p>
         </w:tc>
@@ -2048,7 +2208,7 @@
                 <w:sz w:val="18"/>
                 <w:szCs w:val="18"/>
               </w:rPr>
-              <w:t xml:space="preserve">ZDPR_I_EXCEL_DL</w:t>
+              <w:t xml:space="preserve">ZDPR_I_EXCEL_DL (Behavior Definition)</w:t>
             </w:r>
           </w:p>
         </w:tc>
@@ -2074,7 +2234,7 @@
                 <w:sz w:val="18"/>
                 <w:szCs w:val="18"/>
               </w:rPr>
-              <w:t xml:space="preserve">CDS root view entity</w:t>
+              <w:t xml:space="preserve">Behavior definition, unmanaged, action-only</w:t>
             </w:r>
           </w:p>
         </w:tc>
@@ -2100,7 +2260,7 @@
                 <w:sz w:val="18"/>
                 <w:szCs w:val="18"/>
               </w:rPr>
-              <w:t xml:space="preserve">Host entity for the static download actions (one row per logged-on user).</w:t>
+              <w:t xml:space="preserve">Four static actions: downloadProduction, downloadTargets, downloadPdfProduction, downloadPdfTargets.</w:t>
             </w:r>
           </w:p>
         </w:tc>
@@ -2128,7 +2288,7 @@
                 <w:sz w:val="18"/>
                 <w:szCs w:val="18"/>
               </w:rPr>
-              <w:t xml:space="preserve">ZDPR_I_EXCEL_DL (Behavior Definition)</w:t>
+              <w:t xml:space="preserve">ZBP_ZDPR_EXCEL_DL</w:t>
             </w:r>
           </w:p>
         </w:tc>
@@ -2154,7 +2314,7 @@
                 <w:sz w:val="18"/>
                 <w:szCs w:val="18"/>
               </w:rPr>
-              <w:t xml:space="preserve">Behavior definition, unmanaged, action-only</w:t>
+              <w:t xml:space="preserve">ABAP class (behavior implementation)</w:t>
             </w:r>
           </w:p>
         </w:tc>
@@ -2180,7 +2340,7 @@
                 <w:sz w:val="18"/>
                 <w:szCs w:val="18"/>
               </w:rPr>
-              <w:t xml:space="preserve">Four static actions: downloadProduction, downloadTargets, downloadPdfProduction, downloadPdfTargets.</w:t>
+              <w:t xml:space="preserve">Global class (top) and local handler class lhc_dpr_excel (goes into the Local Types include in ADT).</w:t>
             </w:r>
           </w:p>
         </w:tc>
@@ -2208,7 +2368,7 @@
                 <w:sz w:val="18"/>
                 <w:szCs w:val="18"/>
               </w:rPr>
-              <w:t xml:space="preserve">ZBP_ZDPR_EXCEL_DL</w:t>
+              <w:t xml:space="preserve">ZCL_ZDPR_EXCEL</w:t>
             </w:r>
           </w:p>
         </w:tc>
@@ -2234,7 +2394,7 @@
                 <w:sz w:val="18"/>
                 <w:szCs w:val="18"/>
               </w:rPr>
-              <w:t xml:space="preserve">ABAP class (behavior implementation)</w:t>
+              <w:t xml:space="preserve">ABAP class</w:t>
             </w:r>
           </w:p>
         </w:tc>
@@ -2260,7 +2420,7 @@
                 <w:sz w:val="18"/>
                 <w:szCs w:val="18"/>
               </w:rPr>
-              <w:t xml:space="preserve">Global class (top) and local handler class lhc_dpr_excel (goes into the Local Types include in ADT).</w:t>
+              <w:t xml:space="preserve">Excel generation with abap2xlsx (zcl_excel).</w:t>
             </w:r>
           </w:p>
         </w:tc>
@@ -2288,7 +2448,7 @@
                 <w:sz w:val="18"/>
                 <w:szCs w:val="18"/>
               </w:rPr>
-              <w:t xml:space="preserve">ZCL_ZDPR_EXCEL</w:t>
+              <w:t xml:space="preserve">ZCL_ZDPR_PDF</w:t>
             </w:r>
           </w:p>
         </w:tc>
@@ -2340,7 +2500,7 @@
                 <w:sz w:val="18"/>
                 <w:szCs w:val="18"/>
               </w:rPr>
-              <w:t xml:space="preserve">Excel generation with abap2xlsx (zcl_excel).</w:t>
+              <w:t xml:space="preserve">PDF generation via Adobe forms ZDPR_FRM_PRODUCTION / ZDPR_FRM_TARGETS (optional).</w:t>
             </w:r>
           </w:p>
         </w:tc>
@@ -2368,7 +2528,7 @@
                 <w:sz w:val="18"/>
                 <w:szCs w:val="18"/>
               </w:rPr>
-              <w:t xml:space="preserve">ZCL_ZDPR_PDF</w:t>
+              <w:t xml:space="preserve">ZDPR_SD_ANALYTICS</w:t>
             </w:r>
           </w:p>
         </w:tc>
@@ -2394,7 +2554,7 @@
                 <w:sz w:val="18"/>
                 <w:szCs w:val="18"/>
               </w:rPr>
-              <w:t xml:space="preserve">ABAP class</w:t>
+              <w:t xml:space="preserve">Service definition</w:t>
             </w:r>
           </w:p>
         </w:tc>
@@ -2420,7 +2580,7 @@
                 <w:sz w:val="18"/>
                 <w:szCs w:val="18"/>
               </w:rPr>
-              <w:t xml:space="preserve">PDF generation via Adobe forms ZDPR_FRM_PRODUCTION / ZDPR_FRM_TARGETS (optional).</w:t>
+              <w:t xml:space="preserve">Exposes the performance query, cubes, interface views and the download entity over OData V4.</w:t>
             </w:r>
           </w:p>
         </w:tc>
@@ -2448,7 +2608,7 @@
                 <w:sz w:val="18"/>
                 <w:szCs w:val="18"/>
               </w:rPr>
-              <w:t xml:space="preserve">ZDPR_SD_ANALYTICS</w:t>
+              <w:t xml:space="preserve">ZDPR_SB_ANALYTICS_O4</w:t>
             </w:r>
           </w:p>
         </w:tc>
@@ -2474,7 +2634,7 @@
                 <w:sz w:val="18"/>
                 <w:szCs w:val="18"/>
               </w:rPr>
-              <w:t xml:space="preserve">Service definition</w:t>
+              <w:t xml:space="preserve">Service binding (created via ADT wizard, OData V4 – UI)</w:t>
             </w:r>
           </w:p>
         </w:tc>
@@ -2500,7 +2660,7 @@
                 <w:sz w:val="18"/>
                 <w:szCs w:val="18"/>
               </w:rPr>
-              <w:t xml:space="preserve">Exposes the performance query, cubes, interface views and the download entity over OData V4.</w:t>
+              <w:t xml:space="preserve">Source form shown for reference only — create with the wizard and Publish.</w:t>
             </w:r>
           </w:p>
         </w:tc>
@@ -2528,7 +2688,7 @@
                 <w:sz w:val="18"/>
                 <w:szCs w:val="18"/>
               </w:rPr>
-              <w:t xml:space="preserve">ZDPR_SB_ANALYTICS_O4</w:t>
+              <w:t xml:space="preserve">ZDPR_Q_BOEPD_TREND (DDLX)</w:t>
             </w:r>
           </w:p>
         </w:tc>
@@ -2554,7 +2714,7 @@
                 <w:sz w:val="18"/>
                 <w:szCs w:val="18"/>
               </w:rPr>
-              <w:t xml:space="preserve">Service binding (created via ADT wizard, OData V4 – UI)</w:t>
+              <w:t xml:space="preserve">Metadata extension</w:t>
             </w:r>
           </w:p>
         </w:tc>
@@ -2580,7 +2740,7 @@
                 <w:sz w:val="18"/>
                 <w:szCs w:val="18"/>
               </w:rPr>
-              <w:t xml:space="preserve">Source form shown for reference only — create with the wizard and Publish.</w:t>
+              <w:t xml:space="preserve">Line chart Actual vs BE Target, filters, table columns.</w:t>
             </w:r>
           </w:p>
         </w:tc>
@@ -2608,7 +2768,7 @@
                 <w:sz w:val="18"/>
                 <w:szCs w:val="18"/>
               </w:rPr>
-              <w:t xml:space="preserve">ZDPR_Q_BOEPD_TREND (DDLX)</w:t>
+              <w:t xml:space="preserve">ZDPR_Q_DAILY_TREND (DDLX)</w:t>
             </w:r>
           </w:p>
         </w:tc>
@@ -2660,7 +2820,7 @@
                 <w:sz w:val="18"/>
                 <w:szCs w:val="18"/>
               </w:rPr>
-              <w:t xml:space="preserve">Line chart Actual vs BE Target, filters, table columns.</w:t>
+              <w:t xml:space="preserve">Daily trend line chart and table.</w:t>
             </w:r>
           </w:p>
         </w:tc>
@@ -2688,7 +2848,7 @@
                 <w:sz w:val="18"/>
                 <w:szCs w:val="18"/>
               </w:rPr>
-              <w:t xml:space="preserve">ZDPR_Q_DAILY_TREND (DDLX)</w:t>
+              <w:t xml:space="preserve">ZDPR_Q_PROD_QUERY (DDLX)</w:t>
             </w:r>
           </w:p>
         </w:tc>
@@ -2740,7 +2900,7 @@
                 <w:sz w:val="18"/>
                 <w:szCs w:val="18"/>
               </w:rPr>
-              <w:t xml:space="preserve">Daily trend line chart and table.</w:t>
+              <w:t xml:space="preserve">Production records: filter bar, column chart, table.</w:t>
             </w:r>
           </w:p>
         </w:tc>
@@ -2768,7 +2928,7 @@
                 <w:sz w:val="18"/>
                 <w:szCs w:val="18"/>
               </w:rPr>
-              <w:t xml:space="preserve">ZDPR_Q_PROD_QUERY (DDLX)</w:t>
+              <w:t xml:space="preserve">ZDPR_Q_TARGET_QUERY (DDLX)</w:t>
             </w:r>
           </w:p>
         </w:tc>
@@ -2820,7 +2980,7 @@
                 <w:sz w:val="18"/>
                 <w:szCs w:val="18"/>
               </w:rPr>
-              <w:t xml:space="preserve">Production records: filter bar, column chart, table.</w:t>
+              <w:t xml:space="preserve">Target vs actual: bar chart, table with Achievement %.</w:t>
             </w:r>
           </w:p>
         </w:tc>
@@ -2848,7 +3008,7 @@
                 <w:sz w:val="18"/>
                 <w:szCs w:val="18"/>
               </w:rPr>
-              <w:t xml:space="preserve">ZDPR_Q_TARGET_QUERY (DDLX)</w:t>
+              <w:t xml:space="preserve">ZDPR_Q_PROD_PERF (DDLX)</w:t>
             </w:r>
           </w:p>
         </w:tc>
@@ -2900,86 +3060,6 @@
                 <w:sz w:val="18"/>
                 <w:szCs w:val="18"/>
               </w:rPr>
-              <w:t xml:space="preserve">Target vs actual: bar chart, table with Achievement %.</w:t>
-            </w:r>
-          </w:p>
-        </w:tc>
-      </w:tr>
-      <w:tr>
-        <w:tc>
-          <w:tcPr>
-            <w:tcW w:type="dxa" w:w="2500"/>
-            <w:shd w:fill="FFFFFF" w:val="clear"/>
-            <w:tcMar>
-              <w:top w:type="dxa" w:w="60"/>
-              <w:left w:type="dxa" w:w="100"/>
-              <w:bottom w:type="dxa" w:w="60"/>
-              <w:right w:type="dxa" w:w="100"/>
-            </w:tcMar>
-          </w:tcPr>
-          <w:p>
-            <w:pPr>
-              <w:spacing w:after="0"/>
-            </w:pPr>
-            <w:r>
-              <w:rPr>
-                <w:b w:val="false"/>
-                <w:bCs w:val="false"/>
-                <w:sz w:val="18"/>
-                <w:szCs w:val="18"/>
-              </w:rPr>
-              <w:t xml:space="preserve">ZDPR_Q_PROD_PERF (DDLX)</w:t>
-            </w:r>
-          </w:p>
-        </w:tc>
-        <w:tc>
-          <w:tcPr>
-            <w:tcW w:type="dxa" w:w="2600"/>
-            <w:shd w:fill="FFFFFF" w:val="clear"/>
-            <w:tcMar>
-              <w:top w:type="dxa" w:w="60"/>
-              <w:left w:type="dxa" w:w="100"/>
-              <w:bottom w:type="dxa" w:w="60"/>
-              <w:right w:type="dxa" w:w="100"/>
-            </w:tcMar>
-          </w:tcPr>
-          <w:p>
-            <w:pPr>
-              <w:spacing w:after="0"/>
-            </w:pPr>
-            <w:r>
-              <w:rPr>
-                <w:b w:val="false"/>
-                <w:bCs w:val="false"/>
-                <w:sz w:val="18"/>
-                <w:szCs w:val="18"/>
-              </w:rPr>
-              <w:t xml:space="preserve">Metadata extension</w:t>
-            </w:r>
-          </w:p>
-        </w:tc>
-        <w:tc>
-          <w:tcPr>
-            <w:tcW w:type="dxa" w:w="4260"/>
-            <w:shd w:fill="FFFFFF" w:val="clear"/>
-            <w:tcMar>
-              <w:top w:type="dxa" w:w="60"/>
-              <w:left w:type="dxa" w:w="100"/>
-              <w:bottom w:type="dxa" w:w="60"/>
-              <w:right w:type="dxa" w:w="100"/>
-            </w:tcMar>
-          </w:tcPr>
-          <w:p>
-            <w:pPr>
-              <w:spacing w:after="0"/>
-            </w:pPr>
-            <w:r>
-              <w:rPr>
-                <w:b w:val="false"/>
-                <w:bCs w:val="false"/>
-                <w:sz w:val="18"/>
-                <w:szCs w:val="18"/>
-              </w:rPr>
               <w:t xml:space="preserve">Production Performance table and Actual-vs-Target column chart.</w:t>
             </w:r>
           </w:p>
@@ -5363,7 +5443,7 @@
           <w:sz w:val="21"/>
           <w:szCs w:val="21"/>
         </w:rPr>
-        <w:t xml:space="preserve">Production targets (ZPRA_T_PRD_TAR) scaled like the classic report: TargetVolume (barrels / MMSCM), TargetBoe, conversion factor from ZPRA_T_TAR_CF, days in fiscal year.</w:t>
+        <w:t xml:space="preserve">Production targets (ZPRA_T_PRD_TAR) with ProductGroup as plain column.</w:t>
       </w:r>
     </w:p>
     <w:p>
@@ -5582,258 +5662,6 @@
           <w:sz w:val="15"/>
           <w:szCs w:val="15"/>
         </w:rPr>
-        <w:t xml:space="preserve">/* ── Production targets (ZPRA_T_PRD_TAR) ─────────────────────────────────────</w:t>
-      </w:r>
-    </w:p>
-    <w:p>
-      <w:pPr>
-        <w:pBdr>
-          <w:left w:val="single" w:color="8EA9DB" w:sz="12" w:space="6"/>
-        </w:pBdr>
-        <w:shd w:fill="F7F7F7" w:val="clear"/>
-        <w:spacing w:after="0" w:line="240"/>
-        <w:ind w:left="120" w:right="120"/>
-      </w:pPr>
-      <w:r>
-        <w:rPr>
-          <w:rFonts w:ascii="Consolas" w:cs="Consolas" w:eastAsia="Consolas" w:hAnsi="Consolas"/>
-          <w:sz w:val="15"/>
-          <w:szCs w:val="15"/>
-        </w:rPr>
-        <w:t xml:space="preserve"> * tar_qty is stored per fiscal month as MMT (oil family) / BCM (gas).</w:t>
-      </w:r>
-    </w:p>
-    <w:p>
-      <w:pPr>
-        <w:pBdr>
-          <w:left w:val="single" w:color="8EA9DB" w:sz="12" w:space="6"/>
-        </w:pBdr>
-        <w:shd w:fill="F7F7F7" w:val="clear"/>
-        <w:spacing w:after="0" w:line="240"/>
-        <w:ind w:left="120" w:right="120"/>
-      </w:pPr>
-      <w:r>
-        <w:rPr>
-          <w:rFonts w:ascii="Consolas" w:cs="Consolas" w:eastAsia="Consolas" w:hAnsi="Consolas"/>
-          <w:sz w:val="15"/>
-          <w:szCs w:val="15"/>
-        </w:rPr>
-        <w:t xml:space="preserve"> * The classic DPR report (FORM convert_target_units, BOPD/MMSCMD mode) scales</w:t>
-      </w:r>
-    </w:p>
-    <w:p>
-      <w:pPr>
-        <w:pBdr>
-          <w:left w:val="single" w:color="8EA9DB" w:sz="12" w:space="6"/>
-        </w:pBdr>
-        <w:shd w:fill="F7F7F7" w:val="clear"/>
-        <w:spacing w:after="0" w:line="240"/>
-        <w:ind w:left="120" w:right="120"/>
-      </w:pPr>
-      <w:r>
-        <w:rPr>
-          <w:rFonts w:ascii="Consolas" w:cs="Consolas" w:eastAsia="Consolas" w:hAnsi="Consolas"/>
-          <w:sz w:val="15"/>
-          <w:szCs w:val="15"/>
-        </w:rPr>
-        <w:t xml:space="preserve"> * it to a volume before use:</w:t>
-      </w:r>
-    </w:p>
-    <w:p>
-      <w:pPr>
-        <w:pBdr>
-          <w:left w:val="single" w:color="8EA9DB" w:sz="12" w:space="6"/>
-        </w:pBdr>
-        <w:shd w:fill="F7F7F7" w:val="clear"/>
-        <w:spacing w:after="0" w:line="240"/>
-        <w:ind w:left="120" w:right="120"/>
-      </w:pPr>
-      <w:r>
-        <w:rPr>
-          <w:rFonts w:ascii="Consolas" w:cs="Consolas" w:eastAsia="Consolas" w:hAnsi="Consolas"/>
-          <w:sz w:val="15"/>
-          <w:szCs w:val="15"/>
-        </w:rPr>
-        <w:t xml:space="preserve"> *   oil family : tar_qty * 1,000,000 * conv_factor   (MMT  -&gt; barrels, the</w:t>
-      </w:r>
-    </w:p>
-    <w:p>
-      <w:pPr>
-        <w:pBdr>
-          <w:left w:val="single" w:color="8EA9DB" w:sz="12" w:space="6"/>
-        </w:pBdr>
-        <w:shd w:fill="F7F7F7" w:val="clear"/>
-        <w:spacing w:after="0" w:line="240"/>
-        <w:ind w:left="120" w:right="120"/>
-      </w:pPr>
-      <w:r>
-        <w:rPr>
-          <w:rFonts w:ascii="Consolas" w:cs="Consolas" w:eastAsia="Consolas" w:hAnsi="Consolas"/>
-          <w:sz w:val="15"/>
-          <w:szCs w:val="15"/>
-        </w:rPr>
-        <w:t xml:space="preserve"> *                factor comes from ZPRA_T_TAR_CF for the target's fiscal year)</w:t>
-      </w:r>
-    </w:p>
-    <w:p>
-      <w:pPr>
-        <w:pBdr>
-          <w:left w:val="single" w:color="8EA9DB" w:sz="12" w:space="6"/>
-        </w:pBdr>
-        <w:shd w:fill="F7F7F7" w:val="clear"/>
-        <w:spacing w:after="0" w:line="240"/>
-        <w:ind w:left="120" w:right="120"/>
-      </w:pPr>
-      <w:r>
-        <w:rPr>
-          <w:rFonts w:ascii="Consolas" w:cs="Consolas" w:eastAsia="Consolas" w:hAnsi="Consolas"/>
-          <w:sz w:val="15"/>
-          <w:szCs w:val="15"/>
-        </w:rPr>
-        <w:t xml:space="preserve"> *   gas        : tar_qty * 1,000                     (BCM  -&gt; MMSCM)</w:t>
-      </w:r>
-    </w:p>
-    <w:p>
-      <w:pPr>
-        <w:pBdr>
-          <w:left w:val="single" w:color="8EA9DB" w:sz="12" w:space="6"/>
-        </w:pBdr>
-        <w:shd w:fill="F7F7F7" w:val="clear"/>
-        <w:spacing w:after="0" w:line="240"/>
-        <w:ind w:left="120" w:right="120"/>
-      </w:pPr>
-      <w:r>
-        <w:rPr>
-          <w:rFonts w:ascii="Consolas" w:cs="Consolas" w:eastAsia="Consolas" w:hAnsi="Consolas"/>
-          <w:sz w:val="15"/>
-          <w:szCs w:val="15"/>
-        </w:rPr>
-        <w:t xml:space="preserve"> *                and * 6290 on top for the BOE grand total</w:t>
-      </w:r>
-    </w:p>
-    <w:p>
-      <w:pPr>
-        <w:pBdr>
-          <w:left w:val="single" w:color="8EA9DB" w:sz="12" w:space="6"/>
-        </w:pBdr>
-        <w:shd w:fill="F7F7F7" w:val="clear"/>
-        <w:spacing w:after="0" w:line="240"/>
-        <w:ind w:left="120" w:right="120"/>
-      </w:pPr>
-      <w:r>
-        <w:rPr>
-          <w:rFonts w:ascii="Consolas" w:cs="Consolas" w:eastAsia="Consolas" w:hAnsi="Consolas"/>
-          <w:sz w:val="15"/>
-          <w:szCs w:val="15"/>
-        </w:rPr>
-        <w:t xml:space="preserve"> * Those scaled figures are exposed here as plain columns (TargetVolume /</w:t>
-      </w:r>
-    </w:p>
-    <w:p>
-      <w:pPr>
-        <w:pBdr>
-          <w:left w:val="single" w:color="8EA9DB" w:sz="12" w:space="6"/>
-        </w:pBdr>
-        <w:shd w:fill="F7F7F7" w:val="clear"/>
-        <w:spacing w:after="0" w:line="240"/>
-        <w:ind w:left="120" w:right="120"/>
-      </w:pPr>
-      <w:r>
-        <w:rPr>
-          <w:rFonts w:ascii="Consolas" w:cs="Consolas" w:eastAsia="Consolas" w:hAnsi="Consolas"/>
-          <w:sz w:val="15"/>
-          <w:szCs w:val="15"/>
-        </w:rPr>
-        <w:t xml:space="preserve"> * TargetBoe) so the aggregation views above only SUM plain fields.</w:t>
-      </w:r>
-    </w:p>
-    <w:p>
-      <w:pPr>
-        <w:pBdr>
-          <w:left w:val="single" w:color="8EA9DB" w:sz="12" w:space="6"/>
-        </w:pBdr>
-        <w:shd w:fill="F7F7F7" w:val="clear"/>
-        <w:spacing w:after="0" w:line="240"/>
-        <w:ind w:left="120" w:right="120"/>
-      </w:pPr>
-      <w:r>
-        <w:rPr>
-          <w:rFonts w:ascii="Consolas" w:cs="Consolas" w:eastAsia="Consolas" w:hAnsi="Consolas"/>
-          <w:sz w:val="15"/>
-          <w:szCs w:val="15"/>
-        </w:rPr>
-        <w:t xml:space="preserve"> * The fiscal year runs April..March: FiscalYearStart = 1 April gjahr and</w:t>
-      </w:r>
-    </w:p>
-    <w:p>
-      <w:pPr>
-        <w:pBdr>
-          <w:left w:val="single" w:color="8EA9DB" w:sz="12" w:space="6"/>
-        </w:pBdr>
-        <w:shd w:fill="F7F7F7" w:val="clear"/>
-        <w:spacing w:after="0" w:line="240"/>
-        <w:ind w:left="120" w:right="120"/>
-      </w:pPr>
-      <w:r>
-        <w:rPr>
-          <w:rFonts w:ascii="Consolas" w:cs="Consolas" w:eastAsia="Consolas" w:hAnsi="Consolas"/>
-          <w:sz w:val="15"/>
-          <w:szCs w:val="15"/>
-        </w:rPr>
-        <w:t xml:space="preserve"> * DaysInFiscalYear = 365 / 366 - the divisor the classic report uses to turn</w:t>
-      </w:r>
-    </w:p>
-    <w:p>
-      <w:pPr>
-        <w:pBdr>
-          <w:left w:val="single" w:color="8EA9DB" w:sz="12" w:space="6"/>
-        </w:pBdr>
-        <w:shd w:fill="F7F7F7" w:val="clear"/>
-        <w:spacing w:after="0" w:line="240"/>
-        <w:ind w:left="120" w:right="120"/>
-      </w:pPr>
-      <w:r>
-        <w:rPr>
-          <w:rFonts w:ascii="Consolas" w:cs="Consolas" w:eastAsia="Consolas" w:hAnsi="Consolas"/>
-          <w:sz w:val="15"/>
-          <w:szCs w:val="15"/>
-        </w:rPr>
-        <w:t xml:space="preserve"> * the annual target into the flat "BE Target" daily rate.</w:t>
-      </w:r>
-    </w:p>
-    <w:p>
-      <w:pPr>
-        <w:pBdr>
-          <w:left w:val="single" w:color="8EA9DB" w:sz="12" w:space="6"/>
-        </w:pBdr>
-        <w:shd w:fill="F7F7F7" w:val="clear"/>
-        <w:spacing w:after="0" w:line="240"/>
-        <w:ind w:left="120" w:right="120"/>
-      </w:pPr>
-      <w:r>
-        <w:rPr>
-          <w:rFonts w:ascii="Consolas" w:cs="Consolas" w:eastAsia="Consolas" w:hAnsi="Consolas"/>
-          <w:sz w:val="15"/>
-          <w:szCs w:val="15"/>
-        </w:rPr>
-        <w:t xml:space="preserve"> * ─────────────────────────────────────────────────────────────────────────── */</w:t>
-      </w:r>
-    </w:p>
-    <w:p>
-      <w:pPr>
-        <w:pBdr>
-          <w:left w:val="single" w:color="8EA9DB" w:sz="12" w:space="6"/>
-        </w:pBdr>
-        <w:shd w:fill="F7F7F7" w:val="clear"/>
-        <w:spacing w:after="0" w:line="240"/>
-        <w:ind w:left="120" w:right="120"/>
-      </w:pPr>
-      <w:r>
-        <w:rPr>
-          <w:rFonts w:ascii="Consolas" w:cs="Consolas" w:eastAsia="Consolas" w:hAnsi="Consolas"/>
-          <w:sz w:val="15"/>
-          <w:szCs w:val="15"/>
-        </w:rPr>
         <w:t xml:space="preserve">define view entity ZDPR_I_TARGET</w:t>
       </w:r>
     </w:p>
@@ -5888,115 +5716,25 @@
           <w:sz w:val="15"/>
           <w:szCs w:val="15"/>
         </w:rPr>
-        <w:t xml:space="preserve">  /* conversion factor of the target's fiscal year (classic: gt_zpra_t_tar_cf</w:t>
-      </w:r>
-    </w:p>
-    <w:p>
-      <w:pPr>
-        <w:pBdr>
-          <w:left w:val="single" w:color="8EA9DB" w:sz="12" w:space="6"/>
-        </w:pBdr>
-        <w:shd w:fill="F7F7F7" w:val="clear"/>
-        <w:spacing w:after="0" w:line="240"/>
-        <w:ind w:left="120" w:right="120"/>
-      </w:pPr>
-      <w:r>
-        <w:rPr>
-          <w:rFonts w:ascii="Consolas" w:cs="Consolas" w:eastAsia="Consolas" w:hAnsi="Consolas"/>
-          <w:sz w:val="15"/>
-          <w:szCs w:val="15"/>
-        </w:rPr>
-        <w:t xml:space="preserve">     read with gjahr / asset / block / product) */</w:t>
-      </w:r>
-    </w:p>
-    <w:p>
-      <w:pPr>
-        <w:pBdr>
-          <w:left w:val="single" w:color="8EA9DB" w:sz="12" w:space="6"/>
-        </w:pBdr>
-        <w:shd w:fill="F7F7F7" w:val="clear"/>
-        <w:spacing w:after="0" w:line="240"/>
-        <w:ind w:left="120" w:right="120"/>
-      </w:pPr>
-      <w:r>
-        <w:rPr>
-          <w:rFonts w:ascii="Consolas" w:cs="Consolas" w:eastAsia="Consolas" w:hAnsi="Consolas"/>
-          <w:sz w:val="15"/>
-          <w:szCs w:val="15"/>
-        </w:rPr>
-        <w:t xml:space="preserve">  left outer join zpra_t_tar_cf as Cf</w:t>
-      </w:r>
-    </w:p>
-    <w:p>
-      <w:pPr>
-        <w:pBdr>
-          <w:left w:val="single" w:color="8EA9DB" w:sz="12" w:space="6"/>
-        </w:pBdr>
-        <w:shd w:fill="F7F7F7" w:val="clear"/>
-        <w:spacing w:after="0" w:line="240"/>
-        <w:ind w:left="120" w:right="120"/>
-      </w:pPr>
-      <w:r>
-        <w:rPr>
-          <w:rFonts w:ascii="Consolas" w:cs="Consolas" w:eastAsia="Consolas" w:hAnsi="Consolas"/>
-          <w:sz w:val="15"/>
-          <w:szCs w:val="15"/>
-        </w:rPr>
-        <w:t xml:space="preserve">    on  Cf.gjahr   = PrdTar.gjahr</w:t>
-      </w:r>
-    </w:p>
-    <w:p>
-      <w:pPr>
-        <w:pBdr>
-          <w:left w:val="single" w:color="8EA9DB" w:sz="12" w:space="6"/>
-        </w:pBdr>
-        <w:shd w:fill="F7F7F7" w:val="clear"/>
-        <w:spacing w:after="0" w:line="240"/>
-        <w:ind w:left="120" w:right="120"/>
-      </w:pPr>
-      <w:r>
-        <w:rPr>
-          <w:rFonts w:ascii="Consolas" w:cs="Consolas" w:eastAsia="Consolas" w:hAnsi="Consolas"/>
-          <w:sz w:val="15"/>
-          <w:szCs w:val="15"/>
-        </w:rPr>
-        <w:t xml:space="preserve">    and Cf.asset   = PrdTar.asset</w:t>
-      </w:r>
-    </w:p>
-    <w:p>
-      <w:pPr>
-        <w:pBdr>
-          <w:left w:val="single" w:color="8EA9DB" w:sz="12" w:space="6"/>
-        </w:pBdr>
-        <w:shd w:fill="F7F7F7" w:val="clear"/>
-        <w:spacing w:after="0" w:line="240"/>
-        <w:ind w:left="120" w:right="120"/>
-      </w:pPr>
-      <w:r>
-        <w:rPr>
-          <w:rFonts w:ascii="Consolas" w:cs="Consolas" w:eastAsia="Consolas" w:hAnsi="Consolas"/>
-          <w:sz w:val="15"/>
-          <w:szCs w:val="15"/>
-        </w:rPr>
-        <w:t xml:space="preserve">    and Cf.block   = PrdTar.block</w:t>
-      </w:r>
-    </w:p>
-    <w:p>
-      <w:pPr>
-        <w:pBdr>
-          <w:left w:val="single" w:color="8EA9DB" w:sz="12" w:space="6"/>
-        </w:pBdr>
-        <w:shd w:fill="F7F7F7" w:val="clear"/>
-        <w:spacing w:after="0" w:line="240"/>
-        <w:ind w:left="120" w:right="120"/>
-      </w:pPr>
-      <w:r>
-        <w:rPr>
-          <w:rFonts w:ascii="Consolas" w:cs="Consolas" w:eastAsia="Consolas" w:hAnsi="Consolas"/>
-          <w:sz w:val="15"/>
-          <w:szCs w:val="15"/>
-        </w:rPr>
-        <w:t xml:space="preserve">    and Cf.product = PrdTar.product</w:t>
+        <w:t xml:space="preserve">  association [0..1] to zoiu_pr_dn as _AssetText</w:t>
+      </w:r>
+    </w:p>
+    <w:p>
+      <w:pPr>
+        <w:pBdr>
+          <w:left w:val="single" w:color="8EA9DB" w:sz="12" w:space="6"/>
+        </w:pBdr>
+        <w:shd w:fill="F7F7F7" w:val="clear"/>
+        <w:spacing w:after="0" w:line="240"/>
+        <w:ind w:left="120" w:right="120"/>
+      </w:pPr>
+      <w:r>
+        <w:rPr>
+          <w:rFonts w:ascii="Consolas" w:cs="Consolas" w:eastAsia="Consolas" w:hAnsi="Consolas"/>
+          <w:sz w:val="15"/>
+          <w:szCs w:val="15"/>
+        </w:rPr>
+        <w:t xml:space="preserve">    on $projection.Asset = _AssetText.dn_no</w:t>
       </w:r>
     </w:p>
     <w:p>
@@ -6032,25 +5770,133 @@
           <w:sz w:val="15"/>
           <w:szCs w:val="15"/>
         </w:rPr>
-        <w:t xml:space="preserve">  association [0..1] to zoiu_pr_dn as _AssetText</w:t>
-      </w:r>
-    </w:p>
-    <w:p>
-      <w:pPr>
-        <w:pBdr>
-          <w:left w:val="single" w:color="8EA9DB" w:sz="12" w:space="6"/>
-        </w:pBdr>
-        <w:shd w:fill="F7F7F7" w:val="clear"/>
-        <w:spacing w:after="0" w:line="240"/>
-        <w:ind w:left="120" w:right="120"/>
-      </w:pPr>
-      <w:r>
-        <w:rPr>
-          <w:rFonts w:ascii="Consolas" w:cs="Consolas" w:eastAsia="Consolas" w:hAnsi="Consolas"/>
-          <w:sz w:val="15"/>
-          <w:szCs w:val="15"/>
-        </w:rPr>
-        <w:t xml:space="preserve">    on $projection.Asset = _AssetText.dn_no</w:t>
+        <w:t xml:space="preserve">{</w:t>
+      </w:r>
+    </w:p>
+    <w:p>
+      <w:pPr>
+        <w:pBdr>
+          <w:left w:val="single" w:color="8EA9DB" w:sz="12" w:space="6"/>
+        </w:pBdr>
+        <w:shd w:fill="F7F7F7" w:val="clear"/>
+        <w:spacing w:after="0" w:line="240"/>
+        <w:ind w:left="120" w:right="120"/>
+      </w:pPr>
+      <w:r>
+        <w:rPr>
+          <w:rFonts w:ascii="Consolas" w:cs="Consolas" w:eastAsia="Consolas" w:hAnsi="Consolas"/>
+          <w:sz w:val="15"/>
+          <w:szCs w:val="15"/>
+        </w:rPr>
+        <w:t xml:space="preserve">  key PrdTar.tar_code                     as TargetCode,</w:t>
+      </w:r>
+    </w:p>
+    <w:p>
+      <w:pPr>
+        <w:pBdr>
+          <w:left w:val="single" w:color="8EA9DB" w:sz="12" w:space="6"/>
+        </w:pBdr>
+        <w:shd w:fill="F7F7F7" w:val="clear"/>
+        <w:spacing w:after="0" w:line="240"/>
+        <w:ind w:left="120" w:right="120"/>
+      </w:pPr>
+      <w:r>
+        <w:rPr>
+          <w:rFonts w:ascii="Consolas" w:cs="Consolas" w:eastAsia="Consolas" w:hAnsi="Consolas"/>
+          <w:sz w:val="15"/>
+          <w:szCs w:val="15"/>
+        </w:rPr>
+        <w:t xml:space="preserve">  key PrdTar.gjahr                        as FiscalYear,</w:t>
+      </w:r>
+    </w:p>
+    <w:p>
+      <w:pPr>
+        <w:pBdr>
+          <w:left w:val="single" w:color="8EA9DB" w:sz="12" w:space="6"/>
+        </w:pBdr>
+        <w:shd w:fill="F7F7F7" w:val="clear"/>
+        <w:spacing w:after="0" w:line="240"/>
+        <w:ind w:left="120" w:right="120"/>
+      </w:pPr>
+      <w:r>
+        <w:rPr>
+          <w:rFonts w:ascii="Consolas" w:cs="Consolas" w:eastAsia="Consolas" w:hAnsi="Consolas"/>
+          <w:sz w:val="15"/>
+          <w:szCs w:val="15"/>
+        </w:rPr>
+        <w:t xml:space="preserve">  key PrdTar.monat                        as FiscalPeriod,</w:t>
+      </w:r>
+    </w:p>
+    <w:p>
+      <w:pPr>
+        <w:pBdr>
+          <w:left w:val="single" w:color="8EA9DB" w:sz="12" w:space="6"/>
+        </w:pBdr>
+        <w:shd w:fill="F7F7F7" w:val="clear"/>
+        <w:spacing w:after="0" w:line="240"/>
+        <w:ind w:left="120" w:right="120"/>
+      </w:pPr>
+      <w:r>
+        <w:rPr>
+          <w:rFonts w:ascii="Consolas" w:cs="Consolas" w:eastAsia="Consolas" w:hAnsi="Consolas"/>
+          <w:sz w:val="15"/>
+          <w:szCs w:val="15"/>
+        </w:rPr>
+        <w:t xml:space="preserve">  key PrdTar.asset                        as Asset,</w:t>
+      </w:r>
+    </w:p>
+    <w:p>
+      <w:pPr>
+        <w:pBdr>
+          <w:left w:val="single" w:color="8EA9DB" w:sz="12" w:space="6"/>
+        </w:pBdr>
+        <w:shd w:fill="F7F7F7" w:val="clear"/>
+        <w:spacing w:after="0" w:line="240"/>
+        <w:ind w:left="120" w:right="120"/>
+      </w:pPr>
+      <w:r>
+        <w:rPr>
+          <w:rFonts w:ascii="Consolas" w:cs="Consolas" w:eastAsia="Consolas" w:hAnsi="Consolas"/>
+          <w:sz w:val="15"/>
+          <w:szCs w:val="15"/>
+        </w:rPr>
+        <w:t xml:space="preserve">  key PrdTar.block                        as Block,</w:t>
+      </w:r>
+    </w:p>
+    <w:p>
+      <w:pPr>
+        <w:pBdr>
+          <w:left w:val="single" w:color="8EA9DB" w:sz="12" w:space="6"/>
+        </w:pBdr>
+        <w:shd w:fill="F7F7F7" w:val="clear"/>
+        <w:spacing w:after="0" w:line="240"/>
+        <w:ind w:left="120" w:right="120"/>
+      </w:pPr>
+      <w:r>
+        <w:rPr>
+          <w:rFonts w:ascii="Consolas" w:cs="Consolas" w:eastAsia="Consolas" w:hAnsi="Consolas"/>
+          <w:sz w:val="15"/>
+          <w:szCs w:val="15"/>
+        </w:rPr>
+        <w:t xml:space="preserve">  key PrdTar.product                      as Product,</w:t>
+      </w:r>
+    </w:p>
+    <w:p>
+      <w:pPr>
+        <w:pBdr>
+          <w:left w:val="single" w:color="8EA9DB" w:sz="12" w:space="6"/>
+        </w:pBdr>
+        <w:shd w:fill="F7F7F7" w:val="clear"/>
+        <w:spacing w:after="0" w:line="240"/>
+        <w:ind w:left="120" w:right="120"/>
+      </w:pPr>
+      <w:r>
+        <w:rPr>
+          <w:rFonts w:ascii="Consolas" w:cs="Consolas" w:eastAsia="Consolas" w:hAnsi="Consolas"/>
+          <w:sz w:val="15"/>
+          <w:szCs w:val="15"/>
+        </w:rPr>
+        <w:t xml:space="preserve">  key PrdTar.prod_vl_type_cd              as VolumeType,</w:t>
       </w:r>
     </w:p>
     <w:p>
@@ -6086,133 +5932,43 @@
           <w:sz w:val="15"/>
           <w:szCs w:val="15"/>
         </w:rPr>
-        <w:t xml:space="preserve">{</w:t>
-      </w:r>
-    </w:p>
-    <w:p>
-      <w:pPr>
-        <w:pBdr>
-          <w:left w:val="single" w:color="8EA9DB" w:sz="12" w:space="6"/>
-        </w:pBdr>
-        <w:shd w:fill="F7F7F7" w:val="clear"/>
-        <w:spacing w:after="0" w:line="240"/>
-        <w:ind w:left="120" w:right="120"/>
-      </w:pPr>
-      <w:r>
-        <w:rPr>
-          <w:rFonts w:ascii="Consolas" w:cs="Consolas" w:eastAsia="Consolas" w:hAnsi="Consolas"/>
-          <w:sz w:val="15"/>
-          <w:szCs w:val="15"/>
-        </w:rPr>
-        <w:t xml:space="preserve">  key PrdTar.tar_code                     as TargetCode,</w:t>
-      </w:r>
-    </w:p>
-    <w:p>
-      <w:pPr>
-        <w:pBdr>
-          <w:left w:val="single" w:color="8EA9DB" w:sz="12" w:space="6"/>
-        </w:pBdr>
-        <w:shd w:fill="F7F7F7" w:val="clear"/>
-        <w:spacing w:after="0" w:line="240"/>
-        <w:ind w:left="120" w:right="120"/>
-      </w:pPr>
-      <w:r>
-        <w:rPr>
-          <w:rFonts w:ascii="Consolas" w:cs="Consolas" w:eastAsia="Consolas" w:hAnsi="Consolas"/>
-          <w:sz w:val="15"/>
-          <w:szCs w:val="15"/>
-        </w:rPr>
-        <w:t xml:space="preserve">  key PrdTar.gjahr                        as FiscalYear,</w:t>
-      </w:r>
-    </w:p>
-    <w:p>
-      <w:pPr>
-        <w:pBdr>
-          <w:left w:val="single" w:color="8EA9DB" w:sz="12" w:space="6"/>
-        </w:pBdr>
-        <w:shd w:fill="F7F7F7" w:val="clear"/>
-        <w:spacing w:after="0" w:line="240"/>
-        <w:ind w:left="120" w:right="120"/>
-      </w:pPr>
-      <w:r>
-        <w:rPr>
-          <w:rFonts w:ascii="Consolas" w:cs="Consolas" w:eastAsia="Consolas" w:hAnsi="Consolas"/>
-          <w:sz w:val="15"/>
-          <w:szCs w:val="15"/>
-        </w:rPr>
-        <w:t xml:space="preserve">  key PrdTar.monat                        as FiscalPeriod,</w:t>
-      </w:r>
-    </w:p>
-    <w:p>
-      <w:pPr>
-        <w:pBdr>
-          <w:left w:val="single" w:color="8EA9DB" w:sz="12" w:space="6"/>
-        </w:pBdr>
-        <w:shd w:fill="F7F7F7" w:val="clear"/>
-        <w:spacing w:after="0" w:line="240"/>
-        <w:ind w:left="120" w:right="120"/>
-      </w:pPr>
-      <w:r>
-        <w:rPr>
-          <w:rFonts w:ascii="Consolas" w:cs="Consolas" w:eastAsia="Consolas" w:hAnsi="Consolas"/>
-          <w:sz w:val="15"/>
-          <w:szCs w:val="15"/>
-        </w:rPr>
-        <w:t xml:space="preserve">  key PrdTar.asset                        as Asset,</w:t>
-      </w:r>
-    </w:p>
-    <w:p>
-      <w:pPr>
-        <w:pBdr>
-          <w:left w:val="single" w:color="8EA9DB" w:sz="12" w:space="6"/>
-        </w:pBdr>
-        <w:shd w:fill="F7F7F7" w:val="clear"/>
-        <w:spacing w:after="0" w:line="240"/>
-        <w:ind w:left="120" w:right="120"/>
-      </w:pPr>
-      <w:r>
-        <w:rPr>
-          <w:rFonts w:ascii="Consolas" w:cs="Consolas" w:eastAsia="Consolas" w:hAnsi="Consolas"/>
-          <w:sz w:val="15"/>
-          <w:szCs w:val="15"/>
-        </w:rPr>
-        <w:t xml:space="preserve">  key PrdTar.block                        as Block,</w:t>
-      </w:r>
-    </w:p>
-    <w:p>
-      <w:pPr>
-        <w:pBdr>
-          <w:left w:val="single" w:color="8EA9DB" w:sz="12" w:space="6"/>
-        </w:pBdr>
-        <w:shd w:fill="F7F7F7" w:val="clear"/>
-        <w:spacing w:after="0" w:line="240"/>
-        <w:ind w:left="120" w:right="120"/>
-      </w:pPr>
-      <w:r>
-        <w:rPr>
-          <w:rFonts w:ascii="Consolas" w:cs="Consolas" w:eastAsia="Consolas" w:hAnsi="Consolas"/>
-          <w:sz w:val="15"/>
-          <w:szCs w:val="15"/>
-        </w:rPr>
-        <w:t xml:space="preserve">  key PrdTar.product                      as Product,</w:t>
-      </w:r>
-    </w:p>
-    <w:p>
-      <w:pPr>
-        <w:pBdr>
-          <w:left w:val="single" w:color="8EA9DB" w:sz="12" w:space="6"/>
-        </w:pBdr>
-        <w:shd w:fill="F7F7F7" w:val="clear"/>
-        <w:spacing w:after="0" w:line="240"/>
-        <w:ind w:left="120" w:right="120"/>
-      </w:pPr>
-      <w:r>
-        <w:rPr>
-          <w:rFonts w:ascii="Consolas" w:cs="Consolas" w:eastAsia="Consolas" w:hAnsi="Consolas"/>
-          <w:sz w:val="15"/>
-          <w:szCs w:val="15"/>
-        </w:rPr>
-        <w:t xml:space="preserve">  key PrdTar.prod_vl_type_cd              as VolumeType,</w:t>
+        <w:t xml:space="preserve">      @Semantics.quantity.unitOfMeasure: 'TargetUom'</w:t>
+      </w:r>
+    </w:p>
+    <w:p>
+      <w:pPr>
+        <w:pBdr>
+          <w:left w:val="single" w:color="8EA9DB" w:sz="12" w:space="6"/>
+        </w:pBdr>
+        <w:shd w:fill="F7F7F7" w:val="clear"/>
+        <w:spacing w:after="0" w:line="240"/>
+        <w:ind w:left="120" w:right="120"/>
+      </w:pPr>
+      <w:r>
+        <w:rPr>
+          <w:rFonts w:ascii="Consolas" w:cs="Consolas" w:eastAsia="Consolas" w:hAnsi="Consolas"/>
+          <w:sz w:val="15"/>
+          <w:szCs w:val="15"/>
+        </w:rPr>
+        <w:t xml:space="preserve">      PrdTar.tar_qty                      as TargetQty,</w:t>
+      </w:r>
+    </w:p>
+    <w:p>
+      <w:pPr>
+        <w:pBdr>
+          <w:left w:val="single" w:color="8EA9DB" w:sz="12" w:space="6"/>
+        </w:pBdr>
+        <w:shd w:fill="F7F7F7" w:val="clear"/>
+        <w:spacing w:after="0" w:line="240"/>
+        <w:ind w:left="120" w:right="120"/>
+      </w:pPr>
+      <w:r>
+        <w:rPr>
+          <w:rFonts w:ascii="Consolas" w:cs="Consolas" w:eastAsia="Consolas" w:hAnsi="Consolas"/>
+          <w:sz w:val="15"/>
+          <w:szCs w:val="15"/>
+        </w:rPr>
+        <w:t xml:space="preserve">      PrdTar.uom                          as TargetUom,</w:t>
       </w:r>
     </w:p>
     <w:p>
@@ -6266,25 +6022,7 @@
           <w:sz w:val="15"/>
           <w:szCs w:val="15"/>
         </w:rPr>
-        <w:t xml:space="preserve">      PrdTar.tar_qty                      as TargetQty,</w:t>
-      </w:r>
-    </w:p>
-    <w:p>
-      <w:pPr>
-        <w:pBdr>
-          <w:left w:val="single" w:color="8EA9DB" w:sz="12" w:space="6"/>
-        </w:pBdr>
-        <w:shd w:fill="F7F7F7" w:val="clear"/>
-        <w:spacing w:after="0" w:line="240"/>
-        <w:ind w:left="120" w:right="120"/>
-      </w:pPr>
-      <w:r>
-        <w:rPr>
-          <w:rFonts w:ascii="Consolas" w:cs="Consolas" w:eastAsia="Consolas" w:hAnsi="Consolas"/>
-          <w:sz w:val="15"/>
-          <w:szCs w:val="15"/>
-        </w:rPr>
-        <w:t xml:space="preserve">      PrdTar.uom                          as TargetUom,</w:t>
+        <w:t xml:space="preserve">      PrdTar.tar_qty                     as TargetQty2,</w:t>
       </w:r>
     </w:p>
     <w:p>
@@ -6320,25 +6058,169 @@
           <w:sz w:val="15"/>
           <w:szCs w:val="15"/>
         </w:rPr>
-        <w:t xml:space="preserve">      @Semantics.quantity.unitOfMeasure: 'TargetUom'</w:t>
-      </w:r>
-    </w:p>
-    <w:p>
-      <w:pPr>
-        <w:pBdr>
-          <w:left w:val="single" w:color="8EA9DB" w:sz="12" w:space="6"/>
-        </w:pBdr>
-        <w:shd w:fill="F7F7F7" w:val="clear"/>
-        <w:spacing w:after="0" w:line="240"/>
-        <w:ind w:left="120" w:right="120"/>
-      </w:pPr>
-      <w:r>
-        <w:rPr>
-          <w:rFonts w:ascii="Consolas" w:cs="Consolas" w:eastAsia="Consolas" w:hAnsi="Consolas"/>
-          <w:sz w:val="15"/>
-          <w:szCs w:val="15"/>
-        </w:rPr>
-        <w:t xml:space="preserve">      PrdTar.tar_qty                     as TargetQty2,</w:t>
+        <w:t xml:space="preserve">      /* Target type description */</w:t>
+      </w:r>
+    </w:p>
+    <w:p>
+      <w:pPr>
+        <w:pBdr>
+          <w:left w:val="single" w:color="8EA9DB" w:sz="12" w:space="6"/>
+        </w:pBdr>
+        <w:shd w:fill="F7F7F7" w:val="clear"/>
+        <w:spacing w:after="0" w:line="240"/>
+        <w:ind w:left="120" w:right="120"/>
+      </w:pPr>
+      <w:r>
+        <w:rPr>
+          <w:rFonts w:ascii="Consolas" w:cs="Consolas" w:eastAsia="Consolas" w:hAnsi="Consolas"/>
+          <w:sz w:val="15"/>
+          <w:szCs w:val="15"/>
+        </w:rPr>
+        <w:t xml:space="preserve">      case PrdTar.tar_code</w:t>
+      </w:r>
+    </w:p>
+    <w:p>
+      <w:pPr>
+        <w:pBdr>
+          <w:left w:val="single" w:color="8EA9DB" w:sz="12" w:space="6"/>
+        </w:pBdr>
+        <w:shd w:fill="F7F7F7" w:val="clear"/>
+        <w:spacing w:after="0" w:line="240"/>
+        <w:ind w:left="120" w:right="120"/>
+      </w:pPr>
+      <w:r>
+        <w:rPr>
+          <w:rFonts w:ascii="Consolas" w:cs="Consolas" w:eastAsia="Consolas" w:hAnsi="Consolas"/>
+          <w:sz w:val="15"/>
+          <w:szCs w:val="15"/>
+        </w:rPr>
+        <w:t xml:space="preserve">        when 'TAR_BE' then 'Budget Estimate'</w:t>
+      </w:r>
+    </w:p>
+    <w:p>
+      <w:pPr>
+        <w:pBdr>
+          <w:left w:val="single" w:color="8EA9DB" w:sz="12" w:space="6"/>
+        </w:pBdr>
+        <w:shd w:fill="F7F7F7" w:val="clear"/>
+        <w:spacing w:after="0" w:line="240"/>
+        <w:ind w:left="120" w:right="120"/>
+      </w:pPr>
+      <w:r>
+        <w:rPr>
+          <w:rFonts w:ascii="Consolas" w:cs="Consolas" w:eastAsia="Consolas" w:hAnsi="Consolas"/>
+          <w:sz w:val="15"/>
+          <w:szCs w:val="15"/>
+        </w:rPr>
+        <w:t xml:space="preserve">        when 'TAR_IN' then 'Internal Target'</w:t>
+      </w:r>
+    </w:p>
+    <w:p>
+      <w:pPr>
+        <w:pBdr>
+          <w:left w:val="single" w:color="8EA9DB" w:sz="12" w:space="6"/>
+        </w:pBdr>
+        <w:shd w:fill="F7F7F7" w:val="clear"/>
+        <w:spacing w:after="0" w:line="240"/>
+        <w:ind w:left="120" w:right="120"/>
+      </w:pPr>
+      <w:r>
+        <w:rPr>
+          <w:rFonts w:ascii="Consolas" w:cs="Consolas" w:eastAsia="Consolas" w:hAnsi="Consolas"/>
+          <w:sz w:val="15"/>
+          <w:szCs w:val="15"/>
+        </w:rPr>
+        <w:t xml:space="preserve">        when 'TAR_EX' then 'MOU Excellent'</w:t>
+      </w:r>
+    </w:p>
+    <w:p>
+      <w:pPr>
+        <w:pBdr>
+          <w:left w:val="single" w:color="8EA9DB" w:sz="12" w:space="6"/>
+        </w:pBdr>
+        <w:shd w:fill="F7F7F7" w:val="clear"/>
+        <w:spacing w:after="0" w:line="240"/>
+        <w:ind w:left="120" w:right="120"/>
+      </w:pPr>
+      <w:r>
+        <w:rPr>
+          <w:rFonts w:ascii="Consolas" w:cs="Consolas" w:eastAsia="Consolas" w:hAnsi="Consolas"/>
+          <w:sz w:val="15"/>
+          <w:szCs w:val="15"/>
+        </w:rPr>
+        <w:t xml:space="preserve">        when 'TAR_VG' then 'MOU Very Good'</w:t>
+      </w:r>
+    </w:p>
+    <w:p>
+      <w:pPr>
+        <w:pBdr>
+          <w:left w:val="single" w:color="8EA9DB" w:sz="12" w:space="6"/>
+        </w:pBdr>
+        <w:shd w:fill="F7F7F7" w:val="clear"/>
+        <w:spacing w:after="0" w:line="240"/>
+        <w:ind w:left="120" w:right="120"/>
+      </w:pPr>
+      <w:r>
+        <w:rPr>
+          <w:rFonts w:ascii="Consolas" w:cs="Consolas" w:eastAsia="Consolas" w:hAnsi="Consolas"/>
+          <w:sz w:val="15"/>
+          <w:szCs w:val="15"/>
+        </w:rPr>
+        <w:t xml:space="preserve">        when 'TAR_PC' then 'Physical Control'</w:t>
+      </w:r>
+    </w:p>
+    <w:p>
+      <w:pPr>
+        <w:pBdr>
+          <w:left w:val="single" w:color="8EA9DB" w:sz="12" w:space="6"/>
+        </w:pBdr>
+        <w:shd w:fill="F7F7F7" w:val="clear"/>
+        <w:spacing w:after="0" w:line="240"/>
+        <w:ind w:left="120" w:right="120"/>
+      </w:pPr>
+      <w:r>
+        <w:rPr>
+          <w:rFonts w:ascii="Consolas" w:cs="Consolas" w:eastAsia="Consolas" w:hAnsi="Consolas"/>
+          <w:sz w:val="15"/>
+          <w:szCs w:val="15"/>
+        </w:rPr>
+        <w:t xml:space="preserve">        when 'TAR_RE' then 'Revised Estimate'</w:t>
+      </w:r>
+    </w:p>
+    <w:p>
+      <w:pPr>
+        <w:pBdr>
+          <w:left w:val="single" w:color="8EA9DB" w:sz="12" w:space="6"/>
+        </w:pBdr>
+        <w:shd w:fill="F7F7F7" w:val="clear"/>
+        <w:spacing w:after="0" w:line="240"/>
+        <w:ind w:left="120" w:right="120"/>
+      </w:pPr>
+      <w:r>
+        <w:rPr>
+          <w:rFonts w:ascii="Consolas" w:cs="Consolas" w:eastAsia="Consolas" w:hAnsi="Consolas"/>
+          <w:sz w:val="15"/>
+          <w:szCs w:val="15"/>
+        </w:rPr>
+        <w:t xml:space="preserve">        else PrdTar.tar_code</w:t>
+      </w:r>
+    </w:p>
+    <w:p>
+      <w:pPr>
+        <w:pBdr>
+          <w:left w:val="single" w:color="8EA9DB" w:sz="12" w:space="6"/>
+        </w:pBdr>
+        <w:shd w:fill="F7F7F7" w:val="clear"/>
+        <w:spacing w:after="0" w:line="240"/>
+        <w:ind w:left="120" w:right="120"/>
+      </w:pPr>
+      <w:r>
+        <w:rPr>
+          <w:rFonts w:ascii="Consolas" w:cs="Consolas" w:eastAsia="Consolas" w:hAnsi="Consolas"/>
+          <w:sz w:val="15"/>
+          <w:szCs w:val="15"/>
+        </w:rPr>
+        <w:t xml:space="preserve">      end                                 as TargetTypeDescription,</w:t>
       </w:r>
     </w:p>
     <w:p>
@@ -6374,169 +6256,115 @@
           <w:sz w:val="15"/>
           <w:szCs w:val="15"/>
         </w:rPr>
-        <w:t xml:space="preserve">      /* Target type description */</w:t>
-      </w:r>
-    </w:p>
-    <w:p>
-      <w:pPr>
-        <w:pBdr>
-          <w:left w:val="single" w:color="8EA9DB" w:sz="12" w:space="6"/>
-        </w:pBdr>
-        <w:shd w:fill="F7F7F7" w:val="clear"/>
-        <w:spacing w:after="0" w:line="240"/>
-        <w:ind w:left="120" w:right="120"/>
-      </w:pPr>
-      <w:r>
-        <w:rPr>
-          <w:rFonts w:ascii="Consolas" w:cs="Consolas" w:eastAsia="Consolas" w:hAnsi="Consolas"/>
-          <w:sz w:val="15"/>
-          <w:szCs w:val="15"/>
-        </w:rPr>
-        <w:t xml:space="preserve">      case PrdTar.tar_code</w:t>
-      </w:r>
-    </w:p>
-    <w:p>
-      <w:pPr>
-        <w:pBdr>
-          <w:left w:val="single" w:color="8EA9DB" w:sz="12" w:space="6"/>
-        </w:pBdr>
-        <w:shd w:fill="F7F7F7" w:val="clear"/>
-        <w:spacing w:after="0" w:line="240"/>
-        <w:ind w:left="120" w:right="120"/>
-      </w:pPr>
-      <w:r>
-        <w:rPr>
-          <w:rFonts w:ascii="Consolas" w:cs="Consolas" w:eastAsia="Consolas" w:hAnsi="Consolas"/>
-          <w:sz w:val="15"/>
-          <w:szCs w:val="15"/>
-        </w:rPr>
-        <w:t xml:space="preserve">        when 'TAR_BE' then 'Budget Estimate'</w:t>
-      </w:r>
-    </w:p>
-    <w:p>
-      <w:pPr>
-        <w:pBdr>
-          <w:left w:val="single" w:color="8EA9DB" w:sz="12" w:space="6"/>
-        </w:pBdr>
-        <w:shd w:fill="F7F7F7" w:val="clear"/>
-        <w:spacing w:after="0" w:line="240"/>
-        <w:ind w:left="120" w:right="120"/>
-      </w:pPr>
-      <w:r>
-        <w:rPr>
-          <w:rFonts w:ascii="Consolas" w:cs="Consolas" w:eastAsia="Consolas" w:hAnsi="Consolas"/>
-          <w:sz w:val="15"/>
-          <w:szCs w:val="15"/>
-        </w:rPr>
-        <w:t xml:space="preserve">        when 'TAR_IN' then 'Internal Target'</w:t>
-      </w:r>
-    </w:p>
-    <w:p>
-      <w:pPr>
-        <w:pBdr>
-          <w:left w:val="single" w:color="8EA9DB" w:sz="12" w:space="6"/>
-        </w:pBdr>
-        <w:shd w:fill="F7F7F7" w:val="clear"/>
-        <w:spacing w:after="0" w:line="240"/>
-        <w:ind w:left="120" w:right="120"/>
-      </w:pPr>
-      <w:r>
-        <w:rPr>
-          <w:rFonts w:ascii="Consolas" w:cs="Consolas" w:eastAsia="Consolas" w:hAnsi="Consolas"/>
-          <w:sz w:val="15"/>
-          <w:szCs w:val="15"/>
-        </w:rPr>
-        <w:t xml:space="preserve">        when 'TAR_EX' then 'MOU Excellent'</w:t>
-      </w:r>
-    </w:p>
-    <w:p>
-      <w:pPr>
-        <w:pBdr>
-          <w:left w:val="single" w:color="8EA9DB" w:sz="12" w:space="6"/>
-        </w:pBdr>
-        <w:shd w:fill="F7F7F7" w:val="clear"/>
-        <w:spacing w:after="0" w:line="240"/>
-        <w:ind w:left="120" w:right="120"/>
-      </w:pPr>
-      <w:r>
-        <w:rPr>
-          <w:rFonts w:ascii="Consolas" w:cs="Consolas" w:eastAsia="Consolas" w:hAnsi="Consolas"/>
-          <w:sz w:val="15"/>
-          <w:szCs w:val="15"/>
-        </w:rPr>
-        <w:t xml:space="preserve">        when 'TAR_VG' then 'MOU Very Good'</w:t>
-      </w:r>
-    </w:p>
-    <w:p>
-      <w:pPr>
-        <w:pBdr>
-          <w:left w:val="single" w:color="8EA9DB" w:sz="12" w:space="6"/>
-        </w:pBdr>
-        <w:shd w:fill="F7F7F7" w:val="clear"/>
-        <w:spacing w:after="0" w:line="240"/>
-        <w:ind w:left="120" w:right="120"/>
-      </w:pPr>
-      <w:r>
-        <w:rPr>
-          <w:rFonts w:ascii="Consolas" w:cs="Consolas" w:eastAsia="Consolas" w:hAnsi="Consolas"/>
-          <w:sz w:val="15"/>
-          <w:szCs w:val="15"/>
-        </w:rPr>
-        <w:t xml:space="preserve">        when 'TAR_PC' then 'Physical Control'</w:t>
-      </w:r>
-    </w:p>
-    <w:p>
-      <w:pPr>
-        <w:pBdr>
-          <w:left w:val="single" w:color="8EA9DB" w:sz="12" w:space="6"/>
-        </w:pBdr>
-        <w:shd w:fill="F7F7F7" w:val="clear"/>
-        <w:spacing w:after="0" w:line="240"/>
-        <w:ind w:left="120" w:right="120"/>
-      </w:pPr>
-      <w:r>
-        <w:rPr>
-          <w:rFonts w:ascii="Consolas" w:cs="Consolas" w:eastAsia="Consolas" w:hAnsi="Consolas"/>
-          <w:sz w:val="15"/>
-          <w:szCs w:val="15"/>
-        </w:rPr>
-        <w:t xml:space="preserve">        when 'TAR_RE' then 'Revised Estimate'</w:t>
-      </w:r>
-    </w:p>
-    <w:p>
-      <w:pPr>
-        <w:pBdr>
-          <w:left w:val="single" w:color="8EA9DB" w:sz="12" w:space="6"/>
-        </w:pBdr>
-        <w:shd w:fill="F7F7F7" w:val="clear"/>
-        <w:spacing w:after="0" w:line="240"/>
-        <w:ind w:left="120" w:right="120"/>
-      </w:pPr>
-      <w:r>
-        <w:rPr>
-          <w:rFonts w:ascii="Consolas" w:cs="Consolas" w:eastAsia="Consolas" w:hAnsi="Consolas"/>
-          <w:sz w:val="15"/>
-          <w:szCs w:val="15"/>
-        </w:rPr>
-        <w:t xml:space="preserve">        else PrdTar.tar_code</w:t>
-      </w:r>
-    </w:p>
-    <w:p>
-      <w:pPr>
-        <w:pBdr>
-          <w:left w:val="single" w:color="8EA9DB" w:sz="12" w:space="6"/>
-        </w:pBdr>
-        <w:shd w:fill="F7F7F7" w:val="clear"/>
-        <w:spacing w:after="0" w:line="240"/>
-        <w:ind w:left="120" w:right="120"/>
-      </w:pPr>
-      <w:r>
-        <w:rPr>
-          <w:rFonts w:ascii="Consolas" w:cs="Consolas" w:eastAsia="Consolas" w:hAnsi="Consolas"/>
-          <w:sz w:val="15"/>
-          <w:szCs w:val="15"/>
-        </w:rPr>
-        <w:t xml:space="preserve">      end                                 as TargetTypeDescription,</w:t>
+        <w:t xml:space="preserve">      case PrdTar.product</w:t>
+      </w:r>
+    </w:p>
+    <w:p>
+      <w:pPr>
+        <w:pBdr>
+          <w:left w:val="single" w:color="8EA9DB" w:sz="12" w:space="6"/>
+        </w:pBdr>
+        <w:shd w:fill="F7F7F7" w:val="clear"/>
+        <w:spacing w:after="0" w:line="240"/>
+        <w:ind w:left="120" w:right="120"/>
+      </w:pPr>
+      <w:r>
+        <w:rPr>
+          <w:rFonts w:ascii="Consolas" w:cs="Consolas" w:eastAsia="Consolas" w:hAnsi="Consolas"/>
+          <w:sz w:val="15"/>
+          <w:szCs w:val="15"/>
+        </w:rPr>
+        <w:t xml:space="preserve">        when '722000001' then 'Oil'</w:t>
+      </w:r>
+    </w:p>
+    <w:p>
+      <w:pPr>
+        <w:pBdr>
+          <w:left w:val="single" w:color="8EA9DB" w:sz="12" w:space="6"/>
+        </w:pBdr>
+        <w:shd w:fill="F7F7F7" w:val="clear"/>
+        <w:spacing w:after="0" w:line="240"/>
+        <w:ind w:left="120" w:right="120"/>
+      </w:pPr>
+      <w:r>
+        <w:rPr>
+          <w:rFonts w:ascii="Consolas" w:cs="Consolas" w:eastAsia="Consolas" w:hAnsi="Consolas"/>
+          <w:sz w:val="15"/>
+          <w:szCs w:val="15"/>
+        </w:rPr>
+        <w:t xml:space="preserve">        when '722000003' then 'Condensate'</w:t>
+      </w:r>
+    </w:p>
+    <w:p>
+      <w:pPr>
+        <w:pBdr>
+          <w:left w:val="single" w:color="8EA9DB" w:sz="12" w:space="6"/>
+        </w:pBdr>
+        <w:shd w:fill="F7F7F7" w:val="clear"/>
+        <w:spacing w:after="0" w:line="240"/>
+        <w:ind w:left="120" w:right="120"/>
+      </w:pPr>
+      <w:r>
+        <w:rPr>
+          <w:rFonts w:ascii="Consolas" w:cs="Consolas" w:eastAsia="Consolas" w:hAnsi="Consolas"/>
+          <w:sz w:val="15"/>
+          <w:szCs w:val="15"/>
+        </w:rPr>
+        <w:t xml:space="preserve">        when '722000004' then 'Gas'</w:t>
+      </w:r>
+    </w:p>
+    <w:p>
+      <w:pPr>
+        <w:pBdr>
+          <w:left w:val="single" w:color="8EA9DB" w:sz="12" w:space="6"/>
+        </w:pBdr>
+        <w:shd w:fill="F7F7F7" w:val="clear"/>
+        <w:spacing w:after="0" w:line="240"/>
+        <w:ind w:left="120" w:right="120"/>
+      </w:pPr>
+      <w:r>
+        <w:rPr>
+          <w:rFonts w:ascii="Consolas" w:cs="Consolas" w:eastAsia="Consolas" w:hAnsi="Consolas"/>
+          <w:sz w:val="15"/>
+          <w:szCs w:val="15"/>
+        </w:rPr>
+        <w:t xml:space="preserve">        when '722000005' then 'LNG'</w:t>
+      </w:r>
+    </w:p>
+    <w:p>
+      <w:pPr>
+        <w:pBdr>
+          <w:left w:val="single" w:color="8EA9DB" w:sz="12" w:space="6"/>
+        </w:pBdr>
+        <w:shd w:fill="F7F7F7" w:val="clear"/>
+        <w:spacing w:after="0" w:line="240"/>
+        <w:ind w:left="120" w:right="120"/>
+      </w:pPr>
+      <w:r>
+        <w:rPr>
+          <w:rFonts w:ascii="Consolas" w:cs="Consolas" w:eastAsia="Consolas" w:hAnsi="Consolas"/>
+          <w:sz w:val="15"/>
+          <w:szCs w:val="15"/>
+        </w:rPr>
+        <w:t xml:space="preserve">        else                  'Other'</w:t>
+      </w:r>
+    </w:p>
+    <w:p>
+      <w:pPr>
+        <w:pBdr>
+          <w:left w:val="single" w:color="8EA9DB" w:sz="12" w:space="6"/>
+        </w:pBdr>
+        <w:shd w:fill="F7F7F7" w:val="clear"/>
+        <w:spacing w:after="0" w:line="240"/>
+        <w:ind w:left="120" w:right="120"/>
+      </w:pPr>
+      <w:r>
+        <w:rPr>
+          <w:rFonts w:ascii="Consolas" w:cs="Consolas" w:eastAsia="Consolas" w:hAnsi="Consolas"/>
+          <w:sz w:val="15"/>
+          <w:szCs w:val="15"/>
+        </w:rPr>
+        <w:t xml:space="preserve">      end                                 as ProductDescription,</w:t>
       </w:r>
     </w:p>
     <w:p>
@@ -6572,6 +6400,24 @@
           <w:sz w:val="15"/>
           <w:szCs w:val="15"/>
         </w:rPr>
+        <w:t xml:space="preserve">      /* Plain columns so aggregation views need no CASE in sums/group by */</w:t>
+      </w:r>
+    </w:p>
+    <w:p>
+      <w:pPr>
+        <w:pBdr>
+          <w:left w:val="single" w:color="8EA9DB" w:sz="12" w:space="6"/>
+        </w:pBdr>
+        <w:shd w:fill="F7F7F7" w:val="clear"/>
+        <w:spacing w:after="0" w:line="240"/>
+        <w:ind w:left="120" w:right="120"/>
+      </w:pPr>
+      <w:r>
+        <w:rPr>
+          <w:rFonts w:ascii="Consolas" w:cs="Consolas" w:eastAsia="Consolas" w:hAnsi="Consolas"/>
+          <w:sz w:val="15"/>
+          <w:szCs w:val="15"/>
+        </w:rPr>
         <w:t xml:space="preserve">      case PrdTar.product</w:t>
       </w:r>
     </w:p>
@@ -6590,97 +6436,43 @@
           <w:sz w:val="15"/>
           <w:szCs w:val="15"/>
         </w:rPr>
-        <w:t xml:space="preserve">        when '722000001' then 'Oil'</w:t>
-      </w:r>
-    </w:p>
-    <w:p>
-      <w:pPr>
-        <w:pBdr>
-          <w:left w:val="single" w:color="8EA9DB" w:sz="12" w:space="6"/>
-        </w:pBdr>
-        <w:shd w:fill="F7F7F7" w:val="clear"/>
-        <w:spacing w:after="0" w:line="240"/>
-        <w:ind w:left="120" w:right="120"/>
-      </w:pPr>
-      <w:r>
-        <w:rPr>
-          <w:rFonts w:ascii="Consolas" w:cs="Consolas" w:eastAsia="Consolas" w:hAnsi="Consolas"/>
-          <w:sz w:val="15"/>
-          <w:szCs w:val="15"/>
-        </w:rPr>
-        <w:t xml:space="preserve">        when '722000003' then 'Condensate'</w:t>
-      </w:r>
-    </w:p>
-    <w:p>
-      <w:pPr>
-        <w:pBdr>
-          <w:left w:val="single" w:color="8EA9DB" w:sz="12" w:space="6"/>
-        </w:pBdr>
-        <w:shd w:fill="F7F7F7" w:val="clear"/>
-        <w:spacing w:after="0" w:line="240"/>
-        <w:ind w:left="120" w:right="120"/>
-      </w:pPr>
-      <w:r>
-        <w:rPr>
-          <w:rFonts w:ascii="Consolas" w:cs="Consolas" w:eastAsia="Consolas" w:hAnsi="Consolas"/>
-          <w:sz w:val="15"/>
-          <w:szCs w:val="15"/>
-        </w:rPr>
-        <w:t xml:space="preserve">        when '722000004' then 'Gas'</w:t>
-      </w:r>
-    </w:p>
-    <w:p>
-      <w:pPr>
-        <w:pBdr>
-          <w:left w:val="single" w:color="8EA9DB" w:sz="12" w:space="6"/>
-        </w:pBdr>
-        <w:shd w:fill="F7F7F7" w:val="clear"/>
-        <w:spacing w:after="0" w:line="240"/>
-        <w:ind w:left="120" w:right="120"/>
-      </w:pPr>
-      <w:r>
-        <w:rPr>
-          <w:rFonts w:ascii="Consolas" w:cs="Consolas" w:eastAsia="Consolas" w:hAnsi="Consolas"/>
-          <w:sz w:val="15"/>
-          <w:szCs w:val="15"/>
-        </w:rPr>
-        <w:t xml:space="preserve">        when '722000005' then 'LNG'</w:t>
-      </w:r>
-    </w:p>
-    <w:p>
-      <w:pPr>
-        <w:pBdr>
-          <w:left w:val="single" w:color="8EA9DB" w:sz="12" w:space="6"/>
-        </w:pBdr>
-        <w:shd w:fill="F7F7F7" w:val="clear"/>
-        <w:spacing w:after="0" w:line="240"/>
-        <w:ind w:left="120" w:right="120"/>
-      </w:pPr>
-      <w:r>
-        <w:rPr>
-          <w:rFonts w:ascii="Consolas" w:cs="Consolas" w:eastAsia="Consolas" w:hAnsi="Consolas"/>
-          <w:sz w:val="15"/>
-          <w:szCs w:val="15"/>
-        </w:rPr>
-        <w:t xml:space="preserve">        else                  'Other'</w:t>
-      </w:r>
-    </w:p>
-    <w:p>
-      <w:pPr>
-        <w:pBdr>
-          <w:left w:val="single" w:color="8EA9DB" w:sz="12" w:space="6"/>
-        </w:pBdr>
-        <w:shd w:fill="F7F7F7" w:val="clear"/>
-        <w:spacing w:after="0" w:line="240"/>
-        <w:ind w:left="120" w:right="120"/>
-      </w:pPr>
-      <w:r>
-        <w:rPr>
-          <w:rFonts w:ascii="Consolas" w:cs="Consolas" w:eastAsia="Consolas" w:hAnsi="Consolas"/>
-          <w:sz w:val="15"/>
-          <w:szCs w:val="15"/>
-        </w:rPr>
-        <w:t xml:space="preserve">      end                                 as ProductDescription,</w:t>
+        <w:t xml:space="preserve">        when '722000004' then 'GAS'</w:t>
+      </w:r>
+    </w:p>
+    <w:p>
+      <w:pPr>
+        <w:pBdr>
+          <w:left w:val="single" w:color="8EA9DB" w:sz="12" w:space="6"/>
+        </w:pBdr>
+        <w:shd w:fill="F7F7F7" w:val="clear"/>
+        <w:spacing w:after="0" w:line="240"/>
+        <w:ind w:left="120" w:right="120"/>
+      </w:pPr>
+      <w:r>
+        <w:rPr>
+          <w:rFonts w:ascii="Consolas" w:cs="Consolas" w:eastAsia="Consolas" w:hAnsi="Consolas"/>
+          <w:sz w:val="15"/>
+          <w:szCs w:val="15"/>
+        </w:rPr>
+        <w:t xml:space="preserve">        else                  'OIL'</w:t>
+      </w:r>
+    </w:p>
+    <w:p>
+      <w:pPr>
+        <w:pBdr>
+          <w:left w:val="single" w:color="8EA9DB" w:sz="12" w:space="6"/>
+        </w:pBdr>
+        <w:shd w:fill="F7F7F7" w:val="clear"/>
+        <w:spacing w:after="0" w:line="240"/>
+        <w:ind w:left="120" w:right="120"/>
+      </w:pPr>
+      <w:r>
+        <w:rPr>
+          <w:rFonts w:ascii="Consolas" w:cs="Consolas" w:eastAsia="Consolas" w:hAnsi="Consolas"/>
+          <w:sz w:val="15"/>
+          <w:szCs w:val="15"/>
+        </w:rPr>
+        <w:t xml:space="preserve">      end                                 as ProductGroup,</w:t>
       </w:r>
     </w:p>
     <w:p>
@@ -6716,241 +6508,7 @@
           <w:sz w:val="15"/>
           <w:szCs w:val="15"/>
         </w:rPr>
-        <w:t xml:space="preserve">      /* Plain columns so aggregation views need no CASE in sums/group by */</w:t>
-      </w:r>
-    </w:p>
-    <w:p>
-      <w:pPr>
-        <w:pBdr>
-          <w:left w:val="single" w:color="8EA9DB" w:sz="12" w:space="6"/>
-        </w:pBdr>
-        <w:shd w:fill="F7F7F7" w:val="clear"/>
-        <w:spacing w:after="0" w:line="240"/>
-        <w:ind w:left="120" w:right="120"/>
-      </w:pPr>
-      <w:r>
-        <w:rPr>
-          <w:rFonts w:ascii="Consolas" w:cs="Consolas" w:eastAsia="Consolas" w:hAnsi="Consolas"/>
-          <w:sz w:val="15"/>
-          <w:szCs w:val="15"/>
-        </w:rPr>
-        <w:t xml:space="preserve">      case PrdTar.product</w:t>
-      </w:r>
-    </w:p>
-    <w:p>
-      <w:pPr>
-        <w:pBdr>
-          <w:left w:val="single" w:color="8EA9DB" w:sz="12" w:space="6"/>
-        </w:pBdr>
-        <w:shd w:fill="F7F7F7" w:val="clear"/>
-        <w:spacing w:after="0" w:line="240"/>
-        <w:ind w:left="120" w:right="120"/>
-      </w:pPr>
-      <w:r>
-        <w:rPr>
-          <w:rFonts w:ascii="Consolas" w:cs="Consolas" w:eastAsia="Consolas" w:hAnsi="Consolas"/>
-          <w:sz w:val="15"/>
-          <w:szCs w:val="15"/>
-        </w:rPr>
-        <w:t xml:space="preserve">        when '722000004' then 'GAS'</w:t>
-      </w:r>
-    </w:p>
-    <w:p>
-      <w:pPr>
-        <w:pBdr>
-          <w:left w:val="single" w:color="8EA9DB" w:sz="12" w:space="6"/>
-        </w:pBdr>
-        <w:shd w:fill="F7F7F7" w:val="clear"/>
-        <w:spacing w:after="0" w:line="240"/>
-        <w:ind w:left="120" w:right="120"/>
-      </w:pPr>
-      <w:r>
-        <w:rPr>
-          <w:rFonts w:ascii="Consolas" w:cs="Consolas" w:eastAsia="Consolas" w:hAnsi="Consolas"/>
-          <w:sz w:val="15"/>
-          <w:szCs w:val="15"/>
-        </w:rPr>
-        <w:t xml:space="preserve">        else                  'OIL'</w:t>
-      </w:r>
-    </w:p>
-    <w:p>
-      <w:pPr>
-        <w:pBdr>
-          <w:left w:val="single" w:color="8EA9DB" w:sz="12" w:space="6"/>
-        </w:pBdr>
-        <w:shd w:fill="F7F7F7" w:val="clear"/>
-        <w:spacing w:after="0" w:line="240"/>
-        <w:ind w:left="120" w:right="120"/>
-      </w:pPr>
-      <w:r>
-        <w:rPr>
-          <w:rFonts w:ascii="Consolas" w:cs="Consolas" w:eastAsia="Consolas" w:hAnsi="Consolas"/>
-          <w:sz w:val="15"/>
-          <w:szCs w:val="15"/>
-        </w:rPr>
-        <w:t xml:space="preserve">      end                                 as ProductGroup,</w:t>
-      </w:r>
-    </w:p>
-    <w:p>
-      <w:pPr>
-        <w:pBdr>
-          <w:left w:val="single" w:color="8EA9DB" w:sz="12" w:space="6"/>
-        </w:pBdr>
-        <w:shd w:fill="F7F7F7" w:val="clear"/>
-        <w:spacing w:after="0" w:line="240"/>
-        <w:ind w:left="120" w:right="120"/>
-      </w:pPr>
-      <w:r>
-        <w:rPr>
-          <w:rFonts w:ascii="Consolas" w:cs="Consolas" w:eastAsia="Consolas" w:hAnsi="Consolas"/>
-          <w:sz w:val="15"/>
-          <w:szCs w:val="15"/>
-        </w:rPr>
-        <w:t xml:space="preserve"> </w:t>
-      </w:r>
-    </w:p>
-    <w:p>
-      <w:pPr>
-        <w:pBdr>
-          <w:left w:val="single" w:color="8EA9DB" w:sz="12" w:space="6"/>
-        </w:pBdr>
-        <w:shd w:fill="F7F7F7" w:val="clear"/>
-        <w:spacing w:after="0" w:line="240"/>
-        <w:ind w:left="120" w:right="120"/>
-      </w:pPr>
-      <w:r>
-        <w:rPr>
-          <w:rFonts w:ascii="Consolas" w:cs="Consolas" w:eastAsia="Consolas" w:hAnsi="Consolas"/>
-          <w:sz w:val="15"/>
-          <w:szCs w:val="15"/>
-        </w:rPr>
-        <w:t xml:space="preserve">      /* Conversion factor MMT -&gt; barrels of the fiscal year (0 when no</w:t>
-      </w:r>
-    </w:p>
-    <w:p>
-      <w:pPr>
-        <w:pBdr>
-          <w:left w:val="single" w:color="8EA9DB" w:sz="12" w:space="6"/>
-        </w:pBdr>
-        <w:shd w:fill="F7F7F7" w:val="clear"/>
-        <w:spacing w:after="0" w:line="240"/>
-        <w:ind w:left="120" w:right="120"/>
-      </w:pPr>
-      <w:r>
-        <w:rPr>
-          <w:rFonts w:ascii="Consolas" w:cs="Consolas" w:eastAsia="Consolas" w:hAnsi="Consolas"/>
-          <w:sz w:val="15"/>
-          <w:szCs w:val="15"/>
-        </w:rPr>
-        <w:t xml:space="preserve">         ZPRA_T_TAR_CF row exists - same result as the classic report) */</w:t>
-      </w:r>
-    </w:p>
-    <w:p>
-      <w:pPr>
-        <w:pBdr>
-          <w:left w:val="single" w:color="8EA9DB" w:sz="12" w:space="6"/>
-        </w:pBdr>
-        <w:shd w:fill="F7F7F7" w:val="clear"/>
-        <w:spacing w:after="0" w:line="240"/>
-        <w:ind w:left="120" w:right="120"/>
-      </w:pPr>
-      <w:r>
-        <w:rPr>
-          <w:rFonts w:ascii="Consolas" w:cs="Consolas" w:eastAsia="Consolas" w:hAnsi="Consolas"/>
-          <w:sz w:val="15"/>
-          <w:szCs w:val="15"/>
-        </w:rPr>
-        <w:t xml:space="preserve">      cast( coalesce( cast( Cf.conv_factor as abap.dec( 15, 7 ) ),</w:t>
-      </w:r>
-    </w:p>
-    <w:p>
-      <w:pPr>
-        <w:pBdr>
-          <w:left w:val="single" w:color="8EA9DB" w:sz="12" w:space="6"/>
-        </w:pBdr>
-        <w:shd w:fill="F7F7F7" w:val="clear"/>
-        <w:spacing w:after="0" w:line="240"/>
-        <w:ind w:left="120" w:right="120"/>
-      </w:pPr>
-      <w:r>
-        <w:rPr>
-          <w:rFonts w:ascii="Consolas" w:cs="Consolas" w:eastAsia="Consolas" w:hAnsi="Consolas"/>
-          <w:sz w:val="15"/>
-          <w:szCs w:val="15"/>
-        </w:rPr>
-        <w:t xml:space="preserve">                      cast( 0 as abap.dec( 15, 7 ) ) )</w:t>
-      </w:r>
-    </w:p>
-    <w:p>
-      <w:pPr>
-        <w:pBdr>
-          <w:left w:val="single" w:color="8EA9DB" w:sz="12" w:space="6"/>
-        </w:pBdr>
-        <w:shd w:fill="F7F7F7" w:val="clear"/>
-        <w:spacing w:after="0" w:line="240"/>
-        <w:ind w:left="120" w:right="120"/>
-      </w:pPr>
-      <w:r>
-        <w:rPr>
-          <w:rFonts w:ascii="Consolas" w:cs="Consolas" w:eastAsia="Consolas" w:hAnsi="Consolas"/>
-          <w:sz w:val="15"/>
-          <w:szCs w:val="15"/>
-        </w:rPr>
-        <w:t xml:space="preserve">            as abap.dec( 15, 7 ) )        as ConversionFactor,</w:t>
-      </w:r>
-    </w:p>
-    <w:p>
-      <w:pPr>
-        <w:pBdr>
-          <w:left w:val="single" w:color="8EA9DB" w:sz="12" w:space="6"/>
-        </w:pBdr>
-        <w:shd w:fill="F7F7F7" w:val="clear"/>
-        <w:spacing w:after="0" w:line="240"/>
-        <w:ind w:left="120" w:right="120"/>
-      </w:pPr>
-      <w:r>
-        <w:rPr>
-          <w:rFonts w:ascii="Consolas" w:cs="Consolas" w:eastAsia="Consolas" w:hAnsi="Consolas"/>
-          <w:sz w:val="15"/>
-          <w:szCs w:val="15"/>
-        </w:rPr>
-        <w:t xml:space="preserve"> </w:t>
-      </w:r>
-    </w:p>
-    <w:p>
-      <w:pPr>
-        <w:pBdr>
-          <w:left w:val="single" w:color="8EA9DB" w:sz="12" w:space="6"/>
-        </w:pBdr>
-        <w:shd w:fill="F7F7F7" w:val="clear"/>
-        <w:spacing w:after="0" w:line="240"/>
-        <w:ind w:left="120" w:right="120"/>
-      </w:pPr>
-      <w:r>
-        <w:rPr>
-          <w:rFonts w:ascii="Consolas" w:cs="Consolas" w:eastAsia="Consolas" w:hAnsi="Consolas"/>
-          <w:sz w:val="15"/>
-          <w:szCs w:val="15"/>
-        </w:rPr>
-        <w:t xml:space="preserve">      /* Monthly target volume in native units:</w:t>
-      </w:r>
-    </w:p>
-    <w:p>
-      <w:pPr>
-        <w:pBdr>
-          <w:left w:val="single" w:color="8EA9DB" w:sz="12" w:space="6"/>
-        </w:pBdr>
-        <w:shd w:fill="F7F7F7" w:val="clear"/>
-        <w:spacing w:after="0" w:line="240"/>
-        <w:ind w:left="120" w:right="120"/>
-      </w:pPr>
-      <w:r>
-        <w:rPr>
-          <w:rFonts w:ascii="Consolas" w:cs="Consolas" w:eastAsia="Consolas" w:hAnsi="Consolas"/>
-          <w:sz w:val="15"/>
-          <w:szCs w:val="15"/>
-        </w:rPr>
-        <w:t xml:space="preserve">         barrels (oil family) / MMSCM (gas) */</w:t>
+        <w:t xml:space="preserve">      /* BOEPD equivalent of the target rate (gas MMSCMD x 6290) */</w:t>
       </w:r>
     </w:p>
     <w:p>
@@ -6986,475 +6544,43 @@
           <w:sz w:val="15"/>
           <w:szCs w:val="15"/>
         </w:rPr>
-        <w:t xml:space="preserve">              when '722000004' then PrdTar.tar_qty * cast( 1000 as abap.dec( 10, 0 ) )</w:t>
-      </w:r>
-    </w:p>
-    <w:p>
-      <w:pPr>
-        <w:pBdr>
-          <w:left w:val="single" w:color="8EA9DB" w:sz="12" w:space="6"/>
-        </w:pBdr>
-        <w:shd w:fill="F7F7F7" w:val="clear"/>
-        <w:spacing w:after="0" w:line="240"/>
-        <w:ind w:left="120" w:right="120"/>
-      </w:pPr>
-      <w:r>
-        <w:rPr>
-          <w:rFonts w:ascii="Consolas" w:cs="Consolas" w:eastAsia="Consolas" w:hAnsi="Consolas"/>
-          <w:sz w:val="15"/>
-          <w:szCs w:val="15"/>
-        </w:rPr>
-        <w:t xml:space="preserve">              else                  PrdTar.tar_qty * cast( 1000000 as abap.dec( 10, 0 ) )</w:t>
-      </w:r>
-    </w:p>
-    <w:p>
-      <w:pPr>
-        <w:pBdr>
-          <w:left w:val="single" w:color="8EA9DB" w:sz="12" w:space="6"/>
-        </w:pBdr>
-        <w:shd w:fill="F7F7F7" w:val="clear"/>
-        <w:spacing w:after="0" w:line="240"/>
-        <w:ind w:left="120" w:right="120"/>
-      </w:pPr>
-      <w:r>
-        <w:rPr>
-          <w:rFonts w:ascii="Consolas" w:cs="Consolas" w:eastAsia="Consolas" w:hAnsi="Consolas"/>
-          <w:sz w:val="15"/>
-          <w:szCs w:val="15"/>
-        </w:rPr>
-        <w:t xml:space="preserve">                                    * coalesce( cast( Cf.conv_factor as abap.dec( 15, 7 ) ),</w:t>
-      </w:r>
-    </w:p>
-    <w:p>
-      <w:pPr>
-        <w:pBdr>
-          <w:left w:val="single" w:color="8EA9DB" w:sz="12" w:space="6"/>
-        </w:pBdr>
-        <w:shd w:fill="F7F7F7" w:val="clear"/>
-        <w:spacing w:after="0" w:line="240"/>
-        <w:ind w:left="120" w:right="120"/>
-      </w:pPr>
-      <w:r>
-        <w:rPr>
-          <w:rFonts w:ascii="Consolas" w:cs="Consolas" w:eastAsia="Consolas" w:hAnsi="Consolas"/>
-          <w:sz w:val="15"/>
-          <w:szCs w:val="15"/>
-        </w:rPr>
-        <w:t xml:space="preserve">                                                cast( 0 as abap.dec( 15, 7 ) ) )</w:t>
-      </w:r>
-    </w:p>
-    <w:p>
-      <w:pPr>
-        <w:pBdr>
-          <w:left w:val="single" w:color="8EA9DB" w:sz="12" w:space="6"/>
-        </w:pBdr>
-        <w:shd w:fill="F7F7F7" w:val="clear"/>
-        <w:spacing w:after="0" w:line="240"/>
-        <w:ind w:left="120" w:right="120"/>
-      </w:pPr>
-      <w:r>
-        <w:rPr>
-          <w:rFonts w:ascii="Consolas" w:cs="Consolas" w:eastAsia="Consolas" w:hAnsi="Consolas"/>
-          <w:sz w:val="15"/>
-          <w:szCs w:val="15"/>
-        </w:rPr>
-        <w:t xml:space="preserve">            end as abap.dec( 23, 3 ) )    as TargetVolume,</w:t>
-      </w:r>
-    </w:p>
-    <w:p>
-      <w:pPr>
-        <w:pBdr>
-          <w:left w:val="single" w:color="8EA9DB" w:sz="12" w:space="6"/>
-        </w:pBdr>
-        <w:shd w:fill="F7F7F7" w:val="clear"/>
-        <w:spacing w:after="0" w:line="240"/>
-        <w:ind w:left="120" w:right="120"/>
-      </w:pPr>
-      <w:r>
-        <w:rPr>
-          <w:rFonts w:ascii="Consolas" w:cs="Consolas" w:eastAsia="Consolas" w:hAnsi="Consolas"/>
-          <w:sz w:val="15"/>
-          <w:szCs w:val="15"/>
-        </w:rPr>
-        <w:t xml:space="preserve"> </w:t>
-      </w:r>
-    </w:p>
-    <w:p>
-      <w:pPr>
-        <w:pBdr>
-          <w:left w:val="single" w:color="8EA9DB" w:sz="12" w:space="6"/>
-        </w:pBdr>
-        <w:shd w:fill="F7F7F7" w:val="clear"/>
-        <w:spacing w:after="0" w:line="240"/>
-        <w:ind w:left="120" w:right="120"/>
-      </w:pPr>
-      <w:r>
-        <w:rPr>
-          <w:rFonts w:ascii="Consolas" w:cs="Consolas" w:eastAsia="Consolas" w:hAnsi="Consolas"/>
-          <w:sz w:val="15"/>
-          <w:szCs w:val="15"/>
-        </w:rPr>
-        <w:t xml:space="preserve">      /* Monthly target volume in barrels of oil equivalent</w:t>
-      </w:r>
-    </w:p>
-    <w:p>
-      <w:pPr>
-        <w:pBdr>
-          <w:left w:val="single" w:color="8EA9DB" w:sz="12" w:space="6"/>
-        </w:pBdr>
-        <w:shd w:fill="F7F7F7" w:val="clear"/>
-        <w:spacing w:after="0" w:line="240"/>
-        <w:ind w:left="120" w:right="120"/>
-      </w:pPr>
-      <w:r>
-        <w:rPr>
-          <w:rFonts w:ascii="Consolas" w:cs="Consolas" w:eastAsia="Consolas" w:hAnsi="Consolas"/>
-          <w:sz w:val="15"/>
-          <w:szCs w:val="15"/>
-        </w:rPr>
-        <w:t xml:space="preserve">         (gas: MMSCM x 6290) */</w:t>
-      </w:r>
-    </w:p>
-    <w:p>
-      <w:pPr>
-        <w:pBdr>
-          <w:left w:val="single" w:color="8EA9DB" w:sz="12" w:space="6"/>
-        </w:pBdr>
-        <w:shd w:fill="F7F7F7" w:val="clear"/>
-        <w:spacing w:after="0" w:line="240"/>
-        <w:ind w:left="120" w:right="120"/>
-      </w:pPr>
-      <w:r>
-        <w:rPr>
-          <w:rFonts w:ascii="Consolas" w:cs="Consolas" w:eastAsia="Consolas" w:hAnsi="Consolas"/>
-          <w:sz w:val="15"/>
-          <w:szCs w:val="15"/>
-        </w:rPr>
-        <w:t xml:space="preserve">      cast( case PrdTar.product</w:t>
-      </w:r>
-    </w:p>
-    <w:p>
-      <w:pPr>
-        <w:pBdr>
-          <w:left w:val="single" w:color="8EA9DB" w:sz="12" w:space="6"/>
-        </w:pBdr>
-        <w:shd w:fill="F7F7F7" w:val="clear"/>
-        <w:spacing w:after="0" w:line="240"/>
-        <w:ind w:left="120" w:right="120"/>
-      </w:pPr>
-      <w:r>
-        <w:rPr>
-          <w:rFonts w:ascii="Consolas" w:cs="Consolas" w:eastAsia="Consolas" w:hAnsi="Consolas"/>
-          <w:sz w:val="15"/>
-          <w:szCs w:val="15"/>
-        </w:rPr>
-        <w:t xml:space="preserve">              when '722000004' then PrdTar.tar_qty * cast( 1000 as abap.dec( 10, 0 ) )</w:t>
-      </w:r>
-    </w:p>
-    <w:p>
-      <w:pPr>
-        <w:pBdr>
-          <w:left w:val="single" w:color="8EA9DB" w:sz="12" w:space="6"/>
-        </w:pBdr>
-        <w:shd w:fill="F7F7F7" w:val="clear"/>
-        <w:spacing w:after="0" w:line="240"/>
-        <w:ind w:left="120" w:right="120"/>
-      </w:pPr>
-      <w:r>
-        <w:rPr>
-          <w:rFonts w:ascii="Consolas" w:cs="Consolas" w:eastAsia="Consolas" w:hAnsi="Consolas"/>
-          <w:sz w:val="15"/>
-          <w:szCs w:val="15"/>
-        </w:rPr>
-        <w:t xml:space="preserve">                                    * cast( 6290 as abap.dec( 5, 0 ) )</w:t>
-      </w:r>
-    </w:p>
-    <w:p>
-      <w:pPr>
-        <w:pBdr>
-          <w:left w:val="single" w:color="8EA9DB" w:sz="12" w:space="6"/>
-        </w:pBdr>
-        <w:shd w:fill="F7F7F7" w:val="clear"/>
-        <w:spacing w:after="0" w:line="240"/>
-        <w:ind w:left="120" w:right="120"/>
-      </w:pPr>
-      <w:r>
-        <w:rPr>
-          <w:rFonts w:ascii="Consolas" w:cs="Consolas" w:eastAsia="Consolas" w:hAnsi="Consolas"/>
-          <w:sz w:val="15"/>
-          <w:szCs w:val="15"/>
-        </w:rPr>
-        <w:t xml:space="preserve">              else                  PrdTar.tar_qty * cast( 1000000 as abap.dec( 10, 0 ) )</w:t>
-      </w:r>
-    </w:p>
-    <w:p>
-      <w:pPr>
-        <w:pBdr>
-          <w:left w:val="single" w:color="8EA9DB" w:sz="12" w:space="6"/>
-        </w:pBdr>
-        <w:shd w:fill="F7F7F7" w:val="clear"/>
-        <w:spacing w:after="0" w:line="240"/>
-        <w:ind w:left="120" w:right="120"/>
-      </w:pPr>
-      <w:r>
-        <w:rPr>
-          <w:rFonts w:ascii="Consolas" w:cs="Consolas" w:eastAsia="Consolas" w:hAnsi="Consolas"/>
-          <w:sz w:val="15"/>
-          <w:szCs w:val="15"/>
-        </w:rPr>
-        <w:t xml:space="preserve">                                    * coalesce( cast( Cf.conv_factor as abap.dec( 15, 7 ) ),</w:t>
-      </w:r>
-    </w:p>
-    <w:p>
-      <w:pPr>
-        <w:pBdr>
-          <w:left w:val="single" w:color="8EA9DB" w:sz="12" w:space="6"/>
-        </w:pBdr>
-        <w:shd w:fill="F7F7F7" w:val="clear"/>
-        <w:spacing w:after="0" w:line="240"/>
-        <w:ind w:left="120" w:right="120"/>
-      </w:pPr>
-      <w:r>
-        <w:rPr>
-          <w:rFonts w:ascii="Consolas" w:cs="Consolas" w:eastAsia="Consolas" w:hAnsi="Consolas"/>
-          <w:sz w:val="15"/>
-          <w:szCs w:val="15"/>
-        </w:rPr>
-        <w:t xml:space="preserve">                                                cast( 0 as abap.dec( 15, 7 ) ) )</w:t>
-      </w:r>
-    </w:p>
-    <w:p>
-      <w:pPr>
-        <w:pBdr>
-          <w:left w:val="single" w:color="8EA9DB" w:sz="12" w:space="6"/>
-        </w:pBdr>
-        <w:shd w:fill="F7F7F7" w:val="clear"/>
-        <w:spacing w:after="0" w:line="240"/>
-        <w:ind w:left="120" w:right="120"/>
-      </w:pPr>
-      <w:r>
-        <w:rPr>
-          <w:rFonts w:ascii="Consolas" w:cs="Consolas" w:eastAsia="Consolas" w:hAnsi="Consolas"/>
-          <w:sz w:val="15"/>
-          <w:szCs w:val="15"/>
-        </w:rPr>
-        <w:t xml:space="preserve">            end as abap.dec( 23, 3 ) )    as TargetBoe,</w:t>
-      </w:r>
-    </w:p>
-    <w:p>
-      <w:pPr>
-        <w:pBdr>
-          <w:left w:val="single" w:color="8EA9DB" w:sz="12" w:space="6"/>
-        </w:pBdr>
-        <w:shd w:fill="F7F7F7" w:val="clear"/>
-        <w:spacing w:after="0" w:line="240"/>
-        <w:ind w:left="120" w:right="120"/>
-      </w:pPr>
-      <w:r>
-        <w:rPr>
-          <w:rFonts w:ascii="Consolas" w:cs="Consolas" w:eastAsia="Consolas" w:hAnsi="Consolas"/>
-          <w:sz w:val="15"/>
-          <w:szCs w:val="15"/>
-        </w:rPr>
-        <w:t xml:space="preserve"> </w:t>
-      </w:r>
-    </w:p>
-    <w:p>
-      <w:pPr>
-        <w:pBdr>
-          <w:left w:val="single" w:color="8EA9DB" w:sz="12" w:space="6"/>
-        </w:pBdr>
-        <w:shd w:fill="F7F7F7" w:val="clear"/>
-        <w:spacing w:after="0" w:line="240"/>
-        <w:ind w:left="120" w:right="120"/>
-      </w:pPr>
-      <w:r>
-        <w:rPr>
-          <w:rFonts w:ascii="Consolas" w:cs="Consolas" w:eastAsia="Consolas" w:hAnsi="Consolas"/>
-          <w:sz w:val="15"/>
-          <w:szCs w:val="15"/>
-        </w:rPr>
-        <w:t xml:space="preserve">      /* 1 April of the fiscal year (FY April..March) */</w:t>
-      </w:r>
-    </w:p>
-    <w:p>
-      <w:pPr>
-        <w:pBdr>
-          <w:left w:val="single" w:color="8EA9DB" w:sz="12" w:space="6"/>
-        </w:pBdr>
-        <w:shd w:fill="F7F7F7" w:val="clear"/>
-        <w:spacing w:after="0" w:line="240"/>
-        <w:ind w:left="120" w:right="120"/>
-      </w:pPr>
-      <w:r>
-        <w:rPr>
-          <w:rFonts w:ascii="Consolas" w:cs="Consolas" w:eastAsia="Consolas" w:hAnsi="Consolas"/>
-          <w:sz w:val="15"/>
-          <w:szCs w:val="15"/>
-        </w:rPr>
-        <w:t xml:space="preserve">      cast( concat( cast( PrdTar.gjahr as abap.char( 4 ) ), '0401' )</w:t>
-      </w:r>
-    </w:p>
-    <w:p>
-      <w:pPr>
-        <w:pBdr>
-          <w:left w:val="single" w:color="8EA9DB" w:sz="12" w:space="6"/>
-        </w:pBdr>
-        <w:shd w:fill="F7F7F7" w:val="clear"/>
-        <w:spacing w:after="0" w:line="240"/>
-        <w:ind w:left="120" w:right="120"/>
-      </w:pPr>
-      <w:r>
-        <w:rPr>
-          <w:rFonts w:ascii="Consolas" w:cs="Consolas" w:eastAsia="Consolas" w:hAnsi="Consolas"/>
-          <w:sz w:val="15"/>
-          <w:szCs w:val="15"/>
-        </w:rPr>
-        <w:t xml:space="preserve">            as abap.dats )                as FiscalYearStart,</w:t>
-      </w:r>
-    </w:p>
-    <w:p>
-      <w:pPr>
-        <w:pBdr>
-          <w:left w:val="single" w:color="8EA9DB" w:sz="12" w:space="6"/>
-        </w:pBdr>
-        <w:shd w:fill="F7F7F7" w:val="clear"/>
-        <w:spacing w:after="0" w:line="240"/>
-        <w:ind w:left="120" w:right="120"/>
-      </w:pPr>
-      <w:r>
-        <w:rPr>
-          <w:rFonts w:ascii="Consolas" w:cs="Consolas" w:eastAsia="Consolas" w:hAnsi="Consolas"/>
-          <w:sz w:val="15"/>
-          <w:szCs w:val="15"/>
-        </w:rPr>
-        <w:t xml:space="preserve"> </w:t>
-      </w:r>
-    </w:p>
-    <w:p>
-      <w:pPr>
-        <w:pBdr>
-          <w:left w:val="single" w:color="8EA9DB" w:sz="12" w:space="6"/>
-        </w:pBdr>
-        <w:shd w:fill="F7F7F7" w:val="clear"/>
-        <w:spacing w:after="0" w:line="240"/>
-        <w:ind w:left="120" w:right="120"/>
-      </w:pPr>
-      <w:r>
-        <w:rPr>
-          <w:rFonts w:ascii="Consolas" w:cs="Consolas" w:eastAsia="Consolas" w:hAnsi="Consolas"/>
-          <w:sz w:val="15"/>
-          <w:szCs w:val="15"/>
-        </w:rPr>
-        <w:t xml:space="preserve">      /* days in the fiscal year: 1 April gjahr .. 31 March gjahr+1 (365/366) */</w:t>
-      </w:r>
-    </w:p>
-    <w:p>
-      <w:pPr>
-        <w:pBdr>
-          <w:left w:val="single" w:color="8EA9DB" w:sz="12" w:space="6"/>
-        </w:pBdr>
-        <w:shd w:fill="F7F7F7" w:val="clear"/>
-        <w:spacing w:after="0" w:line="240"/>
-        <w:ind w:left="120" w:right="120"/>
-      </w:pPr>
-      <w:r>
-        <w:rPr>
-          <w:rFonts w:ascii="Consolas" w:cs="Consolas" w:eastAsia="Consolas" w:hAnsi="Consolas"/>
-          <w:sz w:val="15"/>
-          <w:szCs w:val="15"/>
-        </w:rPr>
-        <w:t xml:space="preserve">      cast( dats_days_between(</w:t>
-      </w:r>
-    </w:p>
-    <w:p>
-      <w:pPr>
-        <w:pBdr>
-          <w:left w:val="single" w:color="8EA9DB" w:sz="12" w:space="6"/>
-        </w:pBdr>
-        <w:shd w:fill="F7F7F7" w:val="clear"/>
-        <w:spacing w:after="0" w:line="240"/>
-        <w:ind w:left="120" w:right="120"/>
-      </w:pPr>
-      <w:r>
-        <w:rPr>
-          <w:rFonts w:ascii="Consolas" w:cs="Consolas" w:eastAsia="Consolas" w:hAnsi="Consolas"/>
-          <w:sz w:val="15"/>
-          <w:szCs w:val="15"/>
-        </w:rPr>
-        <w:t xml:space="preserve">              cast( concat( cast( PrdTar.gjahr as abap.char( 4 ) ), '0401' ) as abap.dats ),</w:t>
-      </w:r>
-    </w:p>
-    <w:p>
-      <w:pPr>
-        <w:pBdr>
-          <w:left w:val="single" w:color="8EA9DB" w:sz="12" w:space="6"/>
-        </w:pBdr>
-        <w:shd w:fill="F7F7F7" w:val="clear"/>
-        <w:spacing w:after="0" w:line="240"/>
-        <w:ind w:left="120" w:right="120"/>
-      </w:pPr>
-      <w:r>
-        <w:rPr>
-          <w:rFonts w:ascii="Consolas" w:cs="Consolas" w:eastAsia="Consolas" w:hAnsi="Consolas"/>
-          <w:sz w:val="15"/>
-          <w:szCs w:val="15"/>
-        </w:rPr>
-        <w:t xml:space="preserve">              dats_add_months(</w:t>
-      </w:r>
-    </w:p>
-    <w:p>
-      <w:pPr>
-        <w:pBdr>
-          <w:left w:val="single" w:color="8EA9DB" w:sz="12" w:space="6"/>
-        </w:pBdr>
-        <w:shd w:fill="F7F7F7" w:val="clear"/>
-        <w:spacing w:after="0" w:line="240"/>
-        <w:ind w:left="120" w:right="120"/>
-      </w:pPr>
-      <w:r>
-        <w:rPr>
-          <w:rFonts w:ascii="Consolas" w:cs="Consolas" w:eastAsia="Consolas" w:hAnsi="Consolas"/>
-          <w:sz w:val="15"/>
-          <w:szCs w:val="15"/>
-        </w:rPr>
-        <w:t xml:space="preserve">                cast( concat( cast( PrdTar.gjahr as abap.char( 4 ) ), '0401' ) as abap.dats ),</w:t>
-      </w:r>
-    </w:p>
-    <w:p>
-      <w:pPr>
-        <w:pBdr>
-          <w:left w:val="single" w:color="8EA9DB" w:sz="12" w:space="6"/>
-        </w:pBdr>
-        <w:shd w:fill="F7F7F7" w:val="clear"/>
-        <w:spacing w:after="0" w:line="240"/>
-        <w:ind w:left="120" w:right="120"/>
-      </w:pPr>
-      <w:r>
-        <w:rPr>
-          <w:rFonts w:ascii="Consolas" w:cs="Consolas" w:eastAsia="Consolas" w:hAnsi="Consolas"/>
-          <w:sz w:val="15"/>
-          <w:szCs w:val="15"/>
-        </w:rPr>
-        <w:t xml:space="preserve">                12, 'INITIAL' ) )</w:t>
-      </w:r>
-    </w:p>
-    <w:p>
-      <w:pPr>
-        <w:pBdr>
-          <w:left w:val="single" w:color="8EA9DB" w:sz="12" w:space="6"/>
-        </w:pBdr>
-        <w:shd w:fill="F7F7F7" w:val="clear"/>
-        <w:spacing w:after="0" w:line="240"/>
-        <w:ind w:left="120" w:right="120"/>
-      </w:pPr>
-      <w:r>
-        <w:rPr>
-          <w:rFonts w:ascii="Consolas" w:cs="Consolas" w:eastAsia="Consolas" w:hAnsi="Consolas"/>
-          <w:sz w:val="15"/>
-          <w:szCs w:val="15"/>
-        </w:rPr>
-        <w:t xml:space="preserve">            as abap.dec( 5, 0 ) )         as DaysInFiscalYear,</w:t>
+        <w:t xml:space="preserve">              when '722000004' then PrdTar.tar_qty * 6290</w:t>
+      </w:r>
+    </w:p>
+    <w:p>
+      <w:pPr>
+        <w:pBdr>
+          <w:left w:val="single" w:color="8EA9DB" w:sz="12" w:space="6"/>
+        </w:pBdr>
+        <w:shd w:fill="F7F7F7" w:val="clear"/>
+        <w:spacing w:after="0" w:line="240"/>
+        <w:ind w:left="120" w:right="120"/>
+      </w:pPr>
+      <w:r>
+        <w:rPr>
+          <w:rFonts w:ascii="Consolas" w:cs="Consolas" w:eastAsia="Consolas" w:hAnsi="Consolas"/>
+          <w:sz w:val="15"/>
+          <w:szCs w:val="15"/>
+        </w:rPr>
+        <w:t xml:space="preserve">              else                  PrdTar.tar_qty</w:t>
+      </w:r>
+    </w:p>
+    <w:p>
+      <w:pPr>
+        <w:pBdr>
+          <w:left w:val="single" w:color="8EA9DB" w:sz="12" w:space="6"/>
+        </w:pBdr>
+        <w:shd w:fill="F7F7F7" w:val="clear"/>
+        <w:spacing w:after="0" w:line="240"/>
+        <w:ind w:left="120" w:right="120"/>
+      </w:pPr>
+      <w:r>
+        <w:rPr>
+          <w:rFonts w:ascii="Consolas" w:cs="Consolas" w:eastAsia="Consolas" w:hAnsi="Consolas"/>
+          <w:sz w:val="15"/>
+          <w:szCs w:val="15"/>
+        </w:rPr>
+        <w:t xml:space="preserve">            end as abap.dec( 23, 3 ) )    as TargetBoepd,</w:t>
       </w:r>
     </w:p>
     <w:p>
@@ -7527,7 +6653,7 @@
         <w:spacing w:after="120" w:before="260"/>
       </w:pPr>
       <w:r>
-        <w:t xml:space="preserve">2.4  ZDPR_I_TARGET_FY</w:t>
+        <w:t xml:space="preserve">2.4  ZDPR_P_TARGET_ROW</w:t>
       </w:r>
     </w:p>
     <w:p>
@@ -7559,7 +6685,7 @@
           <w:sz w:val="21"/>
           <w:szCs w:val="21"/>
         </w:rPr>
-        <w:t xml:space="preserve">Annual target per fiscal year / asset / block / product (all months, volume types NET_PROD, GROSS_PROD, GAS_INJ).</w:t>
+        <w:t xml:space="preserve">Target rows scaled like the classic report: TargetVolume (barrels / MMSCM), TargetBoe, conversion factor from ZPRA_T_TAR_CF, days in fiscal year.</w:t>
       </w:r>
     </w:p>
     <w:p>
@@ -7575,6 +6701,1554 @@
           <w:sz w:val="21"/>
           <w:szCs w:val="21"/>
         </w:rPr>
+        <w:t xml:space="preserve">File: src/rap/ZDPR_P_TARGET_ROW.ddls.asddls</w:t>
+      </w:r>
+    </w:p>
+    <w:p>
+      <w:pPr>
+        <w:spacing w:after="120"/>
+      </w:pPr>
+    </w:p>
+    <w:p>
+      <w:pPr>
+        <w:pBdr>
+          <w:left w:val="single" w:color="8EA9DB" w:sz="12" w:space="6"/>
+        </w:pBdr>
+        <w:shd w:fill="F7F7F7" w:val="clear"/>
+        <w:spacing w:after="0" w:line="240"/>
+        <w:ind w:left="120" w:right="120"/>
+      </w:pPr>
+      <w:r>
+        <w:rPr>
+          <w:rFonts w:ascii="Consolas" w:cs="Consolas" w:eastAsia="Consolas" w:hAnsi="Consolas"/>
+          <w:sz w:val="15"/>
+          <w:szCs w:val="15"/>
+        </w:rPr>
+        <w:t xml:space="preserve">@AbapCatalog.viewEnhancementCategory: [#NONE]</w:t>
+      </w:r>
+    </w:p>
+    <w:p>
+      <w:pPr>
+        <w:pBdr>
+          <w:left w:val="single" w:color="8EA9DB" w:sz="12" w:space="6"/>
+        </w:pBdr>
+        <w:shd w:fill="F7F7F7" w:val="clear"/>
+        <w:spacing w:after="0" w:line="240"/>
+        <w:ind w:left="120" w:right="120"/>
+      </w:pPr>
+      <w:r>
+        <w:rPr>
+          <w:rFonts w:ascii="Consolas" w:cs="Consolas" w:eastAsia="Consolas" w:hAnsi="Consolas"/>
+          <w:sz w:val="15"/>
+          <w:szCs w:val="15"/>
+        </w:rPr>
+        <w:t xml:space="preserve">@AccessControl.authorizationCheck: #NOT_REQUIRED</w:t>
+      </w:r>
+    </w:p>
+    <w:p>
+      <w:pPr>
+        <w:pBdr>
+          <w:left w:val="single" w:color="8EA9DB" w:sz="12" w:space="6"/>
+        </w:pBdr>
+        <w:shd w:fill="F7F7F7" w:val="clear"/>
+        <w:spacing w:after="0" w:line="240"/>
+        <w:ind w:left="120" w:right="120"/>
+      </w:pPr>
+      <w:r>
+        <w:rPr>
+          <w:rFonts w:ascii="Consolas" w:cs="Consolas" w:eastAsia="Consolas" w:hAnsi="Consolas"/>
+          <w:sz w:val="15"/>
+          <w:szCs w:val="15"/>
+        </w:rPr>
+        <w:t xml:space="preserve">@EndUserText.label: 'DPR Target rows scaled (bbl/MMSCM/BOE)'</w:t>
+      </w:r>
+    </w:p>
+    <w:p>
+      <w:pPr>
+        <w:pBdr>
+          <w:left w:val="single" w:color="8EA9DB" w:sz="12" w:space="6"/>
+        </w:pBdr>
+        <w:shd w:fill="F7F7F7" w:val="clear"/>
+        <w:spacing w:after="0" w:line="240"/>
+        <w:ind w:left="120" w:right="120"/>
+      </w:pPr>
+      <w:r>
+        <w:rPr>
+          <w:rFonts w:ascii="Consolas" w:cs="Consolas" w:eastAsia="Consolas" w:hAnsi="Consolas"/>
+          <w:sz w:val="15"/>
+          <w:szCs w:val="15"/>
+        </w:rPr>
+        <w:t xml:space="preserve">@Metadata.ignorePropagatedAnnotations: true</w:t>
+      </w:r>
+    </w:p>
+    <w:p>
+      <w:pPr>
+        <w:pBdr>
+          <w:left w:val="single" w:color="8EA9DB" w:sz="12" w:space="6"/>
+        </w:pBdr>
+        <w:shd w:fill="F7F7F7" w:val="clear"/>
+        <w:spacing w:after="0" w:line="240"/>
+        <w:ind w:left="120" w:right="120"/>
+      </w:pPr>
+      <w:r>
+        <w:rPr>
+          <w:rFonts w:ascii="Consolas" w:cs="Consolas" w:eastAsia="Consolas" w:hAnsi="Consolas"/>
+          <w:sz w:val="15"/>
+          <w:szCs w:val="15"/>
+        </w:rPr>
+        <w:t xml:space="preserve"> </w:t>
+      </w:r>
+    </w:p>
+    <w:p>
+      <w:pPr>
+        <w:pBdr>
+          <w:left w:val="single" w:color="8EA9DB" w:sz="12" w:space="6"/>
+        </w:pBdr>
+        <w:shd w:fill="F7F7F7" w:val="clear"/>
+        <w:spacing w:after="0" w:line="240"/>
+        <w:ind w:left="120" w:right="120"/>
+      </w:pPr>
+      <w:r>
+        <w:rPr>
+          <w:rFonts w:ascii="Consolas" w:cs="Consolas" w:eastAsia="Consolas" w:hAnsi="Consolas"/>
+          <w:sz w:val="15"/>
+          <w:szCs w:val="15"/>
+        </w:rPr>
+        <w:t xml:space="preserve">/* ── Production target rows, scaled like the classic DPR report ────────────</w:t>
+      </w:r>
+    </w:p>
+    <w:p>
+      <w:pPr>
+        <w:pBdr>
+          <w:left w:val="single" w:color="8EA9DB" w:sz="12" w:space="6"/>
+        </w:pBdr>
+        <w:shd w:fill="F7F7F7" w:val="clear"/>
+        <w:spacing w:after="0" w:line="240"/>
+        <w:ind w:left="120" w:right="120"/>
+      </w:pPr>
+      <w:r>
+        <w:rPr>
+          <w:rFonts w:ascii="Consolas" w:cs="Consolas" w:eastAsia="Consolas" w:hAnsi="Consolas"/>
+          <w:sz w:val="15"/>
+          <w:szCs w:val="15"/>
+        </w:rPr>
+        <w:t xml:space="preserve"> * tar_qty in ZPRA_T_PRD_TAR is a MONTHLY figure in MMT (oil family) / BCM</w:t>
+      </w:r>
+    </w:p>
+    <w:p>
+      <w:pPr>
+        <w:pBdr>
+          <w:left w:val="single" w:color="8EA9DB" w:sz="12" w:space="6"/>
+        </w:pBdr>
+        <w:shd w:fill="F7F7F7" w:val="clear"/>
+        <w:spacing w:after="0" w:line="240"/>
+        <w:ind w:left="120" w:right="120"/>
+      </w:pPr>
+      <w:r>
+        <w:rPr>
+          <w:rFonts w:ascii="Consolas" w:cs="Consolas" w:eastAsia="Consolas" w:hAnsi="Consolas"/>
+          <w:sz w:val="15"/>
+          <w:szCs w:val="15"/>
+        </w:rPr>
+        <w:t xml:space="preserve"> * (gas). FORM convert_target_units of the classic report (BOPD/MMSCMD mode)</w:t>
+      </w:r>
+    </w:p>
+    <w:p>
+      <w:pPr>
+        <w:pBdr>
+          <w:left w:val="single" w:color="8EA9DB" w:sz="12" w:space="6"/>
+        </w:pBdr>
+        <w:shd w:fill="F7F7F7" w:val="clear"/>
+        <w:spacing w:after="0" w:line="240"/>
+        <w:ind w:left="120" w:right="120"/>
+      </w:pPr>
+      <w:r>
+        <w:rPr>
+          <w:rFonts w:ascii="Consolas" w:cs="Consolas" w:eastAsia="Consolas" w:hAnsi="Consolas"/>
+          <w:sz w:val="15"/>
+          <w:szCs w:val="15"/>
+        </w:rPr>
+        <w:t xml:space="preserve"> * scales it before use:</w:t>
+      </w:r>
+    </w:p>
+    <w:p>
+      <w:pPr>
+        <w:pBdr>
+          <w:left w:val="single" w:color="8EA9DB" w:sz="12" w:space="6"/>
+        </w:pBdr>
+        <w:shd w:fill="F7F7F7" w:val="clear"/>
+        <w:spacing w:after="0" w:line="240"/>
+        <w:ind w:left="120" w:right="120"/>
+      </w:pPr>
+      <w:r>
+        <w:rPr>
+          <w:rFonts w:ascii="Consolas" w:cs="Consolas" w:eastAsia="Consolas" w:hAnsi="Consolas"/>
+          <w:sz w:val="15"/>
+          <w:szCs w:val="15"/>
+        </w:rPr>
+        <w:t xml:space="preserve"> *   oil family : tar_qty * 1,000,000 * conv_factor  (MMT -&gt; barrels; the</w:t>
+      </w:r>
+    </w:p>
+    <w:p>
+      <w:pPr>
+        <w:pBdr>
+          <w:left w:val="single" w:color="8EA9DB" w:sz="12" w:space="6"/>
+        </w:pBdr>
+        <w:shd w:fill="F7F7F7" w:val="clear"/>
+        <w:spacing w:after="0" w:line="240"/>
+        <w:ind w:left="120" w:right="120"/>
+      </w:pPr>
+      <w:r>
+        <w:rPr>
+          <w:rFonts w:ascii="Consolas" w:cs="Consolas" w:eastAsia="Consolas" w:hAnsi="Consolas"/>
+          <w:sz w:val="15"/>
+          <w:szCs w:val="15"/>
+        </w:rPr>
+        <w:t xml:space="preserve"> *                factor is read from ZPRA_T_TAR_CF by gjahr/asset/block/</w:t>
+      </w:r>
+    </w:p>
+    <w:p>
+      <w:pPr>
+        <w:pBdr>
+          <w:left w:val="single" w:color="8EA9DB" w:sz="12" w:space="6"/>
+        </w:pBdr>
+        <w:shd w:fill="F7F7F7" w:val="clear"/>
+        <w:spacing w:after="0" w:line="240"/>
+        <w:ind w:left="120" w:right="120"/>
+      </w:pPr>
+      <w:r>
+        <w:rPr>
+          <w:rFonts w:ascii="Consolas" w:cs="Consolas" w:eastAsia="Consolas" w:hAnsi="Consolas"/>
+          <w:sz w:val="15"/>
+          <w:szCs w:val="15"/>
+        </w:rPr>
+        <w:t xml:space="preserve"> *                product; no row -&gt; 0, as in the report)</w:t>
+      </w:r>
+    </w:p>
+    <w:p>
+      <w:pPr>
+        <w:pBdr>
+          <w:left w:val="single" w:color="8EA9DB" w:sz="12" w:space="6"/>
+        </w:pBdr>
+        <w:shd w:fill="F7F7F7" w:val="clear"/>
+        <w:spacing w:after="0" w:line="240"/>
+        <w:ind w:left="120" w:right="120"/>
+      </w:pPr>
+      <w:r>
+        <w:rPr>
+          <w:rFonts w:ascii="Consolas" w:cs="Consolas" w:eastAsia="Consolas" w:hAnsi="Consolas"/>
+          <w:sz w:val="15"/>
+          <w:szCs w:val="15"/>
+        </w:rPr>
+        <w:t xml:space="preserve"> *   gas        : tar_qty * 1,000                    (BCM -&gt; MMSCM)</w:t>
+      </w:r>
+    </w:p>
+    <w:p>
+      <w:pPr>
+        <w:pBdr>
+          <w:left w:val="single" w:color="8EA9DB" w:sz="12" w:space="6"/>
+        </w:pBdr>
+        <w:shd w:fill="F7F7F7" w:val="clear"/>
+        <w:spacing w:after="0" w:line="240"/>
+        <w:ind w:left="120" w:right="120"/>
+      </w:pPr>
+      <w:r>
+        <w:rPr>
+          <w:rFonts w:ascii="Consolas" w:cs="Consolas" w:eastAsia="Consolas" w:hAnsi="Consolas"/>
+          <w:sz w:val="15"/>
+          <w:szCs w:val="15"/>
+        </w:rPr>
+        <w:t xml:space="preserve"> *                and * 6290 on top for barrels of oil equivalent</w:t>
+      </w:r>
+    </w:p>
+    <w:p>
+      <w:pPr>
+        <w:pBdr>
+          <w:left w:val="single" w:color="8EA9DB" w:sz="12" w:space="6"/>
+        </w:pBdr>
+        <w:shd w:fill="F7F7F7" w:val="clear"/>
+        <w:spacing w:after="0" w:line="240"/>
+        <w:ind w:left="120" w:right="120"/>
+      </w:pPr>
+      <w:r>
+        <w:rPr>
+          <w:rFonts w:ascii="Consolas" w:cs="Consolas" w:eastAsia="Consolas" w:hAnsi="Consolas"/>
+          <w:sz w:val="15"/>
+          <w:szCs w:val="15"/>
+        </w:rPr>
+        <w:t xml:space="preserve"> * Also supplies the fiscal-year calendar (FY April..March):</w:t>
+      </w:r>
+    </w:p>
+    <w:p>
+      <w:pPr>
+        <w:pBdr>
+          <w:left w:val="single" w:color="8EA9DB" w:sz="12" w:space="6"/>
+        </w:pBdr>
+        <w:shd w:fill="F7F7F7" w:val="clear"/>
+        <w:spacing w:after="0" w:line="240"/>
+        <w:ind w:left="120" w:right="120"/>
+      </w:pPr>
+      <w:r>
+        <w:rPr>
+          <w:rFonts w:ascii="Consolas" w:cs="Consolas" w:eastAsia="Consolas" w:hAnsi="Consolas"/>
+          <w:sz w:val="15"/>
+          <w:szCs w:val="15"/>
+        </w:rPr>
+        <w:t xml:space="preserve"> *   FiscalYearStart  = 1 April gjahr</w:t>
+      </w:r>
+    </w:p>
+    <w:p>
+      <w:pPr>
+        <w:pBdr>
+          <w:left w:val="single" w:color="8EA9DB" w:sz="12" w:space="6"/>
+        </w:pBdr>
+        <w:shd w:fill="F7F7F7" w:val="clear"/>
+        <w:spacing w:after="0" w:line="240"/>
+        <w:ind w:left="120" w:right="120"/>
+      </w:pPr>
+      <w:r>
+        <w:rPr>
+          <w:rFonts w:ascii="Consolas" w:cs="Consolas" w:eastAsia="Consolas" w:hAnsi="Consolas"/>
+          <w:sz w:val="15"/>
+          <w:szCs w:val="15"/>
+        </w:rPr>
+        <w:t xml:space="preserve"> *   DaysInFiscalYear = 365 / 366 - the divisor that turns the annual target</w:t>
+      </w:r>
+    </w:p>
+    <w:p>
+      <w:pPr>
+        <w:pBdr>
+          <w:left w:val="single" w:color="8EA9DB" w:sz="12" w:space="6"/>
+        </w:pBdr>
+        <w:shd w:fill="F7F7F7" w:val="clear"/>
+        <w:spacing w:after="0" w:line="240"/>
+        <w:ind w:left="120" w:right="120"/>
+      </w:pPr>
+      <w:r>
+        <w:rPr>
+          <w:rFonts w:ascii="Consolas" w:cs="Consolas" w:eastAsia="Consolas" w:hAnsi="Consolas"/>
+          <w:sz w:val="15"/>
+          <w:szCs w:val="15"/>
+        </w:rPr>
+        <w:t xml:space="preserve"> *                      into the flat "BE Target" daily rate of the graph</w:t>
+      </w:r>
+    </w:p>
+    <w:p>
+      <w:pPr>
+        <w:pBdr>
+          <w:left w:val="single" w:color="8EA9DB" w:sz="12" w:space="6"/>
+        </w:pBdr>
+        <w:shd w:fill="F7F7F7" w:val="clear"/>
+        <w:spacing w:after="0" w:line="240"/>
+        <w:ind w:left="120" w:right="120"/>
+      </w:pPr>
+      <w:r>
+        <w:rPr>
+          <w:rFonts w:ascii="Consolas" w:cs="Consolas" w:eastAsia="Consolas" w:hAnsi="Consolas"/>
+          <w:sz w:val="15"/>
+          <w:szCs w:val="15"/>
+        </w:rPr>
+        <w:t xml:space="preserve"> * Plain columns only, so ZDPR_I_TARGET_FY can SUM / GROUP BY them without</w:t>
+      </w:r>
+    </w:p>
+    <w:p>
+      <w:pPr>
+        <w:pBdr>
+          <w:left w:val="single" w:color="8EA9DB" w:sz="12" w:space="6"/>
+        </w:pBdr>
+        <w:shd w:fill="F7F7F7" w:val="clear"/>
+        <w:spacing w:after="0" w:line="240"/>
+        <w:ind w:left="120" w:right="120"/>
+      </w:pPr>
+      <w:r>
+        <w:rPr>
+          <w:rFonts w:ascii="Consolas" w:cs="Consolas" w:eastAsia="Consolas" w:hAnsi="Consolas"/>
+          <w:sz w:val="15"/>
+          <w:szCs w:val="15"/>
+        </w:rPr>
+        <w:t xml:space="preserve"> * CASE expressions (rejected by the target release inside aggregates).</w:t>
+      </w:r>
+    </w:p>
+    <w:p>
+      <w:pPr>
+        <w:pBdr>
+          <w:left w:val="single" w:color="8EA9DB" w:sz="12" w:space="6"/>
+        </w:pBdr>
+        <w:shd w:fill="F7F7F7" w:val="clear"/>
+        <w:spacing w:after="0" w:line="240"/>
+        <w:ind w:left="120" w:right="120"/>
+      </w:pPr>
+      <w:r>
+        <w:rPr>
+          <w:rFonts w:ascii="Consolas" w:cs="Consolas" w:eastAsia="Consolas" w:hAnsi="Consolas"/>
+          <w:sz w:val="15"/>
+          <w:szCs w:val="15"/>
+        </w:rPr>
+        <w:t xml:space="preserve"> * Stand-alone on the tables on purpose: it does not depend on ZDPR_I_TARGET.</w:t>
+      </w:r>
+    </w:p>
+    <w:p>
+      <w:pPr>
+        <w:pBdr>
+          <w:left w:val="single" w:color="8EA9DB" w:sz="12" w:space="6"/>
+        </w:pBdr>
+        <w:shd w:fill="F7F7F7" w:val="clear"/>
+        <w:spacing w:after="0" w:line="240"/>
+        <w:ind w:left="120" w:right="120"/>
+      </w:pPr>
+      <w:r>
+        <w:rPr>
+          <w:rFonts w:ascii="Consolas" w:cs="Consolas" w:eastAsia="Consolas" w:hAnsi="Consolas"/>
+          <w:sz w:val="15"/>
+          <w:szCs w:val="15"/>
+        </w:rPr>
+        <w:t xml:space="preserve"> * ─────────────────────────────────────────────────────────────────────────── */</w:t>
+      </w:r>
+    </w:p>
+    <w:p>
+      <w:pPr>
+        <w:pBdr>
+          <w:left w:val="single" w:color="8EA9DB" w:sz="12" w:space="6"/>
+        </w:pBdr>
+        <w:shd w:fill="F7F7F7" w:val="clear"/>
+        <w:spacing w:after="0" w:line="240"/>
+        <w:ind w:left="120" w:right="120"/>
+      </w:pPr>
+      <w:r>
+        <w:rPr>
+          <w:rFonts w:ascii="Consolas" w:cs="Consolas" w:eastAsia="Consolas" w:hAnsi="Consolas"/>
+          <w:sz w:val="15"/>
+          <w:szCs w:val="15"/>
+        </w:rPr>
+        <w:t xml:space="preserve">define view entity ZDPR_P_TARGET_ROW</w:t>
+      </w:r>
+    </w:p>
+    <w:p>
+      <w:pPr>
+        <w:pBdr>
+          <w:left w:val="single" w:color="8EA9DB" w:sz="12" w:space="6"/>
+        </w:pBdr>
+        <w:shd w:fill="F7F7F7" w:val="clear"/>
+        <w:spacing w:after="0" w:line="240"/>
+        <w:ind w:left="120" w:right="120"/>
+      </w:pPr>
+      <w:r>
+        <w:rPr>
+          <w:rFonts w:ascii="Consolas" w:cs="Consolas" w:eastAsia="Consolas" w:hAnsi="Consolas"/>
+          <w:sz w:val="15"/>
+          <w:szCs w:val="15"/>
+        </w:rPr>
+        <w:t xml:space="preserve">  as select from zpra_t_prd_tar as PrdTar</w:t>
+      </w:r>
+    </w:p>
+    <w:p>
+      <w:pPr>
+        <w:pBdr>
+          <w:left w:val="single" w:color="8EA9DB" w:sz="12" w:space="6"/>
+        </w:pBdr>
+        <w:shd w:fill="F7F7F7" w:val="clear"/>
+        <w:spacing w:after="0" w:line="240"/>
+        <w:ind w:left="120" w:right="120"/>
+      </w:pPr>
+      <w:r>
+        <w:rPr>
+          <w:rFonts w:ascii="Consolas" w:cs="Consolas" w:eastAsia="Consolas" w:hAnsi="Consolas"/>
+          <w:sz w:val="15"/>
+          <w:szCs w:val="15"/>
+        </w:rPr>
+        <w:t xml:space="preserve"> </w:t>
+      </w:r>
+    </w:p>
+    <w:p>
+      <w:pPr>
+        <w:pBdr>
+          <w:left w:val="single" w:color="8EA9DB" w:sz="12" w:space="6"/>
+        </w:pBdr>
+        <w:shd w:fill="F7F7F7" w:val="clear"/>
+        <w:spacing w:after="0" w:line="240"/>
+        <w:ind w:left="120" w:right="120"/>
+      </w:pPr>
+      <w:r>
+        <w:rPr>
+          <w:rFonts w:ascii="Consolas" w:cs="Consolas" w:eastAsia="Consolas" w:hAnsi="Consolas"/>
+          <w:sz w:val="15"/>
+          <w:szCs w:val="15"/>
+        </w:rPr>
+        <w:t xml:space="preserve">  left outer join zpra_t_tar_cf as Cf</w:t>
+      </w:r>
+    </w:p>
+    <w:p>
+      <w:pPr>
+        <w:pBdr>
+          <w:left w:val="single" w:color="8EA9DB" w:sz="12" w:space="6"/>
+        </w:pBdr>
+        <w:shd w:fill="F7F7F7" w:val="clear"/>
+        <w:spacing w:after="0" w:line="240"/>
+        <w:ind w:left="120" w:right="120"/>
+      </w:pPr>
+      <w:r>
+        <w:rPr>
+          <w:rFonts w:ascii="Consolas" w:cs="Consolas" w:eastAsia="Consolas" w:hAnsi="Consolas"/>
+          <w:sz w:val="15"/>
+          <w:szCs w:val="15"/>
+        </w:rPr>
+        <w:t xml:space="preserve">    on  Cf.gjahr   = PrdTar.gjahr</w:t>
+      </w:r>
+    </w:p>
+    <w:p>
+      <w:pPr>
+        <w:pBdr>
+          <w:left w:val="single" w:color="8EA9DB" w:sz="12" w:space="6"/>
+        </w:pBdr>
+        <w:shd w:fill="F7F7F7" w:val="clear"/>
+        <w:spacing w:after="0" w:line="240"/>
+        <w:ind w:left="120" w:right="120"/>
+      </w:pPr>
+      <w:r>
+        <w:rPr>
+          <w:rFonts w:ascii="Consolas" w:cs="Consolas" w:eastAsia="Consolas" w:hAnsi="Consolas"/>
+          <w:sz w:val="15"/>
+          <w:szCs w:val="15"/>
+        </w:rPr>
+        <w:t xml:space="preserve">    and Cf.asset   = PrdTar.asset</w:t>
+      </w:r>
+    </w:p>
+    <w:p>
+      <w:pPr>
+        <w:pBdr>
+          <w:left w:val="single" w:color="8EA9DB" w:sz="12" w:space="6"/>
+        </w:pBdr>
+        <w:shd w:fill="F7F7F7" w:val="clear"/>
+        <w:spacing w:after="0" w:line="240"/>
+        <w:ind w:left="120" w:right="120"/>
+      </w:pPr>
+      <w:r>
+        <w:rPr>
+          <w:rFonts w:ascii="Consolas" w:cs="Consolas" w:eastAsia="Consolas" w:hAnsi="Consolas"/>
+          <w:sz w:val="15"/>
+          <w:szCs w:val="15"/>
+        </w:rPr>
+        <w:t xml:space="preserve">    and Cf.block   = PrdTar.block</w:t>
+      </w:r>
+    </w:p>
+    <w:p>
+      <w:pPr>
+        <w:pBdr>
+          <w:left w:val="single" w:color="8EA9DB" w:sz="12" w:space="6"/>
+        </w:pBdr>
+        <w:shd w:fill="F7F7F7" w:val="clear"/>
+        <w:spacing w:after="0" w:line="240"/>
+        <w:ind w:left="120" w:right="120"/>
+      </w:pPr>
+      <w:r>
+        <w:rPr>
+          <w:rFonts w:ascii="Consolas" w:cs="Consolas" w:eastAsia="Consolas" w:hAnsi="Consolas"/>
+          <w:sz w:val="15"/>
+          <w:szCs w:val="15"/>
+        </w:rPr>
+        <w:t xml:space="preserve">    and Cf.product = PrdTar.product</w:t>
+      </w:r>
+    </w:p>
+    <w:p>
+      <w:pPr>
+        <w:pBdr>
+          <w:left w:val="single" w:color="8EA9DB" w:sz="12" w:space="6"/>
+        </w:pBdr>
+        <w:shd w:fill="F7F7F7" w:val="clear"/>
+        <w:spacing w:after="0" w:line="240"/>
+        <w:ind w:left="120" w:right="120"/>
+      </w:pPr>
+      <w:r>
+        <w:rPr>
+          <w:rFonts w:ascii="Consolas" w:cs="Consolas" w:eastAsia="Consolas" w:hAnsi="Consolas"/>
+          <w:sz w:val="15"/>
+          <w:szCs w:val="15"/>
+        </w:rPr>
+        <w:t xml:space="preserve"> </w:t>
+      </w:r>
+    </w:p>
+    <w:p>
+      <w:pPr>
+        <w:pBdr>
+          <w:left w:val="single" w:color="8EA9DB" w:sz="12" w:space="6"/>
+        </w:pBdr>
+        <w:shd w:fill="F7F7F7" w:val="clear"/>
+        <w:spacing w:after="0" w:line="240"/>
+        <w:ind w:left="120" w:right="120"/>
+      </w:pPr>
+      <w:r>
+        <w:rPr>
+          <w:rFonts w:ascii="Consolas" w:cs="Consolas" w:eastAsia="Consolas" w:hAnsi="Consolas"/>
+          <w:sz w:val="15"/>
+          <w:szCs w:val="15"/>
+        </w:rPr>
+        <w:t xml:space="preserve">{</w:t>
+      </w:r>
+    </w:p>
+    <w:p>
+      <w:pPr>
+        <w:pBdr>
+          <w:left w:val="single" w:color="8EA9DB" w:sz="12" w:space="6"/>
+        </w:pBdr>
+        <w:shd w:fill="F7F7F7" w:val="clear"/>
+        <w:spacing w:after="0" w:line="240"/>
+        <w:ind w:left="120" w:right="120"/>
+      </w:pPr>
+      <w:r>
+        <w:rPr>
+          <w:rFonts w:ascii="Consolas" w:cs="Consolas" w:eastAsia="Consolas" w:hAnsi="Consolas"/>
+          <w:sz w:val="15"/>
+          <w:szCs w:val="15"/>
+        </w:rPr>
+        <w:t xml:space="preserve">  key PrdTar.tar_code                     as TargetCode,</w:t>
+      </w:r>
+    </w:p>
+    <w:p>
+      <w:pPr>
+        <w:pBdr>
+          <w:left w:val="single" w:color="8EA9DB" w:sz="12" w:space="6"/>
+        </w:pBdr>
+        <w:shd w:fill="F7F7F7" w:val="clear"/>
+        <w:spacing w:after="0" w:line="240"/>
+        <w:ind w:left="120" w:right="120"/>
+      </w:pPr>
+      <w:r>
+        <w:rPr>
+          <w:rFonts w:ascii="Consolas" w:cs="Consolas" w:eastAsia="Consolas" w:hAnsi="Consolas"/>
+          <w:sz w:val="15"/>
+          <w:szCs w:val="15"/>
+        </w:rPr>
+        <w:t xml:space="preserve">  key PrdTar.gjahr                        as FiscalYear,</w:t>
+      </w:r>
+    </w:p>
+    <w:p>
+      <w:pPr>
+        <w:pBdr>
+          <w:left w:val="single" w:color="8EA9DB" w:sz="12" w:space="6"/>
+        </w:pBdr>
+        <w:shd w:fill="F7F7F7" w:val="clear"/>
+        <w:spacing w:after="0" w:line="240"/>
+        <w:ind w:left="120" w:right="120"/>
+      </w:pPr>
+      <w:r>
+        <w:rPr>
+          <w:rFonts w:ascii="Consolas" w:cs="Consolas" w:eastAsia="Consolas" w:hAnsi="Consolas"/>
+          <w:sz w:val="15"/>
+          <w:szCs w:val="15"/>
+        </w:rPr>
+        <w:t xml:space="preserve">  key PrdTar.monat                        as FiscalPeriod,</w:t>
+      </w:r>
+    </w:p>
+    <w:p>
+      <w:pPr>
+        <w:pBdr>
+          <w:left w:val="single" w:color="8EA9DB" w:sz="12" w:space="6"/>
+        </w:pBdr>
+        <w:shd w:fill="F7F7F7" w:val="clear"/>
+        <w:spacing w:after="0" w:line="240"/>
+        <w:ind w:left="120" w:right="120"/>
+      </w:pPr>
+      <w:r>
+        <w:rPr>
+          <w:rFonts w:ascii="Consolas" w:cs="Consolas" w:eastAsia="Consolas" w:hAnsi="Consolas"/>
+          <w:sz w:val="15"/>
+          <w:szCs w:val="15"/>
+        </w:rPr>
+        <w:t xml:space="preserve">  key PrdTar.asset                        as Asset,</w:t>
+      </w:r>
+    </w:p>
+    <w:p>
+      <w:pPr>
+        <w:pBdr>
+          <w:left w:val="single" w:color="8EA9DB" w:sz="12" w:space="6"/>
+        </w:pBdr>
+        <w:shd w:fill="F7F7F7" w:val="clear"/>
+        <w:spacing w:after="0" w:line="240"/>
+        <w:ind w:left="120" w:right="120"/>
+      </w:pPr>
+      <w:r>
+        <w:rPr>
+          <w:rFonts w:ascii="Consolas" w:cs="Consolas" w:eastAsia="Consolas" w:hAnsi="Consolas"/>
+          <w:sz w:val="15"/>
+          <w:szCs w:val="15"/>
+        </w:rPr>
+        <w:t xml:space="preserve">  key PrdTar.block                        as Block,</w:t>
+      </w:r>
+    </w:p>
+    <w:p>
+      <w:pPr>
+        <w:pBdr>
+          <w:left w:val="single" w:color="8EA9DB" w:sz="12" w:space="6"/>
+        </w:pBdr>
+        <w:shd w:fill="F7F7F7" w:val="clear"/>
+        <w:spacing w:after="0" w:line="240"/>
+        <w:ind w:left="120" w:right="120"/>
+      </w:pPr>
+      <w:r>
+        <w:rPr>
+          <w:rFonts w:ascii="Consolas" w:cs="Consolas" w:eastAsia="Consolas" w:hAnsi="Consolas"/>
+          <w:sz w:val="15"/>
+          <w:szCs w:val="15"/>
+        </w:rPr>
+        <w:t xml:space="preserve">  key PrdTar.product                      as Product,</w:t>
+      </w:r>
+    </w:p>
+    <w:p>
+      <w:pPr>
+        <w:pBdr>
+          <w:left w:val="single" w:color="8EA9DB" w:sz="12" w:space="6"/>
+        </w:pBdr>
+        <w:shd w:fill="F7F7F7" w:val="clear"/>
+        <w:spacing w:after="0" w:line="240"/>
+        <w:ind w:left="120" w:right="120"/>
+      </w:pPr>
+      <w:r>
+        <w:rPr>
+          <w:rFonts w:ascii="Consolas" w:cs="Consolas" w:eastAsia="Consolas" w:hAnsi="Consolas"/>
+          <w:sz w:val="15"/>
+          <w:szCs w:val="15"/>
+        </w:rPr>
+        <w:t xml:space="preserve">  key PrdTar.prod_vl_type_cd              as VolumeType,</w:t>
+      </w:r>
+    </w:p>
+    <w:p>
+      <w:pPr>
+        <w:pBdr>
+          <w:left w:val="single" w:color="8EA9DB" w:sz="12" w:space="6"/>
+        </w:pBdr>
+        <w:shd w:fill="F7F7F7" w:val="clear"/>
+        <w:spacing w:after="0" w:line="240"/>
+        <w:ind w:left="120" w:right="120"/>
+      </w:pPr>
+      <w:r>
+        <w:rPr>
+          <w:rFonts w:ascii="Consolas" w:cs="Consolas" w:eastAsia="Consolas" w:hAnsi="Consolas"/>
+          <w:sz w:val="15"/>
+          <w:szCs w:val="15"/>
+        </w:rPr>
+        <w:t xml:space="preserve"> </w:t>
+      </w:r>
+    </w:p>
+    <w:p>
+      <w:pPr>
+        <w:pBdr>
+          <w:left w:val="single" w:color="8EA9DB" w:sz="12" w:space="6"/>
+        </w:pBdr>
+        <w:shd w:fill="F7F7F7" w:val="clear"/>
+        <w:spacing w:after="0" w:line="240"/>
+        <w:ind w:left="120" w:right="120"/>
+      </w:pPr>
+      <w:r>
+        <w:rPr>
+          <w:rFonts w:ascii="Consolas" w:cs="Consolas" w:eastAsia="Consolas" w:hAnsi="Consolas"/>
+          <w:sz w:val="15"/>
+          <w:szCs w:val="15"/>
+        </w:rPr>
+        <w:t xml:space="preserve">      PrdTar.tar_qty                      as TargetQty,</w:t>
+      </w:r>
+    </w:p>
+    <w:p>
+      <w:pPr>
+        <w:pBdr>
+          <w:left w:val="single" w:color="8EA9DB" w:sz="12" w:space="6"/>
+        </w:pBdr>
+        <w:shd w:fill="F7F7F7" w:val="clear"/>
+        <w:spacing w:after="0" w:line="240"/>
+        <w:ind w:left="120" w:right="120"/>
+      </w:pPr>
+      <w:r>
+        <w:rPr>
+          <w:rFonts w:ascii="Consolas" w:cs="Consolas" w:eastAsia="Consolas" w:hAnsi="Consolas"/>
+          <w:sz w:val="15"/>
+          <w:szCs w:val="15"/>
+        </w:rPr>
+        <w:t xml:space="preserve">      PrdTar.uom                          as TargetUom,</w:t>
+      </w:r>
+    </w:p>
+    <w:p>
+      <w:pPr>
+        <w:pBdr>
+          <w:left w:val="single" w:color="8EA9DB" w:sz="12" w:space="6"/>
+        </w:pBdr>
+        <w:shd w:fill="F7F7F7" w:val="clear"/>
+        <w:spacing w:after="0" w:line="240"/>
+        <w:ind w:left="120" w:right="120"/>
+      </w:pPr>
+      <w:r>
+        <w:rPr>
+          <w:rFonts w:ascii="Consolas" w:cs="Consolas" w:eastAsia="Consolas" w:hAnsi="Consolas"/>
+          <w:sz w:val="15"/>
+          <w:szCs w:val="15"/>
+        </w:rPr>
+        <w:t xml:space="preserve"> </w:t>
+      </w:r>
+    </w:p>
+    <w:p>
+      <w:pPr>
+        <w:pBdr>
+          <w:left w:val="single" w:color="8EA9DB" w:sz="12" w:space="6"/>
+        </w:pBdr>
+        <w:shd w:fill="F7F7F7" w:val="clear"/>
+        <w:spacing w:after="0" w:line="240"/>
+        <w:ind w:left="120" w:right="120"/>
+      </w:pPr>
+      <w:r>
+        <w:rPr>
+          <w:rFonts w:ascii="Consolas" w:cs="Consolas" w:eastAsia="Consolas" w:hAnsi="Consolas"/>
+          <w:sz w:val="15"/>
+          <w:szCs w:val="15"/>
+        </w:rPr>
+        <w:t xml:space="preserve">      case PrdTar.product</w:t>
+      </w:r>
+    </w:p>
+    <w:p>
+      <w:pPr>
+        <w:pBdr>
+          <w:left w:val="single" w:color="8EA9DB" w:sz="12" w:space="6"/>
+        </w:pBdr>
+        <w:shd w:fill="F7F7F7" w:val="clear"/>
+        <w:spacing w:after="0" w:line="240"/>
+        <w:ind w:left="120" w:right="120"/>
+      </w:pPr>
+      <w:r>
+        <w:rPr>
+          <w:rFonts w:ascii="Consolas" w:cs="Consolas" w:eastAsia="Consolas" w:hAnsi="Consolas"/>
+          <w:sz w:val="15"/>
+          <w:szCs w:val="15"/>
+        </w:rPr>
+        <w:t xml:space="preserve">        when '722000004' then 'GAS'</w:t>
+      </w:r>
+    </w:p>
+    <w:p>
+      <w:pPr>
+        <w:pBdr>
+          <w:left w:val="single" w:color="8EA9DB" w:sz="12" w:space="6"/>
+        </w:pBdr>
+        <w:shd w:fill="F7F7F7" w:val="clear"/>
+        <w:spacing w:after="0" w:line="240"/>
+        <w:ind w:left="120" w:right="120"/>
+      </w:pPr>
+      <w:r>
+        <w:rPr>
+          <w:rFonts w:ascii="Consolas" w:cs="Consolas" w:eastAsia="Consolas" w:hAnsi="Consolas"/>
+          <w:sz w:val="15"/>
+          <w:szCs w:val="15"/>
+        </w:rPr>
+        <w:t xml:space="preserve">        else                  'OIL'</w:t>
+      </w:r>
+    </w:p>
+    <w:p>
+      <w:pPr>
+        <w:pBdr>
+          <w:left w:val="single" w:color="8EA9DB" w:sz="12" w:space="6"/>
+        </w:pBdr>
+        <w:shd w:fill="F7F7F7" w:val="clear"/>
+        <w:spacing w:after="0" w:line="240"/>
+        <w:ind w:left="120" w:right="120"/>
+      </w:pPr>
+      <w:r>
+        <w:rPr>
+          <w:rFonts w:ascii="Consolas" w:cs="Consolas" w:eastAsia="Consolas" w:hAnsi="Consolas"/>
+          <w:sz w:val="15"/>
+          <w:szCs w:val="15"/>
+        </w:rPr>
+        <w:t xml:space="preserve">      end                                 as ProductGroup,</w:t>
+      </w:r>
+    </w:p>
+    <w:p>
+      <w:pPr>
+        <w:pBdr>
+          <w:left w:val="single" w:color="8EA9DB" w:sz="12" w:space="6"/>
+        </w:pBdr>
+        <w:shd w:fill="F7F7F7" w:val="clear"/>
+        <w:spacing w:after="0" w:line="240"/>
+        <w:ind w:left="120" w:right="120"/>
+      </w:pPr>
+      <w:r>
+        <w:rPr>
+          <w:rFonts w:ascii="Consolas" w:cs="Consolas" w:eastAsia="Consolas" w:hAnsi="Consolas"/>
+          <w:sz w:val="15"/>
+          <w:szCs w:val="15"/>
+        </w:rPr>
+        <w:t xml:space="preserve"> </w:t>
+      </w:r>
+    </w:p>
+    <w:p>
+      <w:pPr>
+        <w:pBdr>
+          <w:left w:val="single" w:color="8EA9DB" w:sz="12" w:space="6"/>
+        </w:pBdr>
+        <w:shd w:fill="F7F7F7" w:val="clear"/>
+        <w:spacing w:after="0" w:line="240"/>
+        <w:ind w:left="120" w:right="120"/>
+      </w:pPr>
+      <w:r>
+        <w:rPr>
+          <w:rFonts w:ascii="Consolas" w:cs="Consolas" w:eastAsia="Consolas" w:hAnsi="Consolas"/>
+          <w:sz w:val="15"/>
+          <w:szCs w:val="15"/>
+        </w:rPr>
+        <w:t xml:space="preserve">      /* MMT -&gt; barrels factor of the fiscal year (0 when missing) */</w:t>
+      </w:r>
+    </w:p>
+    <w:p>
+      <w:pPr>
+        <w:pBdr>
+          <w:left w:val="single" w:color="8EA9DB" w:sz="12" w:space="6"/>
+        </w:pBdr>
+        <w:shd w:fill="F7F7F7" w:val="clear"/>
+        <w:spacing w:after="0" w:line="240"/>
+        <w:ind w:left="120" w:right="120"/>
+      </w:pPr>
+      <w:r>
+        <w:rPr>
+          <w:rFonts w:ascii="Consolas" w:cs="Consolas" w:eastAsia="Consolas" w:hAnsi="Consolas"/>
+          <w:sz w:val="15"/>
+          <w:szCs w:val="15"/>
+        </w:rPr>
+        <w:t xml:space="preserve">      cast( coalesce( cast( Cf.conv_factor as abap.dec( 15, 7 ) ),</w:t>
+      </w:r>
+    </w:p>
+    <w:p>
+      <w:pPr>
+        <w:pBdr>
+          <w:left w:val="single" w:color="8EA9DB" w:sz="12" w:space="6"/>
+        </w:pBdr>
+        <w:shd w:fill="F7F7F7" w:val="clear"/>
+        <w:spacing w:after="0" w:line="240"/>
+        <w:ind w:left="120" w:right="120"/>
+      </w:pPr>
+      <w:r>
+        <w:rPr>
+          <w:rFonts w:ascii="Consolas" w:cs="Consolas" w:eastAsia="Consolas" w:hAnsi="Consolas"/>
+          <w:sz w:val="15"/>
+          <w:szCs w:val="15"/>
+        </w:rPr>
+        <w:t xml:space="preserve">                      cast( 0 as abap.dec( 15, 7 ) ) )</w:t>
+      </w:r>
+    </w:p>
+    <w:p>
+      <w:pPr>
+        <w:pBdr>
+          <w:left w:val="single" w:color="8EA9DB" w:sz="12" w:space="6"/>
+        </w:pBdr>
+        <w:shd w:fill="F7F7F7" w:val="clear"/>
+        <w:spacing w:after="0" w:line="240"/>
+        <w:ind w:left="120" w:right="120"/>
+      </w:pPr>
+      <w:r>
+        <w:rPr>
+          <w:rFonts w:ascii="Consolas" w:cs="Consolas" w:eastAsia="Consolas" w:hAnsi="Consolas"/>
+          <w:sz w:val="15"/>
+          <w:szCs w:val="15"/>
+        </w:rPr>
+        <w:t xml:space="preserve">            as abap.dec( 15, 7 ) )        as ConversionFactor,</w:t>
+      </w:r>
+    </w:p>
+    <w:p>
+      <w:pPr>
+        <w:pBdr>
+          <w:left w:val="single" w:color="8EA9DB" w:sz="12" w:space="6"/>
+        </w:pBdr>
+        <w:shd w:fill="F7F7F7" w:val="clear"/>
+        <w:spacing w:after="0" w:line="240"/>
+        <w:ind w:left="120" w:right="120"/>
+      </w:pPr>
+      <w:r>
+        <w:rPr>
+          <w:rFonts w:ascii="Consolas" w:cs="Consolas" w:eastAsia="Consolas" w:hAnsi="Consolas"/>
+          <w:sz w:val="15"/>
+          <w:szCs w:val="15"/>
+        </w:rPr>
+        <w:t xml:space="preserve"> </w:t>
+      </w:r>
+    </w:p>
+    <w:p>
+      <w:pPr>
+        <w:pBdr>
+          <w:left w:val="single" w:color="8EA9DB" w:sz="12" w:space="6"/>
+        </w:pBdr>
+        <w:shd w:fill="F7F7F7" w:val="clear"/>
+        <w:spacing w:after="0" w:line="240"/>
+        <w:ind w:left="120" w:right="120"/>
+      </w:pPr>
+      <w:r>
+        <w:rPr>
+          <w:rFonts w:ascii="Consolas" w:cs="Consolas" w:eastAsia="Consolas" w:hAnsi="Consolas"/>
+          <w:sz w:val="15"/>
+          <w:szCs w:val="15"/>
+        </w:rPr>
+        <w:t xml:space="preserve">      /* monthly target volume: barrels (oil family) / MMSCM (gas) */</w:t>
+      </w:r>
+    </w:p>
+    <w:p>
+      <w:pPr>
+        <w:pBdr>
+          <w:left w:val="single" w:color="8EA9DB" w:sz="12" w:space="6"/>
+        </w:pBdr>
+        <w:shd w:fill="F7F7F7" w:val="clear"/>
+        <w:spacing w:after="0" w:line="240"/>
+        <w:ind w:left="120" w:right="120"/>
+      </w:pPr>
+      <w:r>
+        <w:rPr>
+          <w:rFonts w:ascii="Consolas" w:cs="Consolas" w:eastAsia="Consolas" w:hAnsi="Consolas"/>
+          <w:sz w:val="15"/>
+          <w:szCs w:val="15"/>
+        </w:rPr>
+        <w:t xml:space="preserve">      cast( case PrdTar.product</w:t>
+      </w:r>
+    </w:p>
+    <w:p>
+      <w:pPr>
+        <w:pBdr>
+          <w:left w:val="single" w:color="8EA9DB" w:sz="12" w:space="6"/>
+        </w:pBdr>
+        <w:shd w:fill="F7F7F7" w:val="clear"/>
+        <w:spacing w:after="0" w:line="240"/>
+        <w:ind w:left="120" w:right="120"/>
+      </w:pPr>
+      <w:r>
+        <w:rPr>
+          <w:rFonts w:ascii="Consolas" w:cs="Consolas" w:eastAsia="Consolas" w:hAnsi="Consolas"/>
+          <w:sz w:val="15"/>
+          <w:szCs w:val="15"/>
+        </w:rPr>
+        <w:t xml:space="preserve">              when '722000004' then PrdTar.tar_qty * cast( 1000 as abap.dec( 10, 0 ) )</w:t>
+      </w:r>
+    </w:p>
+    <w:p>
+      <w:pPr>
+        <w:pBdr>
+          <w:left w:val="single" w:color="8EA9DB" w:sz="12" w:space="6"/>
+        </w:pBdr>
+        <w:shd w:fill="F7F7F7" w:val="clear"/>
+        <w:spacing w:after="0" w:line="240"/>
+        <w:ind w:left="120" w:right="120"/>
+      </w:pPr>
+      <w:r>
+        <w:rPr>
+          <w:rFonts w:ascii="Consolas" w:cs="Consolas" w:eastAsia="Consolas" w:hAnsi="Consolas"/>
+          <w:sz w:val="15"/>
+          <w:szCs w:val="15"/>
+        </w:rPr>
+        <w:t xml:space="preserve">              else                  PrdTar.tar_qty * cast( 1000000 as abap.dec( 10, 0 ) )</w:t>
+      </w:r>
+    </w:p>
+    <w:p>
+      <w:pPr>
+        <w:pBdr>
+          <w:left w:val="single" w:color="8EA9DB" w:sz="12" w:space="6"/>
+        </w:pBdr>
+        <w:shd w:fill="F7F7F7" w:val="clear"/>
+        <w:spacing w:after="0" w:line="240"/>
+        <w:ind w:left="120" w:right="120"/>
+      </w:pPr>
+      <w:r>
+        <w:rPr>
+          <w:rFonts w:ascii="Consolas" w:cs="Consolas" w:eastAsia="Consolas" w:hAnsi="Consolas"/>
+          <w:sz w:val="15"/>
+          <w:szCs w:val="15"/>
+        </w:rPr>
+        <w:t xml:space="preserve">                                    * coalesce( cast( Cf.conv_factor as abap.dec( 15, 7 ) ),</w:t>
+      </w:r>
+    </w:p>
+    <w:p>
+      <w:pPr>
+        <w:pBdr>
+          <w:left w:val="single" w:color="8EA9DB" w:sz="12" w:space="6"/>
+        </w:pBdr>
+        <w:shd w:fill="F7F7F7" w:val="clear"/>
+        <w:spacing w:after="0" w:line="240"/>
+        <w:ind w:left="120" w:right="120"/>
+      </w:pPr>
+      <w:r>
+        <w:rPr>
+          <w:rFonts w:ascii="Consolas" w:cs="Consolas" w:eastAsia="Consolas" w:hAnsi="Consolas"/>
+          <w:sz w:val="15"/>
+          <w:szCs w:val="15"/>
+        </w:rPr>
+        <w:t xml:space="preserve">                                                cast( 0 as abap.dec( 15, 7 ) ) )</w:t>
+      </w:r>
+    </w:p>
+    <w:p>
+      <w:pPr>
+        <w:pBdr>
+          <w:left w:val="single" w:color="8EA9DB" w:sz="12" w:space="6"/>
+        </w:pBdr>
+        <w:shd w:fill="F7F7F7" w:val="clear"/>
+        <w:spacing w:after="0" w:line="240"/>
+        <w:ind w:left="120" w:right="120"/>
+      </w:pPr>
+      <w:r>
+        <w:rPr>
+          <w:rFonts w:ascii="Consolas" w:cs="Consolas" w:eastAsia="Consolas" w:hAnsi="Consolas"/>
+          <w:sz w:val="15"/>
+          <w:szCs w:val="15"/>
+        </w:rPr>
+        <w:t xml:space="preserve">            end as abap.dec( 23, 3 ) )    as TargetVolume,</w:t>
+      </w:r>
+    </w:p>
+    <w:p>
+      <w:pPr>
+        <w:pBdr>
+          <w:left w:val="single" w:color="8EA9DB" w:sz="12" w:space="6"/>
+        </w:pBdr>
+        <w:shd w:fill="F7F7F7" w:val="clear"/>
+        <w:spacing w:after="0" w:line="240"/>
+        <w:ind w:left="120" w:right="120"/>
+      </w:pPr>
+      <w:r>
+        <w:rPr>
+          <w:rFonts w:ascii="Consolas" w:cs="Consolas" w:eastAsia="Consolas" w:hAnsi="Consolas"/>
+          <w:sz w:val="15"/>
+          <w:szCs w:val="15"/>
+        </w:rPr>
+        <w:t xml:space="preserve"> </w:t>
+      </w:r>
+    </w:p>
+    <w:p>
+      <w:pPr>
+        <w:pBdr>
+          <w:left w:val="single" w:color="8EA9DB" w:sz="12" w:space="6"/>
+        </w:pBdr>
+        <w:shd w:fill="F7F7F7" w:val="clear"/>
+        <w:spacing w:after="0" w:line="240"/>
+        <w:ind w:left="120" w:right="120"/>
+      </w:pPr>
+      <w:r>
+        <w:rPr>
+          <w:rFonts w:ascii="Consolas" w:cs="Consolas" w:eastAsia="Consolas" w:hAnsi="Consolas"/>
+          <w:sz w:val="15"/>
+          <w:szCs w:val="15"/>
+        </w:rPr>
+        <w:t xml:space="preserve">      /* monthly target in barrels of oil equivalent (gas: MMSCM x 6290) */</w:t>
+      </w:r>
+    </w:p>
+    <w:p>
+      <w:pPr>
+        <w:pBdr>
+          <w:left w:val="single" w:color="8EA9DB" w:sz="12" w:space="6"/>
+        </w:pBdr>
+        <w:shd w:fill="F7F7F7" w:val="clear"/>
+        <w:spacing w:after="0" w:line="240"/>
+        <w:ind w:left="120" w:right="120"/>
+      </w:pPr>
+      <w:r>
+        <w:rPr>
+          <w:rFonts w:ascii="Consolas" w:cs="Consolas" w:eastAsia="Consolas" w:hAnsi="Consolas"/>
+          <w:sz w:val="15"/>
+          <w:szCs w:val="15"/>
+        </w:rPr>
+        <w:t xml:space="preserve">      cast( case PrdTar.product</w:t>
+      </w:r>
+    </w:p>
+    <w:p>
+      <w:pPr>
+        <w:pBdr>
+          <w:left w:val="single" w:color="8EA9DB" w:sz="12" w:space="6"/>
+        </w:pBdr>
+        <w:shd w:fill="F7F7F7" w:val="clear"/>
+        <w:spacing w:after="0" w:line="240"/>
+        <w:ind w:left="120" w:right="120"/>
+      </w:pPr>
+      <w:r>
+        <w:rPr>
+          <w:rFonts w:ascii="Consolas" w:cs="Consolas" w:eastAsia="Consolas" w:hAnsi="Consolas"/>
+          <w:sz w:val="15"/>
+          <w:szCs w:val="15"/>
+        </w:rPr>
+        <w:t xml:space="preserve">              when '722000004' then PrdTar.tar_qty * cast( 1000 as abap.dec( 10, 0 ) )</w:t>
+      </w:r>
+    </w:p>
+    <w:p>
+      <w:pPr>
+        <w:pBdr>
+          <w:left w:val="single" w:color="8EA9DB" w:sz="12" w:space="6"/>
+        </w:pBdr>
+        <w:shd w:fill="F7F7F7" w:val="clear"/>
+        <w:spacing w:after="0" w:line="240"/>
+        <w:ind w:left="120" w:right="120"/>
+      </w:pPr>
+      <w:r>
+        <w:rPr>
+          <w:rFonts w:ascii="Consolas" w:cs="Consolas" w:eastAsia="Consolas" w:hAnsi="Consolas"/>
+          <w:sz w:val="15"/>
+          <w:szCs w:val="15"/>
+        </w:rPr>
+        <w:t xml:space="preserve">                                    * cast( 6290 as abap.dec( 5, 0 ) )</w:t>
+      </w:r>
+    </w:p>
+    <w:p>
+      <w:pPr>
+        <w:pBdr>
+          <w:left w:val="single" w:color="8EA9DB" w:sz="12" w:space="6"/>
+        </w:pBdr>
+        <w:shd w:fill="F7F7F7" w:val="clear"/>
+        <w:spacing w:after="0" w:line="240"/>
+        <w:ind w:left="120" w:right="120"/>
+      </w:pPr>
+      <w:r>
+        <w:rPr>
+          <w:rFonts w:ascii="Consolas" w:cs="Consolas" w:eastAsia="Consolas" w:hAnsi="Consolas"/>
+          <w:sz w:val="15"/>
+          <w:szCs w:val="15"/>
+        </w:rPr>
+        <w:t xml:space="preserve">              else                  PrdTar.tar_qty * cast( 1000000 as abap.dec( 10, 0 ) )</w:t>
+      </w:r>
+    </w:p>
+    <w:p>
+      <w:pPr>
+        <w:pBdr>
+          <w:left w:val="single" w:color="8EA9DB" w:sz="12" w:space="6"/>
+        </w:pBdr>
+        <w:shd w:fill="F7F7F7" w:val="clear"/>
+        <w:spacing w:after="0" w:line="240"/>
+        <w:ind w:left="120" w:right="120"/>
+      </w:pPr>
+      <w:r>
+        <w:rPr>
+          <w:rFonts w:ascii="Consolas" w:cs="Consolas" w:eastAsia="Consolas" w:hAnsi="Consolas"/>
+          <w:sz w:val="15"/>
+          <w:szCs w:val="15"/>
+        </w:rPr>
+        <w:t xml:space="preserve">                                    * coalesce( cast( Cf.conv_factor as abap.dec( 15, 7 ) ),</w:t>
+      </w:r>
+    </w:p>
+    <w:p>
+      <w:pPr>
+        <w:pBdr>
+          <w:left w:val="single" w:color="8EA9DB" w:sz="12" w:space="6"/>
+        </w:pBdr>
+        <w:shd w:fill="F7F7F7" w:val="clear"/>
+        <w:spacing w:after="0" w:line="240"/>
+        <w:ind w:left="120" w:right="120"/>
+      </w:pPr>
+      <w:r>
+        <w:rPr>
+          <w:rFonts w:ascii="Consolas" w:cs="Consolas" w:eastAsia="Consolas" w:hAnsi="Consolas"/>
+          <w:sz w:val="15"/>
+          <w:szCs w:val="15"/>
+        </w:rPr>
+        <w:t xml:space="preserve">                                                cast( 0 as abap.dec( 15, 7 ) ) )</w:t>
+      </w:r>
+    </w:p>
+    <w:p>
+      <w:pPr>
+        <w:pBdr>
+          <w:left w:val="single" w:color="8EA9DB" w:sz="12" w:space="6"/>
+        </w:pBdr>
+        <w:shd w:fill="F7F7F7" w:val="clear"/>
+        <w:spacing w:after="0" w:line="240"/>
+        <w:ind w:left="120" w:right="120"/>
+      </w:pPr>
+      <w:r>
+        <w:rPr>
+          <w:rFonts w:ascii="Consolas" w:cs="Consolas" w:eastAsia="Consolas" w:hAnsi="Consolas"/>
+          <w:sz w:val="15"/>
+          <w:szCs w:val="15"/>
+        </w:rPr>
+        <w:t xml:space="preserve">            end as abap.dec( 23, 3 ) )    as TargetBoe,</w:t>
+      </w:r>
+    </w:p>
+    <w:p>
+      <w:pPr>
+        <w:pBdr>
+          <w:left w:val="single" w:color="8EA9DB" w:sz="12" w:space="6"/>
+        </w:pBdr>
+        <w:shd w:fill="F7F7F7" w:val="clear"/>
+        <w:spacing w:after="0" w:line="240"/>
+        <w:ind w:left="120" w:right="120"/>
+      </w:pPr>
+      <w:r>
+        <w:rPr>
+          <w:rFonts w:ascii="Consolas" w:cs="Consolas" w:eastAsia="Consolas" w:hAnsi="Consolas"/>
+          <w:sz w:val="15"/>
+          <w:szCs w:val="15"/>
+        </w:rPr>
+        <w:t xml:space="preserve"> </w:t>
+      </w:r>
+    </w:p>
+    <w:p>
+      <w:pPr>
+        <w:pBdr>
+          <w:left w:val="single" w:color="8EA9DB" w:sz="12" w:space="6"/>
+        </w:pBdr>
+        <w:shd w:fill="F7F7F7" w:val="clear"/>
+        <w:spacing w:after="0" w:line="240"/>
+        <w:ind w:left="120" w:right="120"/>
+      </w:pPr>
+      <w:r>
+        <w:rPr>
+          <w:rFonts w:ascii="Consolas" w:cs="Consolas" w:eastAsia="Consolas" w:hAnsi="Consolas"/>
+          <w:sz w:val="15"/>
+          <w:szCs w:val="15"/>
+        </w:rPr>
+        <w:t xml:space="preserve">      /* 1 April of the fiscal year */</w:t>
+      </w:r>
+    </w:p>
+    <w:p>
+      <w:pPr>
+        <w:pBdr>
+          <w:left w:val="single" w:color="8EA9DB" w:sz="12" w:space="6"/>
+        </w:pBdr>
+        <w:shd w:fill="F7F7F7" w:val="clear"/>
+        <w:spacing w:after="0" w:line="240"/>
+        <w:ind w:left="120" w:right="120"/>
+      </w:pPr>
+      <w:r>
+        <w:rPr>
+          <w:rFonts w:ascii="Consolas" w:cs="Consolas" w:eastAsia="Consolas" w:hAnsi="Consolas"/>
+          <w:sz w:val="15"/>
+          <w:szCs w:val="15"/>
+        </w:rPr>
+        <w:t xml:space="preserve">      cast( concat( cast( PrdTar.gjahr as abap.char( 4 ) ), '0401' )</w:t>
+      </w:r>
+    </w:p>
+    <w:p>
+      <w:pPr>
+        <w:pBdr>
+          <w:left w:val="single" w:color="8EA9DB" w:sz="12" w:space="6"/>
+        </w:pBdr>
+        <w:shd w:fill="F7F7F7" w:val="clear"/>
+        <w:spacing w:after="0" w:line="240"/>
+        <w:ind w:left="120" w:right="120"/>
+      </w:pPr>
+      <w:r>
+        <w:rPr>
+          <w:rFonts w:ascii="Consolas" w:cs="Consolas" w:eastAsia="Consolas" w:hAnsi="Consolas"/>
+          <w:sz w:val="15"/>
+          <w:szCs w:val="15"/>
+        </w:rPr>
+        <w:t xml:space="preserve">            as abap.dats )                as FiscalYearStart,</w:t>
+      </w:r>
+    </w:p>
+    <w:p>
+      <w:pPr>
+        <w:pBdr>
+          <w:left w:val="single" w:color="8EA9DB" w:sz="12" w:space="6"/>
+        </w:pBdr>
+        <w:shd w:fill="F7F7F7" w:val="clear"/>
+        <w:spacing w:after="0" w:line="240"/>
+        <w:ind w:left="120" w:right="120"/>
+      </w:pPr>
+      <w:r>
+        <w:rPr>
+          <w:rFonts w:ascii="Consolas" w:cs="Consolas" w:eastAsia="Consolas" w:hAnsi="Consolas"/>
+          <w:sz w:val="15"/>
+          <w:szCs w:val="15"/>
+        </w:rPr>
+        <w:t xml:space="preserve"> </w:t>
+      </w:r>
+    </w:p>
+    <w:p>
+      <w:pPr>
+        <w:pBdr>
+          <w:left w:val="single" w:color="8EA9DB" w:sz="12" w:space="6"/>
+        </w:pBdr>
+        <w:shd w:fill="F7F7F7" w:val="clear"/>
+        <w:spacing w:after="0" w:line="240"/>
+        <w:ind w:left="120" w:right="120"/>
+      </w:pPr>
+      <w:r>
+        <w:rPr>
+          <w:rFonts w:ascii="Consolas" w:cs="Consolas" w:eastAsia="Consolas" w:hAnsi="Consolas"/>
+          <w:sz w:val="15"/>
+          <w:szCs w:val="15"/>
+        </w:rPr>
+        <w:t xml:space="preserve">      /* days from 1 April gjahr to 1 April gjahr+1 = 365 / 366 */</w:t>
+      </w:r>
+    </w:p>
+    <w:p>
+      <w:pPr>
+        <w:pBdr>
+          <w:left w:val="single" w:color="8EA9DB" w:sz="12" w:space="6"/>
+        </w:pBdr>
+        <w:shd w:fill="F7F7F7" w:val="clear"/>
+        <w:spacing w:after="0" w:line="240"/>
+        <w:ind w:left="120" w:right="120"/>
+      </w:pPr>
+      <w:r>
+        <w:rPr>
+          <w:rFonts w:ascii="Consolas" w:cs="Consolas" w:eastAsia="Consolas" w:hAnsi="Consolas"/>
+          <w:sz w:val="15"/>
+          <w:szCs w:val="15"/>
+        </w:rPr>
+        <w:t xml:space="preserve">      cast( dats_days_between(</w:t>
+      </w:r>
+    </w:p>
+    <w:p>
+      <w:pPr>
+        <w:pBdr>
+          <w:left w:val="single" w:color="8EA9DB" w:sz="12" w:space="6"/>
+        </w:pBdr>
+        <w:shd w:fill="F7F7F7" w:val="clear"/>
+        <w:spacing w:after="0" w:line="240"/>
+        <w:ind w:left="120" w:right="120"/>
+      </w:pPr>
+      <w:r>
+        <w:rPr>
+          <w:rFonts w:ascii="Consolas" w:cs="Consolas" w:eastAsia="Consolas" w:hAnsi="Consolas"/>
+          <w:sz w:val="15"/>
+          <w:szCs w:val="15"/>
+        </w:rPr>
+        <w:t xml:space="preserve">              cast( concat( cast( PrdTar.gjahr as abap.char( 4 ) ), '0401' ) as abap.dats ),</w:t>
+      </w:r>
+    </w:p>
+    <w:p>
+      <w:pPr>
+        <w:pBdr>
+          <w:left w:val="single" w:color="8EA9DB" w:sz="12" w:space="6"/>
+        </w:pBdr>
+        <w:shd w:fill="F7F7F7" w:val="clear"/>
+        <w:spacing w:after="0" w:line="240"/>
+        <w:ind w:left="120" w:right="120"/>
+      </w:pPr>
+      <w:r>
+        <w:rPr>
+          <w:rFonts w:ascii="Consolas" w:cs="Consolas" w:eastAsia="Consolas" w:hAnsi="Consolas"/>
+          <w:sz w:val="15"/>
+          <w:szCs w:val="15"/>
+        </w:rPr>
+        <w:t xml:space="preserve">              dats_add_months(</w:t>
+      </w:r>
+    </w:p>
+    <w:p>
+      <w:pPr>
+        <w:pBdr>
+          <w:left w:val="single" w:color="8EA9DB" w:sz="12" w:space="6"/>
+        </w:pBdr>
+        <w:shd w:fill="F7F7F7" w:val="clear"/>
+        <w:spacing w:after="0" w:line="240"/>
+        <w:ind w:left="120" w:right="120"/>
+      </w:pPr>
+      <w:r>
+        <w:rPr>
+          <w:rFonts w:ascii="Consolas" w:cs="Consolas" w:eastAsia="Consolas" w:hAnsi="Consolas"/>
+          <w:sz w:val="15"/>
+          <w:szCs w:val="15"/>
+        </w:rPr>
+        <w:t xml:space="preserve">                cast( concat( cast( PrdTar.gjahr as abap.char( 4 ) ), '0401' ) as abap.dats ),</w:t>
+      </w:r>
+    </w:p>
+    <w:p>
+      <w:pPr>
+        <w:pBdr>
+          <w:left w:val="single" w:color="8EA9DB" w:sz="12" w:space="6"/>
+        </w:pBdr>
+        <w:shd w:fill="F7F7F7" w:val="clear"/>
+        <w:spacing w:after="0" w:line="240"/>
+        <w:ind w:left="120" w:right="120"/>
+      </w:pPr>
+      <w:r>
+        <w:rPr>
+          <w:rFonts w:ascii="Consolas" w:cs="Consolas" w:eastAsia="Consolas" w:hAnsi="Consolas"/>
+          <w:sz w:val="15"/>
+          <w:szCs w:val="15"/>
+        </w:rPr>
+        <w:t xml:space="preserve">                12, 'INITIAL' ) )</w:t>
+      </w:r>
+    </w:p>
+    <w:p>
+      <w:pPr>
+        <w:pBdr>
+          <w:left w:val="single" w:color="8EA9DB" w:sz="12" w:space="6"/>
+        </w:pBdr>
+        <w:shd w:fill="F7F7F7" w:val="clear"/>
+        <w:spacing w:after="0" w:line="240"/>
+        <w:ind w:left="120" w:right="120"/>
+      </w:pPr>
+      <w:r>
+        <w:rPr>
+          <w:rFonts w:ascii="Consolas" w:cs="Consolas" w:eastAsia="Consolas" w:hAnsi="Consolas"/>
+          <w:sz w:val="15"/>
+          <w:szCs w:val="15"/>
+        </w:rPr>
+        <w:t xml:space="preserve">            as abap.dec( 5, 0 ) )         as DaysInFiscalYear</w:t>
+      </w:r>
+    </w:p>
+    <w:p>
+      <w:pPr>
+        <w:pBdr>
+          <w:left w:val="single" w:color="8EA9DB" w:sz="12" w:space="6"/>
+        </w:pBdr>
+        <w:shd w:fill="F7F7F7" w:val="clear"/>
+        <w:spacing w:after="0" w:line="240"/>
+        <w:ind w:left="120" w:right="120"/>
+      </w:pPr>
+      <w:r>
+        <w:rPr>
+          <w:rFonts w:ascii="Consolas" w:cs="Consolas" w:eastAsia="Consolas" w:hAnsi="Consolas"/>
+          <w:sz w:val="15"/>
+          <w:szCs w:val="15"/>
+        </w:rPr>
+        <w:t xml:space="preserve">}</w:t>
+      </w:r>
+    </w:p>
+    <w:p>
+      <w:pPr>
+        <w:spacing w:after="120"/>
+      </w:pPr>
+    </w:p>
+    <w:p>
+      <w:r>
+        <w:br w:type="page"/>
+      </w:r>
+    </w:p>
+    <w:p>
+      <w:pPr>
+        <w:pStyle w:val="Heading2"/>
+        <w:spacing w:after="120" w:before="260"/>
+      </w:pPr>
+      <w:r>
+        <w:t xml:space="preserve">2.5  ZDPR_I_TARGET_FY</w:t>
+      </w:r>
+    </w:p>
+    <w:p>
+      <w:pPr>
+        <w:spacing w:after="120"/>
+      </w:pPr>
+      <w:r>
+        <w:rPr>
+          <w:b/>
+          <w:bCs/>
+          <w:i w:val="false"/>
+          <w:iCs w:val="false"/>
+          <w:sz w:val="21"/>
+          <w:szCs w:val="21"/>
+        </w:rPr>
+        <w:t xml:space="preserve">Type: CDS view entity</w:t>
+      </w:r>
+    </w:p>
+    <w:p>
+      <w:pPr>
+        <w:spacing w:after="120"/>
+      </w:pPr>
+      <w:r>
+        <w:rPr>
+          <w:b w:val="false"/>
+          <w:bCs w:val="false"/>
+          <w:i w:val="false"/>
+          <w:iCs w:val="false"/>
+          <w:sz w:val="21"/>
+          <w:szCs w:val="21"/>
+        </w:rPr>
+        <w:t xml:space="preserve">Annual target per fiscal year / asset / block / product (all months, volume types NET_PROD, GROSS_PROD, GAS_INJ).</w:t>
+      </w:r>
+    </w:p>
+    <w:p>
+      <w:pPr>
+        <w:spacing w:after="120"/>
+      </w:pPr>
+      <w:r>
+        <w:rPr>
+          <w:b w:val="false"/>
+          <w:bCs w:val="false"/>
+          <w:i/>
+          <w:iCs/>
+          <w:sz w:val="21"/>
+          <w:szCs w:val="21"/>
+        </w:rPr>
         <w:t xml:space="preserve">File: src/rap/ZDPR_I_TARGET_FY.ddls.asddls</w:t>
       </w:r>
     </w:p>
@@ -7814,7 +8488,7 @@
           <w:sz w:val="15"/>
           <w:szCs w:val="15"/>
         </w:rPr>
-        <w:t xml:space="preserve"> *   - volumes are the scaled figures of ZDPR_I_TARGET (barrels / MMSCM, BOE)</w:t>
+        <w:t xml:space="preserve"> *   - volumes are the scaled figures of ZDPR_P_TARGET_ROW (barrels / MMSCM, BOE)</w:t>
       </w:r>
     </w:p>
     <w:p>
@@ -7940,7 +8614,7 @@
           <w:sz w:val="15"/>
           <w:szCs w:val="15"/>
         </w:rPr>
-        <w:t xml:space="preserve">  as select from ZDPR_I_TARGET as Tar</w:t>
+        <w:t xml:space="preserve">  as select from ZDPR_P_TARGET_ROW as Tar</w:t>
       </w:r>
     </w:p>
     <w:p>

</xml_diff>

<commit_message>
Cast intermediate products in ZDPR_P_TARGET_ROW (CDS 37-digit precision limit)
Co-Authored-By: Claude Fable 5.1 <noreply@anthropic.com>
Claude-Session: https://claude.ai/code/session_01Xu9y1woHSkPxJdZRFiKhnN
</commit_message>
<xml_diff>
--- a/deploy/ZDPR_RAP_Complete_Source_Code.docx
+++ b/deploy/ZDPR_RAP_Complete_Source_Code.docx
@@ -7606,43 +7606,43 @@
           <w:sz w:val="15"/>
           <w:szCs w:val="15"/>
         </w:rPr>
-        <w:t xml:space="preserve">      cast( coalesce( cast( Cf.conv_factor as abap.dec( 15, 7 ) ),</w:t>
-      </w:r>
-    </w:p>
-    <w:p>
-      <w:pPr>
-        <w:pBdr>
-          <w:left w:val="single" w:color="8EA9DB" w:sz="12" w:space="6"/>
-        </w:pBdr>
-        <w:shd w:fill="F7F7F7" w:val="clear"/>
-        <w:spacing w:after="0" w:line="240"/>
-        <w:ind w:left="120" w:right="120"/>
-      </w:pPr>
-      <w:r>
-        <w:rPr>
-          <w:rFonts w:ascii="Consolas" w:cs="Consolas" w:eastAsia="Consolas" w:hAnsi="Consolas"/>
-          <w:sz w:val="15"/>
-          <w:szCs w:val="15"/>
-        </w:rPr>
-        <w:t xml:space="preserve">                      cast( 0 as abap.dec( 15, 7 ) ) )</w:t>
-      </w:r>
-    </w:p>
-    <w:p>
-      <w:pPr>
-        <w:pBdr>
-          <w:left w:val="single" w:color="8EA9DB" w:sz="12" w:space="6"/>
-        </w:pBdr>
-        <w:shd w:fill="F7F7F7" w:val="clear"/>
-        <w:spacing w:after="0" w:line="240"/>
-        <w:ind w:left="120" w:right="120"/>
-      </w:pPr>
-      <w:r>
-        <w:rPr>
-          <w:rFonts w:ascii="Consolas" w:cs="Consolas" w:eastAsia="Consolas" w:hAnsi="Consolas"/>
-          <w:sz w:val="15"/>
-          <w:szCs w:val="15"/>
-        </w:rPr>
-        <w:t xml:space="preserve">            as abap.dec( 15, 7 ) )        as ConversionFactor,</w:t>
+        <w:t xml:space="preserve">      cast( coalesce( cast( Cf.conv_factor as abap.dec( 11, 6 ) ),</w:t>
+      </w:r>
+    </w:p>
+    <w:p>
+      <w:pPr>
+        <w:pBdr>
+          <w:left w:val="single" w:color="8EA9DB" w:sz="12" w:space="6"/>
+        </w:pBdr>
+        <w:shd w:fill="F7F7F7" w:val="clear"/>
+        <w:spacing w:after="0" w:line="240"/>
+        <w:ind w:left="120" w:right="120"/>
+      </w:pPr>
+      <w:r>
+        <w:rPr>
+          <w:rFonts w:ascii="Consolas" w:cs="Consolas" w:eastAsia="Consolas" w:hAnsi="Consolas"/>
+          <w:sz w:val="15"/>
+          <w:szCs w:val="15"/>
+        </w:rPr>
+        <w:t xml:space="preserve">                      cast( 0 as abap.dec( 11, 6 ) ) )</w:t>
+      </w:r>
+    </w:p>
+    <w:p>
+      <w:pPr>
+        <w:pBdr>
+          <w:left w:val="single" w:color="8EA9DB" w:sz="12" w:space="6"/>
+        </w:pBdr>
+        <w:shd w:fill="F7F7F7" w:val="clear"/>
+        <w:spacing w:after="0" w:line="240"/>
+        <w:ind w:left="120" w:right="120"/>
+      </w:pPr>
+      <w:r>
+        <w:rPr>
+          <w:rFonts w:ascii="Consolas" w:cs="Consolas" w:eastAsia="Consolas" w:hAnsi="Consolas"/>
+          <w:sz w:val="15"/>
+          <w:szCs w:val="15"/>
+        </w:rPr>
+        <w:t xml:space="preserve">            as abap.dec( 11, 6 ) )        as ConversionFactor,</w:t>
       </w:r>
     </w:p>
     <w:p>
@@ -7678,7 +7678,43 @@
           <w:sz w:val="15"/>
           <w:szCs w:val="15"/>
         </w:rPr>
-        <w:t xml:space="preserve">      /* monthly target volume: barrels (oil family) / MMSCM (gas) */</w:t>
+        <w:t xml:space="preserve">      /* monthly target volume: barrels (oil family) / MMSCM (gas).</w:t>
+      </w:r>
+    </w:p>
+    <w:p>
+      <w:pPr>
+        <w:pBdr>
+          <w:left w:val="single" w:color="8EA9DB" w:sz="12" w:space="6"/>
+        </w:pBdr>
+        <w:shd w:fill="F7F7F7" w:val="clear"/>
+        <w:spacing w:after="0" w:line="240"/>
+        <w:ind w:left="120" w:right="120"/>
+      </w:pPr>
+      <w:r>
+        <w:rPr>
+          <w:rFonts w:ascii="Consolas" w:cs="Consolas" w:eastAsia="Consolas" w:hAnsi="Consolas"/>
+          <w:sz w:val="15"/>
+          <w:szCs w:val="15"/>
+        </w:rPr>
+        <w:t xml:space="preserve">         Every intermediate product is cast back to a small DEC: CDS</w:t>
+      </w:r>
+    </w:p>
+    <w:p>
+      <w:pPr>
+        <w:pBdr>
+          <w:left w:val="single" w:color="8EA9DB" w:sz="12" w:space="6"/>
+        </w:pBdr>
+        <w:shd w:fill="F7F7F7" w:val="clear"/>
+        <w:spacing w:after="0" w:line="240"/>
+        <w:ind w:left="120" w:right="120"/>
+      </w:pPr>
+      <w:r>
+        <w:rPr>
+          <w:rFonts w:ascii="Consolas" w:cs="Consolas" w:eastAsia="Consolas" w:hAnsi="Consolas"/>
+          <w:sz w:val="15"/>
+          <w:szCs w:val="15"/>
+        </w:rPr>
+        <w:t xml:space="preserve">         arithmetic may not exceed 37 digits (tar_qty x 1e6 x factor did). */</w:t>
       </w:r>
     </w:p>
     <w:p>
@@ -7714,61 +7750,133 @@
           <w:sz w:val="15"/>
           <w:szCs w:val="15"/>
         </w:rPr>
-        <w:t xml:space="preserve">              when '722000004' then PrdTar.tar_qty * cast( 1000 as abap.dec( 10, 0 ) )</w:t>
-      </w:r>
-    </w:p>
-    <w:p>
-      <w:pPr>
-        <w:pBdr>
-          <w:left w:val="single" w:color="8EA9DB" w:sz="12" w:space="6"/>
-        </w:pBdr>
-        <w:shd w:fill="F7F7F7" w:val="clear"/>
-        <w:spacing w:after="0" w:line="240"/>
-        <w:ind w:left="120" w:right="120"/>
-      </w:pPr>
-      <w:r>
-        <w:rPr>
-          <w:rFonts w:ascii="Consolas" w:cs="Consolas" w:eastAsia="Consolas" w:hAnsi="Consolas"/>
-          <w:sz w:val="15"/>
-          <w:szCs w:val="15"/>
-        </w:rPr>
-        <w:t xml:space="preserve">              else                  PrdTar.tar_qty * cast( 1000000 as abap.dec( 10, 0 ) )</w:t>
-      </w:r>
-    </w:p>
-    <w:p>
-      <w:pPr>
-        <w:pBdr>
-          <w:left w:val="single" w:color="8EA9DB" w:sz="12" w:space="6"/>
-        </w:pBdr>
-        <w:shd w:fill="F7F7F7" w:val="clear"/>
-        <w:spacing w:after="0" w:line="240"/>
-        <w:ind w:left="120" w:right="120"/>
-      </w:pPr>
-      <w:r>
-        <w:rPr>
-          <w:rFonts w:ascii="Consolas" w:cs="Consolas" w:eastAsia="Consolas" w:hAnsi="Consolas"/>
-          <w:sz w:val="15"/>
-          <w:szCs w:val="15"/>
-        </w:rPr>
-        <w:t xml:space="preserve">                                    * coalesce( cast( Cf.conv_factor as abap.dec( 15, 7 ) ),</w:t>
-      </w:r>
-    </w:p>
-    <w:p>
-      <w:pPr>
-        <w:pBdr>
-          <w:left w:val="single" w:color="8EA9DB" w:sz="12" w:space="6"/>
-        </w:pBdr>
-        <w:shd w:fill="F7F7F7" w:val="clear"/>
-        <w:spacing w:after="0" w:line="240"/>
-        <w:ind w:left="120" w:right="120"/>
-      </w:pPr>
-      <w:r>
-        <w:rPr>
-          <w:rFonts w:ascii="Consolas" w:cs="Consolas" w:eastAsia="Consolas" w:hAnsi="Consolas"/>
-          <w:sz w:val="15"/>
-          <w:szCs w:val="15"/>
-        </w:rPr>
-        <w:t xml:space="preserve">                                                cast( 0 as abap.dec( 15, 7 ) ) )</w:t>
+        <w:t xml:space="preserve">              when '722000004' then</w:t>
+      </w:r>
+    </w:p>
+    <w:p>
+      <w:pPr>
+        <w:pBdr>
+          <w:left w:val="single" w:color="8EA9DB" w:sz="12" w:space="6"/>
+        </w:pBdr>
+        <w:shd w:fill="F7F7F7" w:val="clear"/>
+        <w:spacing w:after="0" w:line="240"/>
+        <w:ind w:left="120" w:right="120"/>
+      </w:pPr>
+      <w:r>
+        <w:rPr>
+          <w:rFonts w:ascii="Consolas" w:cs="Consolas" w:eastAsia="Consolas" w:hAnsi="Consolas"/>
+          <w:sz w:val="15"/>
+          <w:szCs w:val="15"/>
+        </w:rPr>
+        <w:t xml:space="preserve">                cast( cast( PrdTar.tar_qty as abap.dec( 15, 5 ) )</w:t>
+      </w:r>
+    </w:p>
+    <w:p>
+      <w:pPr>
+        <w:pBdr>
+          <w:left w:val="single" w:color="8EA9DB" w:sz="12" w:space="6"/>
+        </w:pBdr>
+        <w:shd w:fill="F7F7F7" w:val="clear"/>
+        <w:spacing w:after="0" w:line="240"/>
+        <w:ind w:left="120" w:right="120"/>
+      </w:pPr>
+      <w:r>
+        <w:rPr>
+          <w:rFonts w:ascii="Consolas" w:cs="Consolas" w:eastAsia="Consolas" w:hAnsi="Consolas"/>
+          <w:sz w:val="15"/>
+          <w:szCs w:val="15"/>
+        </w:rPr>
+        <w:t xml:space="preserve">                      * cast( 1000 as abap.dec( 4, 0 ) ) as abap.dec( 20, 3 ) )</w:t>
+      </w:r>
+    </w:p>
+    <w:p>
+      <w:pPr>
+        <w:pBdr>
+          <w:left w:val="single" w:color="8EA9DB" w:sz="12" w:space="6"/>
+        </w:pBdr>
+        <w:shd w:fill="F7F7F7" w:val="clear"/>
+        <w:spacing w:after="0" w:line="240"/>
+        <w:ind w:left="120" w:right="120"/>
+      </w:pPr>
+      <w:r>
+        <w:rPr>
+          <w:rFonts w:ascii="Consolas" w:cs="Consolas" w:eastAsia="Consolas" w:hAnsi="Consolas"/>
+          <w:sz w:val="15"/>
+          <w:szCs w:val="15"/>
+        </w:rPr>
+        <w:t xml:space="preserve">              else</w:t>
+      </w:r>
+    </w:p>
+    <w:p>
+      <w:pPr>
+        <w:pBdr>
+          <w:left w:val="single" w:color="8EA9DB" w:sz="12" w:space="6"/>
+        </w:pBdr>
+        <w:shd w:fill="F7F7F7" w:val="clear"/>
+        <w:spacing w:after="0" w:line="240"/>
+        <w:ind w:left="120" w:right="120"/>
+      </w:pPr>
+      <w:r>
+        <w:rPr>
+          <w:rFonts w:ascii="Consolas" w:cs="Consolas" w:eastAsia="Consolas" w:hAnsi="Consolas"/>
+          <w:sz w:val="15"/>
+          <w:szCs w:val="15"/>
+        </w:rPr>
+        <w:t xml:space="preserve">                cast( cast( cast( PrdTar.tar_qty as abap.dec( 15, 5 ) )</w:t>
+      </w:r>
+    </w:p>
+    <w:p>
+      <w:pPr>
+        <w:pBdr>
+          <w:left w:val="single" w:color="8EA9DB" w:sz="12" w:space="6"/>
+        </w:pBdr>
+        <w:shd w:fill="F7F7F7" w:val="clear"/>
+        <w:spacing w:after="0" w:line="240"/>
+        <w:ind w:left="120" w:right="120"/>
+      </w:pPr>
+      <w:r>
+        <w:rPr>
+          <w:rFonts w:ascii="Consolas" w:cs="Consolas" w:eastAsia="Consolas" w:hAnsi="Consolas"/>
+          <w:sz w:val="15"/>
+          <w:szCs w:val="15"/>
+        </w:rPr>
+        <w:t xml:space="preserve">                            * cast( 1000000 as abap.dec( 7, 0 ) ) as abap.dec( 20, 3 ) )</w:t>
+      </w:r>
+    </w:p>
+    <w:p>
+      <w:pPr>
+        <w:pBdr>
+          <w:left w:val="single" w:color="8EA9DB" w:sz="12" w:space="6"/>
+        </w:pBdr>
+        <w:shd w:fill="F7F7F7" w:val="clear"/>
+        <w:spacing w:after="0" w:line="240"/>
+        <w:ind w:left="120" w:right="120"/>
+      </w:pPr>
+      <w:r>
+        <w:rPr>
+          <w:rFonts w:ascii="Consolas" w:cs="Consolas" w:eastAsia="Consolas" w:hAnsi="Consolas"/>
+          <w:sz w:val="15"/>
+          <w:szCs w:val="15"/>
+        </w:rPr>
+        <w:t xml:space="preserve">                      * coalesce( cast( Cf.conv_factor as abap.dec( 11, 6 ) ),</w:t>
+      </w:r>
+    </w:p>
+    <w:p>
+      <w:pPr>
+        <w:pBdr>
+          <w:left w:val="single" w:color="8EA9DB" w:sz="12" w:space="6"/>
+        </w:pBdr>
+        <w:shd w:fill="F7F7F7" w:val="clear"/>
+        <w:spacing w:after="0" w:line="240"/>
+        <w:ind w:left="120" w:right="120"/>
+      </w:pPr>
+      <w:r>
+        <w:rPr>
+          <w:rFonts w:ascii="Consolas" w:cs="Consolas" w:eastAsia="Consolas" w:hAnsi="Consolas"/>
+          <w:sz w:val="15"/>
+          <w:szCs w:val="15"/>
+        </w:rPr>
+        <w:t xml:space="preserve">                                  cast( 0 as abap.dec( 11, 6 ) ) ) as abap.dec( 23, 3 ) )</w:t>
       </w:r>
     </w:p>
     <w:p>
@@ -7858,79 +7966,151 @@
           <w:sz w:val="15"/>
           <w:szCs w:val="15"/>
         </w:rPr>
-        <w:t xml:space="preserve">              when '722000004' then PrdTar.tar_qty * cast( 1000 as abap.dec( 10, 0 ) )</w:t>
-      </w:r>
-    </w:p>
-    <w:p>
-      <w:pPr>
-        <w:pBdr>
-          <w:left w:val="single" w:color="8EA9DB" w:sz="12" w:space="6"/>
-        </w:pBdr>
-        <w:shd w:fill="F7F7F7" w:val="clear"/>
-        <w:spacing w:after="0" w:line="240"/>
-        <w:ind w:left="120" w:right="120"/>
-      </w:pPr>
-      <w:r>
-        <w:rPr>
-          <w:rFonts w:ascii="Consolas" w:cs="Consolas" w:eastAsia="Consolas" w:hAnsi="Consolas"/>
-          <w:sz w:val="15"/>
-          <w:szCs w:val="15"/>
-        </w:rPr>
-        <w:t xml:space="preserve">                                    * cast( 6290 as abap.dec( 5, 0 ) )</w:t>
-      </w:r>
-    </w:p>
-    <w:p>
-      <w:pPr>
-        <w:pBdr>
-          <w:left w:val="single" w:color="8EA9DB" w:sz="12" w:space="6"/>
-        </w:pBdr>
-        <w:shd w:fill="F7F7F7" w:val="clear"/>
-        <w:spacing w:after="0" w:line="240"/>
-        <w:ind w:left="120" w:right="120"/>
-      </w:pPr>
-      <w:r>
-        <w:rPr>
-          <w:rFonts w:ascii="Consolas" w:cs="Consolas" w:eastAsia="Consolas" w:hAnsi="Consolas"/>
-          <w:sz w:val="15"/>
-          <w:szCs w:val="15"/>
-        </w:rPr>
-        <w:t xml:space="preserve">              else                  PrdTar.tar_qty * cast( 1000000 as abap.dec( 10, 0 ) )</w:t>
-      </w:r>
-    </w:p>
-    <w:p>
-      <w:pPr>
-        <w:pBdr>
-          <w:left w:val="single" w:color="8EA9DB" w:sz="12" w:space="6"/>
-        </w:pBdr>
-        <w:shd w:fill="F7F7F7" w:val="clear"/>
-        <w:spacing w:after="0" w:line="240"/>
-        <w:ind w:left="120" w:right="120"/>
-      </w:pPr>
-      <w:r>
-        <w:rPr>
-          <w:rFonts w:ascii="Consolas" w:cs="Consolas" w:eastAsia="Consolas" w:hAnsi="Consolas"/>
-          <w:sz w:val="15"/>
-          <w:szCs w:val="15"/>
-        </w:rPr>
-        <w:t xml:space="preserve">                                    * coalesce( cast( Cf.conv_factor as abap.dec( 15, 7 ) ),</w:t>
-      </w:r>
-    </w:p>
-    <w:p>
-      <w:pPr>
-        <w:pBdr>
-          <w:left w:val="single" w:color="8EA9DB" w:sz="12" w:space="6"/>
-        </w:pBdr>
-        <w:shd w:fill="F7F7F7" w:val="clear"/>
-        <w:spacing w:after="0" w:line="240"/>
-        <w:ind w:left="120" w:right="120"/>
-      </w:pPr>
-      <w:r>
-        <w:rPr>
-          <w:rFonts w:ascii="Consolas" w:cs="Consolas" w:eastAsia="Consolas" w:hAnsi="Consolas"/>
-          <w:sz w:val="15"/>
-          <w:szCs w:val="15"/>
-        </w:rPr>
-        <w:t xml:space="preserve">                                                cast( 0 as abap.dec( 15, 7 ) ) )</w:t>
+        <w:t xml:space="preserve">              when '722000004' then</w:t>
+      </w:r>
+    </w:p>
+    <w:p>
+      <w:pPr>
+        <w:pBdr>
+          <w:left w:val="single" w:color="8EA9DB" w:sz="12" w:space="6"/>
+        </w:pBdr>
+        <w:shd w:fill="F7F7F7" w:val="clear"/>
+        <w:spacing w:after="0" w:line="240"/>
+        <w:ind w:left="120" w:right="120"/>
+      </w:pPr>
+      <w:r>
+        <w:rPr>
+          <w:rFonts w:ascii="Consolas" w:cs="Consolas" w:eastAsia="Consolas" w:hAnsi="Consolas"/>
+          <w:sz w:val="15"/>
+          <w:szCs w:val="15"/>
+        </w:rPr>
+        <w:t xml:space="preserve">                cast( cast( cast( PrdTar.tar_qty as abap.dec( 15, 5 ) )</w:t>
+      </w:r>
+    </w:p>
+    <w:p>
+      <w:pPr>
+        <w:pBdr>
+          <w:left w:val="single" w:color="8EA9DB" w:sz="12" w:space="6"/>
+        </w:pBdr>
+        <w:shd w:fill="F7F7F7" w:val="clear"/>
+        <w:spacing w:after="0" w:line="240"/>
+        <w:ind w:left="120" w:right="120"/>
+      </w:pPr>
+      <w:r>
+        <w:rPr>
+          <w:rFonts w:ascii="Consolas" w:cs="Consolas" w:eastAsia="Consolas" w:hAnsi="Consolas"/>
+          <w:sz w:val="15"/>
+          <w:szCs w:val="15"/>
+        </w:rPr>
+        <w:t xml:space="preserve">                            * cast( 1000 as abap.dec( 4, 0 ) ) as abap.dec( 20, 3 ) )</w:t>
+      </w:r>
+    </w:p>
+    <w:p>
+      <w:pPr>
+        <w:pBdr>
+          <w:left w:val="single" w:color="8EA9DB" w:sz="12" w:space="6"/>
+        </w:pBdr>
+        <w:shd w:fill="F7F7F7" w:val="clear"/>
+        <w:spacing w:after="0" w:line="240"/>
+        <w:ind w:left="120" w:right="120"/>
+      </w:pPr>
+      <w:r>
+        <w:rPr>
+          <w:rFonts w:ascii="Consolas" w:cs="Consolas" w:eastAsia="Consolas" w:hAnsi="Consolas"/>
+          <w:sz w:val="15"/>
+          <w:szCs w:val="15"/>
+        </w:rPr>
+        <w:t xml:space="preserve">                      * cast( 6290 as abap.dec( 4, 0 ) ) as abap.dec( 23, 3 ) )</w:t>
+      </w:r>
+    </w:p>
+    <w:p>
+      <w:pPr>
+        <w:pBdr>
+          <w:left w:val="single" w:color="8EA9DB" w:sz="12" w:space="6"/>
+        </w:pBdr>
+        <w:shd w:fill="F7F7F7" w:val="clear"/>
+        <w:spacing w:after="0" w:line="240"/>
+        <w:ind w:left="120" w:right="120"/>
+      </w:pPr>
+      <w:r>
+        <w:rPr>
+          <w:rFonts w:ascii="Consolas" w:cs="Consolas" w:eastAsia="Consolas" w:hAnsi="Consolas"/>
+          <w:sz w:val="15"/>
+          <w:szCs w:val="15"/>
+        </w:rPr>
+        <w:t xml:space="preserve">              else</w:t>
+      </w:r>
+    </w:p>
+    <w:p>
+      <w:pPr>
+        <w:pBdr>
+          <w:left w:val="single" w:color="8EA9DB" w:sz="12" w:space="6"/>
+        </w:pBdr>
+        <w:shd w:fill="F7F7F7" w:val="clear"/>
+        <w:spacing w:after="0" w:line="240"/>
+        <w:ind w:left="120" w:right="120"/>
+      </w:pPr>
+      <w:r>
+        <w:rPr>
+          <w:rFonts w:ascii="Consolas" w:cs="Consolas" w:eastAsia="Consolas" w:hAnsi="Consolas"/>
+          <w:sz w:val="15"/>
+          <w:szCs w:val="15"/>
+        </w:rPr>
+        <w:t xml:space="preserve">                cast( cast( cast( PrdTar.tar_qty as abap.dec( 15, 5 ) )</w:t>
+      </w:r>
+    </w:p>
+    <w:p>
+      <w:pPr>
+        <w:pBdr>
+          <w:left w:val="single" w:color="8EA9DB" w:sz="12" w:space="6"/>
+        </w:pBdr>
+        <w:shd w:fill="F7F7F7" w:val="clear"/>
+        <w:spacing w:after="0" w:line="240"/>
+        <w:ind w:left="120" w:right="120"/>
+      </w:pPr>
+      <w:r>
+        <w:rPr>
+          <w:rFonts w:ascii="Consolas" w:cs="Consolas" w:eastAsia="Consolas" w:hAnsi="Consolas"/>
+          <w:sz w:val="15"/>
+          <w:szCs w:val="15"/>
+        </w:rPr>
+        <w:t xml:space="preserve">                            * cast( 1000000 as abap.dec( 7, 0 ) ) as abap.dec( 20, 3 ) )</w:t>
+      </w:r>
+    </w:p>
+    <w:p>
+      <w:pPr>
+        <w:pBdr>
+          <w:left w:val="single" w:color="8EA9DB" w:sz="12" w:space="6"/>
+        </w:pBdr>
+        <w:shd w:fill="F7F7F7" w:val="clear"/>
+        <w:spacing w:after="0" w:line="240"/>
+        <w:ind w:left="120" w:right="120"/>
+      </w:pPr>
+      <w:r>
+        <w:rPr>
+          <w:rFonts w:ascii="Consolas" w:cs="Consolas" w:eastAsia="Consolas" w:hAnsi="Consolas"/>
+          <w:sz w:val="15"/>
+          <w:szCs w:val="15"/>
+        </w:rPr>
+        <w:t xml:space="preserve">                      * coalesce( cast( Cf.conv_factor as abap.dec( 11, 6 ) ),</w:t>
+      </w:r>
+    </w:p>
+    <w:p>
+      <w:pPr>
+        <w:pBdr>
+          <w:left w:val="single" w:color="8EA9DB" w:sz="12" w:space="6"/>
+        </w:pBdr>
+        <w:shd w:fill="F7F7F7" w:val="clear"/>
+        <w:spacing w:after="0" w:line="240"/>
+        <w:ind w:left="120" w:right="120"/>
+      </w:pPr>
+      <w:r>
+        <w:rPr>
+          <w:rFonts w:ascii="Consolas" w:cs="Consolas" w:eastAsia="Consolas" w:hAnsi="Consolas"/>
+          <w:sz w:val="15"/>
+          <w:szCs w:val="15"/>
+        </w:rPr>
+        <w:t xml:space="preserve">                                  cast( 0 as abap.dec( 11, 6 ) ) ) as abap.dec( 23, 3 ) )</w:t>
       </w:r>
     </w:p>
     <w:p>

</xml_diff>

<commit_message>
Unit reference for TargetQty in ZDPR_P_TARGET_ROW (QUAN field)
Co-Authored-By: Claude Fable 5.1 <noreply@anthropic.com>
Claude-Session: https://claude.ai/code/session_01Xu9y1woHSkPxJdZRFiKhnN
</commit_message>
<xml_diff>
--- a/deploy/ZDPR_RAP_Complete_Source_Code.docx
+++ b/deploy/ZDPR_RAP_Complete_Source_Code.docx
@@ -7444,6 +7444,42 @@
           <w:sz w:val="15"/>
           <w:szCs w:val="15"/>
         </w:rPr>
+        <w:t xml:space="preserve">      /* tar_qty is a QUAN field: the unit reference is mandatory */</w:t>
+      </w:r>
+    </w:p>
+    <w:p>
+      <w:pPr>
+        <w:pBdr>
+          <w:left w:val="single" w:color="8EA9DB" w:sz="12" w:space="6"/>
+        </w:pBdr>
+        <w:shd w:fill="F7F7F7" w:val="clear"/>
+        <w:spacing w:after="0" w:line="240"/>
+        <w:ind w:left="120" w:right="120"/>
+      </w:pPr>
+      <w:r>
+        <w:rPr>
+          <w:rFonts w:ascii="Consolas" w:cs="Consolas" w:eastAsia="Consolas" w:hAnsi="Consolas"/>
+          <w:sz w:val="15"/>
+          <w:szCs w:val="15"/>
+        </w:rPr>
+        <w:t xml:space="preserve">      @Semantics.quantity.unitOfMeasure: 'TargetUom'</w:t>
+      </w:r>
+    </w:p>
+    <w:p>
+      <w:pPr>
+        <w:pBdr>
+          <w:left w:val="single" w:color="8EA9DB" w:sz="12" w:space="6"/>
+        </w:pBdr>
+        <w:shd w:fill="F7F7F7" w:val="clear"/>
+        <w:spacing w:after="0" w:line="240"/>
+        <w:ind w:left="120" w:right="120"/>
+      </w:pPr>
+      <w:r>
+        <w:rPr>
+          <w:rFonts w:ascii="Consolas" w:cs="Consolas" w:eastAsia="Consolas" w:hAnsi="Consolas"/>
+          <w:sz w:val="15"/>
+          <w:szCs w:val="15"/>
+        </w:rPr>
         <w:t xml:space="preserve">      PrdTar.tar_qty                      as TargetQty,</w:t>
       </w:r>
     </w:p>

</xml_diff>

<commit_message>
ZDPR_P_TARGET_ROW: expose tar_qty as plain decimal (no quantity reference)
Co-Authored-By: Claude Fable 5.1 <noreply@anthropic.com>
Claude-Session: https://claude.ai/code/session_01Xu9y1woHSkPxJdZRFiKhnN
</commit_message>
<xml_diff>
--- a/deploy/ZDPR_RAP_Complete_Source_Code.docx
+++ b/deploy/ZDPR_RAP_Complete_Source_Code.docx
@@ -7444,43 +7444,61 @@
           <w:sz w:val="15"/>
           <w:szCs w:val="15"/>
         </w:rPr>
-        <w:t xml:space="preserve">      /* tar_qty is a QUAN field: the unit reference is mandatory */</w:t>
-      </w:r>
-    </w:p>
-    <w:p>
-      <w:pPr>
-        <w:pBdr>
-          <w:left w:val="single" w:color="8EA9DB" w:sz="12" w:space="6"/>
-        </w:pBdr>
-        <w:shd w:fill="F7F7F7" w:val="clear"/>
-        <w:spacing w:after="0" w:line="240"/>
-        <w:ind w:left="120" w:right="120"/>
-      </w:pPr>
-      <w:r>
-        <w:rPr>
-          <w:rFonts w:ascii="Consolas" w:cs="Consolas" w:eastAsia="Consolas" w:hAnsi="Consolas"/>
-          <w:sz w:val="15"/>
-          <w:szCs w:val="15"/>
-        </w:rPr>
-        <w:t xml:space="preserve">      @Semantics.quantity.unitOfMeasure: 'TargetUom'</w:t>
-      </w:r>
-    </w:p>
-    <w:p>
-      <w:pPr>
-        <w:pBdr>
-          <w:left w:val="single" w:color="8EA9DB" w:sz="12" w:space="6"/>
-        </w:pBdr>
-        <w:shd w:fill="F7F7F7" w:val="clear"/>
-        <w:spacing w:after="0" w:line="240"/>
-        <w:ind w:left="120" w:right="120"/>
-      </w:pPr>
-      <w:r>
-        <w:rPr>
-          <w:rFonts w:ascii="Consolas" w:cs="Consolas" w:eastAsia="Consolas" w:hAnsi="Consolas"/>
-          <w:sz w:val="15"/>
-          <w:szCs w:val="15"/>
-        </w:rPr>
-        <w:t xml:space="preserve">      PrdTar.tar_qty                      as TargetQty,</w:t>
+        <w:t xml:space="preserve">      /* tar_qty is a QUAN field; the cast makes it a plain decimal so no</w:t>
+      </w:r>
+    </w:p>
+    <w:p>
+      <w:pPr>
+        <w:pBdr>
+          <w:left w:val="single" w:color="8EA9DB" w:sz="12" w:space="6"/>
+        </w:pBdr>
+        <w:shd w:fill="F7F7F7" w:val="clear"/>
+        <w:spacing w:after="0" w:line="240"/>
+        <w:ind w:left="120" w:right="120"/>
+      </w:pPr>
+      <w:r>
+        <w:rPr>
+          <w:rFonts w:ascii="Consolas" w:cs="Consolas" w:eastAsia="Consolas" w:hAnsi="Consolas"/>
+          <w:sz w:val="15"/>
+          <w:szCs w:val="15"/>
+        </w:rPr>
+        <w:t xml:space="preserve">         unit reference is required (the raw quantity with its unit is</w:t>
+      </w:r>
+    </w:p>
+    <w:p>
+      <w:pPr>
+        <w:pBdr>
+          <w:left w:val="single" w:color="8EA9DB" w:sz="12" w:space="6"/>
+        </w:pBdr>
+        <w:shd w:fill="F7F7F7" w:val="clear"/>
+        <w:spacing w:after="0" w:line="240"/>
+        <w:ind w:left="120" w:right="120"/>
+      </w:pPr>
+      <w:r>
+        <w:rPr>
+          <w:rFonts w:ascii="Consolas" w:cs="Consolas" w:eastAsia="Consolas" w:hAnsi="Consolas"/>
+          <w:sz w:val="15"/>
+          <w:szCs w:val="15"/>
+        </w:rPr>
+        <w:t xml:space="preserve">         available in ZDPR_I_TARGET) */</w:t>
+      </w:r>
+    </w:p>
+    <w:p>
+      <w:pPr>
+        <w:pBdr>
+          <w:left w:val="single" w:color="8EA9DB" w:sz="12" w:space="6"/>
+        </w:pBdr>
+        <w:shd w:fill="F7F7F7" w:val="clear"/>
+        <w:spacing w:after="0" w:line="240"/>
+        <w:ind w:left="120" w:right="120"/>
+      </w:pPr>
+      <w:r>
+        <w:rPr>
+          <w:rFonts w:ascii="Consolas" w:cs="Consolas" w:eastAsia="Consolas" w:hAnsi="Consolas"/>
+          <w:sz w:val="15"/>
+          <w:szCs w:val="15"/>
+        </w:rPr>
+        <w:t xml:space="preserve">      cast( PrdTar.tar_qty as abap.dec( 15, 5 ) ) as TargetQty,</w:t>
       </w:r>
     </w:p>
     <w:p>

</xml_diff>